<commit_message>
Add analytics dashboard: throughput, unit ranking, finish forecast, issues trend
Compact grouped layout with per-chart selectors and one-line data insights;
Status Breakdown now counts In Progress; archived plan versions can't be set active.

Co-Authored-By: Claude Opus 5.5 <noreply@anthropic.com>
</commit_message>
<xml_diff>
--- a/app-v2/assets/help/PPMS_User_Manual.docx
+++ b/app-v2/assets/help/PPMS_User_Manual.docx
@@ -60,7 +60,7 @@
         </w:rPr>
         <w:t>Modules: KD1 · F200-KD2 · F100-KD2</w:t>
         <w:br/>
-        <w:t>Edition: 29 September 2026</w:t>
+        <w:t>Edition: 30 September 2026</w:t>
       </w:r>
     </w:p>
     <w:p>
@@ -2017,7 +2017,7 @@
     </w:tbl>
     <w:p>
       <w:r>
-        <w:t>Charts that summarise the filtered plan: status breakdown, cumulative planned vs actual completion, completion by vehicle type, process step completion and the station bottleneck chart (average delay per station).</w:t>
+        <w:t>Charts that summarise the filtered plan, in three rows. Progress over time: Cumulative Progress, Weekly Throughput (planned vs completed per week with the overdue backlog) and Status Breakdown. Units &amp; delivery: Unit Progress Ranking (% complete vs expected by today) and Planned vs Expected Finish per unit. Bottlenecks &amp; issues: Station Bottleneck and Issues Trend (opened vs resolved, time to resolve). Each chart shows a one-line insight worked out from the data. F100-KD2 shows its own completion charts.</w:t>
       </w:r>
     </w:p>
     <w:p>
@@ -2110,7 +2110,7 @@
         <w:t xml:space="preserve">2.  </w:t>
       </w:r>
       <w:r>
-        <w:t>Hover any chart for exact values.</w:t>
+        <w:t>Use the small buttons on each chart to change its range, grouping (unit, battalion, vehicle) or view — your choice is remembered.</w:t>
       </w:r>
     </w:p>
     <w:p>
@@ -2126,9 +2126,68 @@
         <w:t xml:space="preserve">3.  </w:t>
       </w:r>
       <w:r>
-        <w:t>Use the expand icon on a chart to view it larger.</w:t>
-      </w:r>
-    </w:p>
+        <w:t>Read the insight line under each chart title for the key takeaway; hover the chart for exact values.</w:t>
+      </w:r>
+    </w:p>
+    <w:p>
+      <w:pPr>
+        <w:spacing w:after="60"/>
+        <w:ind w:left="510" w:hanging="340"/>
+      </w:pPr>
+      <w:r>
+        <w:rPr>
+          <w:b/>
+          <w:color w:val="1E3A8A"/>
+        </w:rPr>
+        <w:t xml:space="preserve">4.  </w:t>
+      </w:r>
+      <w:r>
+        <w:t>Use the expand icon to open a chart full screen — the insight is shown in full there.</w:t>
+      </w:r>
+    </w:p>
+    <w:p/>
+    <w:tbl>
+      <w:tblPr>
+        <w:tblW w:type="auto" w:w="0"/>
+        <w:tblLook w:firstColumn="1" w:firstRow="1" w:lastColumn="0" w:lastRow="0" w:noHBand="0" w:noVBand="1" w:val="04A0"/>
+      </w:tblPr>
+      <w:tblGrid>
+        <w:gridCol w:w="9638"/>
+      </w:tblGrid>
+      <w:tr>
+        <w:tc>
+          <w:tcPr>
+            <w:tcW w:type="dxa" w:w="9638"/>
+            <w:shd w:val="clear" w:color="auto" w:fill="FEF3C7"/>
+          </w:tcPr>
+          <w:p>
+            <w:r>
+              <w:rPr>
+                <w:b/>
+                <w:sz w:val="20"/>
+              </w:rPr>
+              <w:t>Tips</w:t>
+            </w:r>
+          </w:p>
+          <w:p>
+            <w:r>
+              <w:rPr>
+                <w:sz w:val="20"/>
+              </w:rPr>
+              <w:t>•  All charts follow the filter bar except Issues Trend, which covers the whole module.</w:t>
+            </w:r>
+          </w:p>
+          <w:p>
+            <w:r>
+              <w:rPr>
+                <w:sz w:val="20"/>
+              </w:rPr>
+              <w:t>•  Expected finish = planned finish plus the worst delay in that unit, in working days (Fridays excluded) — the same rule as the Executive Summary delivery card.</w:t>
+            </w:r>
+          </w:p>
+        </w:tc>
+      </w:tr>
+    </w:tbl>
     <w:p/>
     <w:p>
       <w:r>

</xml_diff>

<commit_message>
Add Hide / Delete / Restore for processes in Reorder route
Per-plan-version visibility (migration 59): Hide keeps a process's blocks but
drops it from every view; Delete removes its blocks and the process from the
version; Restore brings it back. Catalog and other versions are untouched.

Co-Authored-By: Claude Opus 5.5 <noreply@anthropic.com>
</commit_message>
<xml_diff>
--- a/app-v2/assets/help/PPMS_User_Manual.docx
+++ b/app-v2/assets/help/PPMS_User_Manual.docx
@@ -2622,7 +2622,7 @@
         <w:t xml:space="preserve">5.  </w:t>
       </w:r>
       <w:r>
-        <w:t>Use Undo / Redo (arrows on the right) to reverse a change.</w:t>
+        <w:t>In Reorder route (Process view), each process has a ⋯ menu: Hide from plan keeps its blocks but removes it from the Gantt, VPX, Plan Table, summary and charts; Show in plan brings it back. Delete from plan permanently deletes its blocks in this plan version and removes the process from it; Restore to plan brings the empty process back.</w:t>
       </w:r>
     </w:p>
     <w:p>
@@ -2638,7 +2638,7 @@
         <w:t xml:space="preserve">6.  </w:t>
       </w:r>
       <w:r>
-        <w:t>The gear icon opens Options — Saturdays and No-work Days.</w:t>
+        <w:t>Use Undo / Redo (arrows on the right) to reverse a change.</w:t>
       </w:r>
     </w:p>
     <w:p>
@@ -2652,6 +2652,22 @@
           <w:color w:val="1E3A8A"/>
         </w:rPr>
         <w:t xml:space="preserve">7.  </w:t>
+      </w:r>
+      <w:r>
+        <w:t>The gear icon opens Options — Saturdays and No-work Days.</w:t>
+      </w:r>
+    </w:p>
+    <w:p>
+      <w:pPr>
+        <w:spacing w:after="60"/>
+        <w:ind w:left="510" w:hanging="340"/>
+      </w:pPr>
+      <w:r>
+        <w:rPr>
+          <w:b/>
+          <w:color w:val="1E3A8A"/>
+        </w:rPr>
+        <w:t xml:space="preserve">8.  </w:t>
       </w:r>
       <w:r>
         <w:t>Press Done to leave edit mode.</w:t>
@@ -2695,6 +2711,14 @@
                 <w:sz w:val="20"/>
               </w:rPr>
               <w:t>•  Moves skip no-work days.</w:t>
+            </w:r>
+          </w:p>
+          <w:p>
+            <w:r>
+              <w:rPr>
+                <w:sz w:val="20"/>
+              </w:rPr>
+              <w:t>•  Hidden and deleted processes appear greyed only in Reorder route mode. Hiding or deleting never changes the process catalog or other plan versions.</w:t>
             </w:r>
           </w:p>
         </w:tc>

</xml_diff>

<commit_message>
Update the user manual, screenshots and guided tour
- Manual: new "Language" topic; rewritten sign-in, top bar, Executive
  Summary, VPX, Gantt, editing the schedule (all move options), adding
  work (copy a planned unit), Executive Report, User Management, Audit
  Log, Active Users and Notifications.
- 12 new screenshots from the live system (emails, IP and sign-in
  fields masked); Word manual rebuilt (55 topics, 41 screenshots).
- Guided tour: Language and Active Users steps, hover card and status
  key in the Schedule step; Korean and Arabic for the new text.
- Fix: count on the selected User Management chip was invisible in the
  Light theme.

Co-Authored-By: Claude Opus 5.5 <noreply@anthropic.com>
Claude-Session: https://claude.ai/code/session_01QuuLAAnsP6QPEwG87nWTho
</commit_message>
<xml_diff>
--- a/app-v2/assets/help/PPMS_User_Manual.docx
+++ b/app-v2/assets/help/PPMS_User_Manual.docx
@@ -184,7 +184,7 @@
               <w:rPr>
                 <w:sz w:val="21"/>
               </w:rPr>
-              <w:t>03 October 2026</w:t>
+              <w:t>07 October 2026</w:t>
             </w:r>
           </w:p>
         </w:tc>
@@ -3688,7 +3688,7 @@
       <w:r>
         <w:drawing>
           <wp:inline xmlns:a="http://schemas.openxmlformats.org/drawingml/2006/main" xmlns:pic="http://schemas.openxmlformats.org/drawingml/2006/picture">
-            <wp:extent cx="5940000" cy="3131071"/>
+            <wp:extent cx="5940000" cy="2954847"/>
             <wp:docPr id="1" name="Picture 1"/>
             <wp:cNvGraphicFramePr>
               <a:graphicFrameLocks noChangeAspect="1"/>
@@ -3709,7 +3709,7 @@
                   <pic:spPr>
                     <a:xfrm>
                       <a:off x="0" y="0"/>
-                      <a:ext cx="5940000" cy="3131071"/>
+                      <a:ext cx="5940000" cy="2954847"/>
                     </a:xfrm>
                     <a:prstGeom prst="rect"/>
                   </pic:spPr>
@@ -3863,7 +3863,7 @@
               <w:rPr>
                 <w:sz w:val="20"/>
               </w:rPr>
-              <w:t>Enter your email and password, then press Sign In.</w:t>
+              <w:t>If you prefer Korean or Arabic, click the globe button (EN) at the top right and choose 한국어 or العربية — the sign-in page and PPMS switch language.</w:t>
             </w:r>
           </w:p>
         </w:tc>
@@ -3892,6 +3892,56 @@
                 <w:sz w:val="18"/>
               </w:rPr>
               <w:t>3</w:t>
+            </w:r>
+          </w:p>
+        </w:tc>
+        <w:tc>
+          <w:tcPr>
+            <w:tcW w:type="dxa" w:w="8844"/>
+            <w:tcMar>
+              <w:top w:w="40" w:type="dxa"/>
+              <w:bottom w:w="60" w:type="dxa"/>
+              <w:start w:w="120" w:type="dxa"/>
+              <w:end w:w="40" w:type="dxa"/>
+            </w:tcMar>
+          </w:tcPr>
+          <w:p>
+            <w:pPr>
+              <w:spacing w:after="0"/>
+            </w:pPr>
+            <w:r>
+              <w:rPr>
+                <w:sz w:val="20"/>
+              </w:rPr>
+              <w:t>Enter your email and password, then press Sign In.</w:t>
+            </w:r>
+          </w:p>
+        </w:tc>
+      </w:tr>
+      <w:tr>
+        <w:tc>
+          <w:tcPr>
+            <w:tcW w:type="dxa" w:w="454"/>
+            <w:vAlign w:val="top"/>
+            <w:tcMar>
+              <w:top w:w="30" w:type="dxa"/>
+              <w:bottom w:w="30" w:type="dxa"/>
+              <w:start w:w="40" w:type="dxa"/>
+              <w:end w:w="40" w:type="dxa"/>
+            </w:tcMar>
+            <w:shd w:val="clear" w:color="auto" w:fill="2563EB"/>
+          </w:tcPr>
+          <w:p>
+            <w:pPr>
+              <w:jc w:val="center"/>
+            </w:pPr>
+            <w:r>
+              <w:rPr>
+                <w:b/>
+                <w:color w:val="FFFFFF"/>
+                <w:sz w:val="18"/>
+              </w:rPr>
+              <w:t>4</w:t>
             </w:r>
           </w:p>
         </w:tc>
@@ -3992,7 +4042,19 @@
               <w:rPr>
                 <w:sz w:val="19"/>
               </w:rPr>
-              <w:t>•  You can pick a colour theme on the sign-in page with the theme button.</w:t>
+              <w:t>•  The sun / moon button next to the globe changes the colour theme.</w:t>
+            </w:r>
+          </w:p>
+          <w:p>
+            <w:pPr>
+              <w:spacing w:after="20"/>
+              <w:ind w:left="198" w:hanging="198"/>
+            </w:pPr>
+            <w:r>
+              <w:rPr>
+                <w:sz w:val="19"/>
+              </w:rPr>
+              <w:t>•  You stay signed in while the browser tab is open. Opening PPMS again while still signed in is recorded in the Audit Log as "Opened PPMS — still signed in".</w:t>
             </w:r>
           </w:p>
         </w:tc>
@@ -4088,7 +4150,7 @@
           <w:color w:val="64748B"/>
           <w:sz w:val="18"/>
         </w:rPr>
-        <w:t>Changing your password · User roles and what they can do</w:t>
+        <w:t>Changing your password · User roles and what they can do · Language — English, Korean, Arabic</w:t>
       </w:r>
     </w:p>
     <w:p>
@@ -4698,7 +4760,7 @@
           <w:i w:val="0"/>
           <w:sz w:val="22"/>
         </w:rPr>
-        <w:t>The top bar is always visible. It holds the section links, the module and plan version switch, the version number, notifications, theme, the menu and your account.</w:t>
+        <w:t>The top bar is always visible. It holds the section links, the module and plan version switch, the version number, notifications, language, theme, the menu and your account.</w:t>
       </w:r>
     </w:p>
     <w:p>
@@ -4709,7 +4771,7 @@
       <w:r>
         <w:drawing>
           <wp:inline xmlns:a="http://schemas.openxmlformats.org/drawingml/2006/main" xmlns:pic="http://schemas.openxmlformats.org/drawingml/2006/picture">
-            <wp:extent cx="5940000" cy="977362"/>
+            <wp:extent cx="5940000" cy="218599"/>
             <wp:docPr id="3" name="Picture 3"/>
             <wp:cNvGraphicFramePr>
               <a:graphicFrameLocks noChangeAspect="1"/>
@@ -4730,7 +4792,7 @@
                   <pic:spPr>
                     <a:xfrm>
                       <a:off x="0" y="0"/>
-                      <a:ext cx="5940000" cy="977362"/>
+                      <a:ext cx="5940000" cy="218599"/>
                     </a:xfrm>
                     <a:prstGeom prst="rect"/>
                   </pic:spPr>
@@ -4984,7 +5046,7 @@
               <w:rPr>
                 <w:sz w:val="20"/>
               </w:rPr>
-              <w:t>Version number (e.g. ✓ v138) — the PPMS version you are running. It blinks orange when a newer version is available.</w:t>
+              <w:t>Version number (e.g. ✓ v158) — the PPMS version you are running. It blinks orange when a newer version is available.</w:t>
             </w:r>
           </w:p>
         </w:tc>
@@ -5084,7 +5146,7 @@
               <w:rPr>
                 <w:sz w:val="20"/>
               </w:rPr>
-              <w:t>People icon (Master Admin) — who is online now.</w:t>
+              <w:t>People icon (Master Admin) — who is online now, live (see Active Users).</w:t>
             </w:r>
           </w:p>
         </w:tc>
@@ -5134,7 +5196,7 @@
               <w:rPr>
                 <w:sz w:val="20"/>
               </w:rPr>
-              <w:t>Sun / moon icon — choose a colour theme.</w:t>
+              <w:t>Globe (EN / 한 / ع) — the interface language: English, Korean or Arabic.</w:t>
             </w:r>
           </w:p>
         </w:tc>
@@ -5184,7 +5246,7 @@
               <w:rPr>
                 <w:sz w:val="20"/>
               </w:rPr>
-              <w:t>Menu (☰) — Help &amp; User Manual, Guided tour, and — depending on your role — Audit Log, Unit Codes, User Management, Manage Processes and Manage Plan Versions.</w:t>
+              <w:t>Sun / moon icon — choose a colour theme.</w:t>
             </w:r>
           </w:p>
         </w:tc>
@@ -5234,7 +5296,124 @@
               <w:rPr>
                 <w:sz w:val="20"/>
               </w:rPr>
+              <w:t>Menu (☰) — Help &amp; User Manual, Guided tour, and — depending on your role — Audit Log, Unit Codes, User Management, Manage Processes and Manage Plan Versions.</w:t>
+            </w:r>
+          </w:p>
+        </w:tc>
+      </w:tr>
+      <w:tr>
+        <w:tc>
+          <w:tcPr>
+            <w:tcW w:type="dxa" w:w="454"/>
+            <w:vAlign w:val="top"/>
+            <w:tcMar>
+              <w:top w:w="30" w:type="dxa"/>
+              <w:bottom w:w="30" w:type="dxa"/>
+              <w:start w:w="40" w:type="dxa"/>
+              <w:end w:w="40" w:type="dxa"/>
+            </w:tcMar>
+            <w:shd w:val="clear" w:color="auto" w:fill="2563EB"/>
+          </w:tcPr>
+          <w:p>
+            <w:pPr>
+              <w:jc w:val="center"/>
+            </w:pPr>
+            <w:r>
+              <w:rPr>
+                <w:b/>
+                <w:color w:val="FFFFFF"/>
+                <w:sz w:val="18"/>
+              </w:rPr>
+              <w:t>10</w:t>
+            </w:r>
+          </w:p>
+        </w:tc>
+        <w:tc>
+          <w:tcPr>
+            <w:tcW w:type="dxa" w:w="8844"/>
+            <w:tcMar>
+              <w:top w:w="40" w:type="dxa"/>
+              <w:bottom w:w="60" w:type="dxa"/>
+              <w:start w:w="120" w:type="dxa"/>
+              <w:end w:w="40" w:type="dxa"/>
+            </w:tcMar>
+          </w:tcPr>
+          <w:p>
+            <w:pPr>
+              <w:spacing w:after="0"/>
+            </w:pPr>
+            <w:r>
+              <w:rPr>
+                <w:sz w:val="20"/>
+              </w:rPr>
               <w:t>Your name — change your password or sign out. The green dot next to the clock shows the live connection.</w:t>
+            </w:r>
+          </w:p>
+        </w:tc>
+      </w:tr>
+    </w:tbl>
+    <w:p>
+      <w:pPr>
+        <w:spacing w:after="40"/>
+      </w:pPr>
+    </w:p>
+    <w:tbl>
+      <w:tblPr>
+        <w:tblW w:type="auto" w:w="0"/>
+        <w:tblLook w:firstColumn="1" w:firstRow="1" w:lastColumn="0" w:lastRow="0" w:noHBand="0" w:noVBand="1" w:val="04A0"/>
+        <w:tblBorders>
+          <w:top w:val="nil"/>
+          <w:left w:val="nil"/>
+          <w:bottom w:val="nil"/>
+          <w:right w:val="nil"/>
+          <w:insideH w:val="nil"/>
+          <w:insideV w:val="nil"/>
+        </w:tblBorders>
+      </w:tblPr>
+      <w:tblGrid>
+        <w:gridCol w:w="9638"/>
+      </w:tblGrid>
+      <w:tr>
+        <w:tc>
+          <w:tcPr>
+            <w:tcW w:type="dxa" w:w="9638"/>
+            <w:shd w:val="clear" w:color="auto" w:fill="FEF3C7"/>
+            <w:tcBorders>
+              <w:top w:val="nil"/>
+              <w:left w:val="single" w:sz="36" w:color="D97706"/>
+              <w:bottom w:val="nil"/>
+              <w:right w:val="nil"/>
+            </w:tcBorders>
+            <w:tcMar>
+              <w:top w:w="90" w:type="dxa"/>
+              <w:bottom w:w="90" w:type="dxa"/>
+              <w:start w:w="200" w:type="dxa"/>
+              <w:end w:w="160" w:type="dxa"/>
+            </w:tcMar>
+          </w:tcPr>
+          <w:p>
+            <w:pPr>
+              <w:spacing w:after="40"/>
+            </w:pPr>
+            <w:r>
+              <w:rPr>
+                <w:b/>
+                <w:color w:val="D97706"/>
+                <w:sz w:val="19"/>
+              </w:rPr>
+              <w:t>Tips</w:t>
+            </w:r>
+          </w:p>
+          <w:p>
+            <w:pPr>
+              <w:spacing w:after="20"/>
+              <w:ind w:left="198" w:hanging="198"/>
+            </w:pPr>
+            <w:r>
+              <w:rPr>
+                <w:sz w:val="19"/>
+              </w:rPr>
+              <w:t>•  Hover any button or icon for a short description — PPMS shows it in a small card.</w:t>
             </w:r>
           </w:p>
         </w:tc>
@@ -5263,7 +5442,7 @@
           <w:color w:val="64748B"/>
           <w:sz w:val="18"/>
         </w:rPr>
-        <w:t>Modules: KD1, F200-KD2 and F100-KD2 · Keeping PPMS up to date · Notifications · Colour themes</w:t>
+        <w:t>Modules: KD1, F200-KD2 and F100-KD2 · Keeping PPMS up to date · Notifications · Colour themes · Language — English, Korean, Arabic</w:t>
       </w:r>
     </w:p>
     <w:p>
@@ -8573,7 +8752,7 @@
       <w:r>
         <w:drawing>
           <wp:inline xmlns:a="http://schemas.openxmlformats.org/drawingml/2006/main" xmlns:pic="http://schemas.openxmlformats.org/drawingml/2006/picture">
-            <wp:extent cx="5940000" cy="1077686"/>
+            <wp:extent cx="5940000" cy="1075381"/>
             <wp:docPr id="6" name="Picture 6"/>
             <wp:cNvGraphicFramePr>
               <a:graphicFrameLocks noChangeAspect="1"/>
@@ -8594,7 +8773,7 @@
                   <pic:spPr>
                     <a:xfrm>
                       <a:off x="0" y="0"/>
-                      <a:ext cx="5940000" cy="1077686"/>
+                      <a:ext cx="5940000" cy="1075381"/>
                     </a:xfrm>
                     <a:prstGeom prst="rect"/>
                   </pic:spPr>
@@ -8698,7 +8877,7 @@
               <w:rPr>
                 <w:sz w:val="20"/>
               </w:rPr>
-              <w:t>The ring shows the % of planned tasks that are done, with "X of Y planned tasks are done" beside it.</w:t>
+              <w:t>KD2: use the battalion tabs at the top of the summary — All, or one battalion — to scope the ring, the tiles and the Delivery card. Your choice is remembered.</w:t>
             </w:r>
           </w:p>
         </w:tc>
@@ -8748,7 +8927,7 @@
               <w:rPr>
                 <w:sz w:val="20"/>
               </w:rPr>
-              <w:t>The coloured bar splits every task into On time, Late, In progress, Overdue and Not started, with the count of each.</w:t>
+              <w:t>The ring shows the % of planned tasks that are done, with "X of Y planned tasks are done" beside it.</w:t>
             </w:r>
           </w:p>
         </w:tc>
@@ -8798,7 +8977,7 @@
               <w:rPr>
                 <w:sz w:val="20"/>
               </w:rPr>
-              <w:t>The tiles show Total planned, Completed on time, In progress, Late completion and Overdue. Overdue turns red whenever something is past its planned end.</w:t>
+              <w:t>The coloured bar splits every task into On time, Late, In progress, Overdue and Not started, with the count of each.</w:t>
             </w:r>
           </w:p>
         </w:tc>
@@ -8827,6 +9006,56 @@
                 <w:sz w:val="18"/>
               </w:rPr>
               <w:t>4</w:t>
+            </w:r>
+          </w:p>
+        </w:tc>
+        <w:tc>
+          <w:tcPr>
+            <w:tcW w:type="dxa" w:w="8844"/>
+            <w:tcMar>
+              <w:top w:w="40" w:type="dxa"/>
+              <w:bottom w:w="60" w:type="dxa"/>
+              <w:start w:w="120" w:type="dxa"/>
+              <w:end w:w="40" w:type="dxa"/>
+            </w:tcMar>
+          </w:tcPr>
+          <w:p>
+            <w:pPr>
+              <w:spacing w:after="0"/>
+            </w:pPr>
+            <w:r>
+              <w:rPr>
+                <w:sz w:val="20"/>
+              </w:rPr>
+              <w:t>The tiles show Total planned, Completed on time, In progress, Late completion and Overdue. Overdue turns red whenever something is past its planned end.</w:t>
+            </w:r>
+          </w:p>
+        </w:tc>
+      </w:tr>
+      <w:tr>
+        <w:tc>
+          <w:tcPr>
+            <w:tcW w:type="dxa" w:w="454"/>
+            <w:vAlign w:val="top"/>
+            <w:tcMar>
+              <w:top w:w="30" w:type="dxa"/>
+              <w:bottom w:w="30" w:type="dxa"/>
+              <w:start w:w="40" w:type="dxa"/>
+              <w:end w:w="40" w:type="dxa"/>
+            </w:tcMar>
+            <w:shd w:val="clear" w:color="auto" w:fill="2563EB"/>
+          </w:tcPr>
+          <w:p>
+            <w:pPr>
+              <w:jc w:val="center"/>
+            </w:pPr>
+            <w:r>
+              <w:rPr>
+                <w:b/>
+                <w:color w:val="FFFFFF"/>
+                <w:sz w:val="18"/>
+              </w:rPr>
+              <w:t>5</w:t>
             </w:r>
           </w:p>
         </w:tc>
@@ -10259,7 +10488,7 @@
           <w:i w:val="0"/>
           <w:sz w:val="22"/>
         </w:rPr>
-        <w:t>A station-by-station matrix of every unit: planned against actual for each station, coloured by status.</w:t>
+        <w:t>A station-by-station matrix of every unit: planned against actual for each station, coloured by status. It shows one battalion at a time, because unit labels (M1, M2 …) repeat in every battalion.</w:t>
       </w:r>
     </w:p>
     <w:p>
@@ -10270,7 +10499,7 @@
       <w:r>
         <w:drawing>
           <wp:inline xmlns:a="http://schemas.openxmlformats.org/drawingml/2006/main" xmlns:pic="http://schemas.openxmlformats.org/drawingml/2006/picture">
-            <wp:extent cx="5940000" cy="3140935"/>
+            <wp:extent cx="5940000" cy="2805356"/>
             <wp:docPr id="8" name="Picture 8"/>
             <wp:cNvGraphicFramePr>
               <a:graphicFrameLocks noChangeAspect="1"/>
@@ -10291,7 +10520,7 @@
                   <pic:spPr>
                     <a:xfrm>
                       <a:off x="0" y="0"/>
-                      <a:ext cx="5940000" cy="3140935"/>
+                      <a:ext cx="5940000" cy="2805356"/>
                     </a:xfrm>
                     <a:prstGeom prst="rect"/>
                   </pic:spPr>
@@ -10395,7 +10624,7 @@
               <w:rPr>
                 <w:sz w:val="20"/>
               </w:rPr>
-              <w:t>Choose the vehicle type tab (K9, K10, K11) and the category tab (for example Hull, Turret, Assembly).</w:t>
+              <w:t>Choose the battalion with the battalion tabs.</w:t>
             </w:r>
           </w:p>
         </w:tc>
@@ -10445,7 +10674,7 @@
               <w:rPr>
                 <w:sz w:val="20"/>
               </w:rPr>
-              <w:t>Switch between Matrix and Station Report views. Station Report adds forecast dates and a Delay column for that component.</w:t>
+              <w:t>Choose the vehicle type tab (K9, K10, K11) and the category tab (for example Hull, Turret, Assembly).</w:t>
             </w:r>
           </w:p>
         </w:tc>
@@ -10495,7 +10724,7 @@
               <w:rPr>
                 <w:sz w:val="20"/>
               </w:rPr>
-              <w:t>Hover a cell to see planned and actual dates.</w:t>
+              <w:t>Switch between Matrix and Station Report views. Station Report adds forecast dates and a Delay column for that component.</w:t>
             </w:r>
           </w:p>
         </w:tc>
@@ -10545,7 +10774,7 @@
               <w:rPr>
                 <w:sz w:val="20"/>
               </w:rPr>
-              <w:t>Use Full Screen to see the whole matrix.</w:t>
+              <w:t>Hover a cell for a card with the unit, planned and actual dates and status.</w:t>
             </w:r>
           </w:p>
         </w:tc>
@@ -10574,6 +10803,56 @@
                 <w:sz w:val="18"/>
               </w:rPr>
               <w:t>5</w:t>
+            </w:r>
+          </w:p>
+        </w:tc>
+        <w:tc>
+          <w:tcPr>
+            <w:tcW w:type="dxa" w:w="8844"/>
+            <w:tcMar>
+              <w:top w:w="40" w:type="dxa"/>
+              <w:bottom w:w="60" w:type="dxa"/>
+              <w:start w:w="120" w:type="dxa"/>
+              <w:end w:w="40" w:type="dxa"/>
+            </w:tcMar>
+          </w:tcPr>
+          <w:p>
+            <w:pPr>
+              <w:spacing w:after="0"/>
+            </w:pPr>
+            <w:r>
+              <w:rPr>
+                <w:sz w:val="20"/>
+              </w:rPr>
+              <w:t>Use Full Screen to see the whole matrix.</w:t>
+            </w:r>
+          </w:p>
+        </w:tc>
+      </w:tr>
+      <w:tr>
+        <w:tc>
+          <w:tcPr>
+            <w:tcW w:type="dxa" w:w="454"/>
+            <w:vAlign w:val="top"/>
+            <w:tcMar>
+              <w:top w:w="30" w:type="dxa"/>
+              <w:bottom w:w="30" w:type="dxa"/>
+              <w:start w:w="40" w:type="dxa"/>
+              <w:end w:w="40" w:type="dxa"/>
+            </w:tcMar>
+            <w:shd w:val="clear" w:color="auto" w:fill="2563EB"/>
+          </w:tcPr>
+          <w:p>
+            <w:pPr>
+              <w:jc w:val="center"/>
+            </w:pPr>
+            <w:r>
+              <w:rPr>
+                <w:b/>
+                <w:color w:val="FFFFFF"/>
+                <w:sz w:val="18"/>
+              </w:rPr>
+              <w:t>6</w:t>
             </w:r>
           </w:p>
         </w:tc>
@@ -11366,7 +11645,7 @@
       <w:r>
         <w:drawing>
           <wp:inline xmlns:a="http://schemas.openxmlformats.org/drawingml/2006/main" xmlns:pic="http://schemas.openxmlformats.org/drawingml/2006/picture">
-            <wp:extent cx="5940000" cy="2767742"/>
+            <wp:extent cx="5940000" cy="2775421"/>
             <wp:docPr id="10" name="Picture 10"/>
             <wp:cNvGraphicFramePr>
               <a:graphicFrameLocks noChangeAspect="1"/>
@@ -11387,7 +11666,7 @@
                   <pic:spPr>
                     <a:xfrm>
                       <a:off x="0" y="0"/>
-                      <a:ext cx="5940000" cy="2767742"/>
+                      <a:ext cx="5940000" cy="2775421"/>
                     </a:xfrm>
                     <a:prstGeom prst="rect"/>
                   </pic:spPr>
@@ -11491,7 +11770,7 @@
               <w:rPr>
                 <w:sz w:val="20"/>
               </w:rPr>
-              <w:t>Choose the date window with From and To, then press Refresh.</w:t>
+              <w:t>KD2: choose the battalion with the battalion chips above the chart — PPMS loads only that battalion, so the page stays fast. "Load all battalions" shows every battalion.</w:t>
             </w:r>
           </w:p>
         </w:tc>
@@ -11541,7 +11820,7 @@
               <w:rPr>
                 <w:sz w:val="20"/>
               </w:rPr>
-              <w:t>Switch between Process view (one lane per station) and Unit view (one lane per unit) with the UNIT / PROCESS switch.</w:t>
+              <w:t>Choose the date window with From and To, then press Refresh.</w:t>
             </w:r>
           </w:p>
         </w:tc>
@@ -11591,7 +11870,7 @@
               <w:rPr>
                 <w:sz w:val="20"/>
               </w:rPr>
-              <w:t>Scroll sideways to move through time; the header shows weeks (FW) and days, Saturdays are shaded and TODAY is marked.</w:t>
+              <w:t>Switch between Process view (one lane per station) and Unit view (one lane per unit) with the UNIT / PROCESS switch.</w:t>
             </w:r>
           </w:p>
         </w:tc>
@@ -11641,7 +11920,7 @@
               <w:rPr>
                 <w:sz w:val="20"/>
               </w:rPr>
-              <w:t>Hover a bar for its planned and actual dates and status. Show Legend explains the colours.</w:t>
+              <w:t>Process view, K10 and K11: switch on "K10 + K11 together" to see both vehicles' blocks on the same station rows (K11 blocks have a white left edge).</w:t>
             </w:r>
           </w:p>
         </w:tc>
@@ -11691,7 +11970,207 @@
               <w:rPr>
                 <w:sz w:val="20"/>
               </w:rPr>
-              <w:t>Use Full Screen for a larger view and Export Schedule to download it.</w:t>
+              <w:t>Unit view: each vehicle row is split into labelled line bands — Hull / Turret / Assembly for K9, Structure / Assembly for K10 and K11 — so each line reads as one sequence.</w:t>
+            </w:r>
+          </w:p>
+        </w:tc>
+      </w:tr>
+      <w:tr>
+        <w:tc>
+          <w:tcPr>
+            <w:tcW w:type="dxa" w:w="454"/>
+            <w:vAlign w:val="top"/>
+            <w:tcMar>
+              <w:top w:w="30" w:type="dxa"/>
+              <w:bottom w:w="30" w:type="dxa"/>
+              <w:start w:w="40" w:type="dxa"/>
+              <w:end w:w="40" w:type="dxa"/>
+            </w:tcMar>
+            <w:shd w:val="clear" w:color="auto" w:fill="2563EB"/>
+          </w:tcPr>
+          <w:p>
+            <w:pPr>
+              <w:jc w:val="center"/>
+            </w:pPr>
+            <w:r>
+              <w:rPr>
+                <w:b/>
+                <w:color w:val="FFFFFF"/>
+                <w:sz w:val="18"/>
+              </w:rPr>
+              <w:t>6</w:t>
+            </w:r>
+          </w:p>
+        </w:tc>
+        <w:tc>
+          <w:tcPr>
+            <w:tcW w:type="dxa" w:w="8844"/>
+            <w:tcMar>
+              <w:top w:w="40" w:type="dxa"/>
+              <w:bottom w:w="60" w:type="dxa"/>
+              <w:start w:w="120" w:type="dxa"/>
+              <w:end w:w="40" w:type="dxa"/>
+            </w:tcMar>
+          </w:tcPr>
+          <w:p>
+            <w:pPr>
+              <w:spacing w:after="0"/>
+            </w:pPr>
+            <w:r>
+              <w:rPr>
+                <w:sz w:val="20"/>
+              </w:rPr>
+              <w:t>Scroll sideways to move through time; the header shows weeks (FW) and days, Saturdays are shaded and TODAY is marked.</w:t>
+            </w:r>
+          </w:p>
+        </w:tc>
+      </w:tr>
+      <w:tr>
+        <w:tc>
+          <w:tcPr>
+            <w:tcW w:type="dxa" w:w="454"/>
+            <w:vAlign w:val="top"/>
+            <w:tcMar>
+              <w:top w:w="30" w:type="dxa"/>
+              <w:bottom w:w="30" w:type="dxa"/>
+              <w:start w:w="40" w:type="dxa"/>
+              <w:end w:w="40" w:type="dxa"/>
+            </w:tcMar>
+            <w:shd w:val="clear" w:color="auto" w:fill="2563EB"/>
+          </w:tcPr>
+          <w:p>
+            <w:pPr>
+              <w:jc w:val="center"/>
+            </w:pPr>
+            <w:r>
+              <w:rPr>
+                <w:b/>
+                <w:color w:val="FFFFFF"/>
+                <w:sz w:val="18"/>
+              </w:rPr>
+              <w:t>7</w:t>
+            </w:r>
+          </w:p>
+        </w:tc>
+        <w:tc>
+          <w:tcPr>
+            <w:tcW w:type="dxa" w:w="8844"/>
+            <w:tcMar>
+              <w:top w:w="40" w:type="dxa"/>
+              <w:bottom w:w="60" w:type="dxa"/>
+              <w:start w:w="120" w:type="dxa"/>
+              <w:end w:w="40" w:type="dxa"/>
+            </w:tcMar>
+          </w:tcPr>
+          <w:p>
+            <w:pPr>
+              <w:spacing w:after="0"/>
+            </w:pPr>
+            <w:r>
+              <w:rPr>
+                <w:sz w:val="20"/>
+              </w:rPr>
+              <w:t>Read the status badge on each block with the key above the chart: ✓ Completed, purple = completed early, blue = completed late, ▶ In progress, ! Overdue (red), plain = Planned.</w:t>
+            </w:r>
+          </w:p>
+        </w:tc>
+      </w:tr>
+      <w:tr>
+        <w:tc>
+          <w:tcPr>
+            <w:tcW w:type="dxa" w:w="454"/>
+            <w:vAlign w:val="top"/>
+            <w:tcMar>
+              <w:top w:w="30" w:type="dxa"/>
+              <w:bottom w:w="30" w:type="dxa"/>
+              <w:start w:w="40" w:type="dxa"/>
+              <w:end w:w="40" w:type="dxa"/>
+            </w:tcMar>
+            <w:shd w:val="clear" w:color="auto" w:fill="2563EB"/>
+          </w:tcPr>
+          <w:p>
+            <w:pPr>
+              <w:jc w:val="center"/>
+            </w:pPr>
+            <w:r>
+              <w:rPr>
+                <w:b/>
+                <w:color w:val="FFFFFF"/>
+                <w:sz w:val="18"/>
+              </w:rPr>
+              <w:t>8</w:t>
+            </w:r>
+          </w:p>
+        </w:tc>
+        <w:tc>
+          <w:tcPr>
+            <w:tcW w:type="dxa" w:w="8844"/>
+            <w:tcMar>
+              <w:top w:w="40" w:type="dxa"/>
+              <w:bottom w:w="60" w:type="dxa"/>
+              <w:start w:w="120" w:type="dxa"/>
+              <w:end w:w="40" w:type="dxa"/>
+            </w:tcMar>
+          </w:tcPr>
+          <w:p>
+            <w:pPr>
+              <w:spacing w:after="0"/>
+            </w:pPr>
+            <w:r>
+              <w:rPr>
+                <w:sz w:val="20"/>
+              </w:rPr>
+              <w:t>Hover a block for its card: status, unit, planned and actual dates with working days, delay or expected finish, line and work center.</w:t>
+            </w:r>
+          </w:p>
+        </w:tc>
+      </w:tr>
+      <w:tr>
+        <w:tc>
+          <w:tcPr>
+            <w:tcW w:type="dxa" w:w="454"/>
+            <w:vAlign w:val="top"/>
+            <w:tcMar>
+              <w:top w:w="30" w:type="dxa"/>
+              <w:bottom w:w="30" w:type="dxa"/>
+              <w:start w:w="40" w:type="dxa"/>
+              <w:end w:w="40" w:type="dxa"/>
+            </w:tcMar>
+            <w:shd w:val="clear" w:color="auto" w:fill="2563EB"/>
+          </w:tcPr>
+          <w:p>
+            <w:pPr>
+              <w:jc w:val="center"/>
+            </w:pPr>
+            <w:r>
+              <w:rPr>
+                <w:b/>
+                <w:color w:val="FFFFFF"/>
+                <w:sz w:val="18"/>
+              </w:rPr>
+              <w:t>9</w:t>
+            </w:r>
+          </w:p>
+        </w:tc>
+        <w:tc>
+          <w:tcPr>
+            <w:tcW w:type="dxa" w:w="8844"/>
+            <w:tcMar>
+              <w:top w:w="40" w:type="dxa"/>
+              <w:bottom w:w="60" w:type="dxa"/>
+              <w:start w:w="120" w:type="dxa"/>
+              <w:end w:w="40" w:type="dxa"/>
+            </w:tcMar>
+          </w:tcPr>
+          <w:p>
+            <w:pPr>
+              <w:spacing w:after="0"/>
+            </w:pPr>
+            <w:r>
+              <w:rPr>
+                <w:sz w:val="20"/>
+              </w:rPr>
+              <w:t>Use Full Screen for a larger view and Export Schedule to download it (Excel).</w:t>
             </w:r>
           </w:p>
         </w:tc>
@@ -11759,6 +12238,18 @@
                 <w:sz w:val="19"/>
               </w:rPr>
               <w:t>•  Each process lane shows how many of its blocks are done, e.g. 13/18 (72%).</w:t>
+            </w:r>
+          </w:p>
+          <w:p>
+            <w:pPr>
+              <w:spacing w:after="20"/>
+              <w:ind w:left="198" w:hanging="198"/>
+            </w:pPr>
+            <w:r>
+              <w:rPr>
+                <w:sz w:val="19"/>
+              </w:rPr>
+              <w:t>•  The hover card's "Expected finish" uses the same process-order forecast as the Delivery card.</w:t>
             </w:r>
           </w:p>
         </w:tc>
@@ -11787,7 +12278,7 @@
           <w:color w:val="64748B"/>
           <w:sz w:val="18"/>
         </w:rPr>
-        <w:t>Editing the schedule · Filtering the page</w:t>
+        <w:t>Editing the schedule · Filtering the page · How the delivery forecast and delays are calculated</w:t>
       </w:r>
     </w:p>
     <w:p>
@@ -11906,7 +12397,7 @@
       <w:r>
         <w:drawing>
           <wp:inline xmlns:a="http://schemas.openxmlformats.org/drawingml/2006/main" xmlns:pic="http://schemas.openxmlformats.org/drawingml/2006/picture">
-            <wp:extent cx="5940000" cy="2171613"/>
+            <wp:extent cx="5940000" cy="2300734"/>
             <wp:docPr id="11" name="Picture 11"/>
             <wp:cNvGraphicFramePr>
               <a:graphicFrameLocks noChangeAspect="1"/>
@@ -11927,7 +12418,7 @@
                   <pic:spPr>
                     <a:xfrm>
                       <a:off x="0" y="0"/>
-                      <a:ext cx="5940000" cy="2171613"/>
+                      <a:ext cx="5940000" cy="2300734"/>
                     </a:xfrm>
                     <a:prstGeom prst="rect"/>
                   </pic:spPr>
@@ -12031,7 +12522,7 @@
               <w:rPr>
                 <w:sz w:val="20"/>
               </w:rPr>
-              <w:t>Press Edit Gantt. An Editing bar appears above the chart.</w:t>
+              <w:t>Press Edit Gantt. The Editing bar appears above the chart with three tasks: Reschedule, Add work and Reorder route.</w:t>
             </w:r>
           </w:p>
         </w:tc>
@@ -12081,7 +12572,7 @@
               <w:rPr>
                 <w:sz w:val="20"/>
               </w:rPr>
-              <w:t>Reschedule — drag a bar to move it, or drag its left or right edge to change only its start or end date.</w:t>
+              <w:t>Reschedule — drag a block to move it, or drag its left or right edge to change only its start or end date.</w:t>
             </w:r>
           </w:p>
         </w:tc>
@@ -12131,7 +12622,7 @@
               <w:rPr>
                 <w:sz w:val="20"/>
               </w:rPr>
-              <w:t>Choose what a drag moves: This block, Whole lane, This + everything after, or This + others at this station. Select lane picks a whole lane first.</w:t>
+              <w:t>Open "When you drag a block, move…" to choose what moves with it:</w:t>
             </w:r>
           </w:p>
         </w:tc>
@@ -12181,7 +12672,7 @@
               <w:rPr>
                 <w:sz w:val="20"/>
               </w:rPr>
-              <w:t>Hover a block to show its checkbox (select it for group actions) and its ⋯ menu (Move up / down, Edit, Delete).</w:t>
+              <w:t>• Block — Only this block (or every selected block).</w:t>
             </w:r>
           </w:p>
         </w:tc>
@@ -12231,7 +12722,7 @@
               <w:rPr>
                 <w:sz w:val="20"/>
               </w:rPr>
-              <w:t>Add work — place new plan blocks (see "Adding work to the plan"). Reorder route — change the station order or hide / delete processes.</w:t>
+              <w:t>• This vehicle — From this process on (the rest of its line, then Assembly), From this date on (every block starting on or after it, all lines), or All processes.</w:t>
             </w:r>
           </w:p>
         </w:tc>
@@ -12281,7 +12772,7 @@
               <w:rPr>
                 <w:sz w:val="20"/>
               </w:rPr>
-              <w:t>Use Undo / Redo (arrows on the right) to reverse a change.</w:t>
+              <w:t>• This component only — From this process on, or the Whole component (Hull, Turret or Assembly) — nothing else moves.</w:t>
             </w:r>
           </w:p>
         </w:tc>
@@ -12331,7 +12822,7 @@
               <w:rPr>
                 <w:sz w:val="20"/>
               </w:rPr>
-              <w:t>The gear icon opens Options — Saturdays and No-work Days.</w:t>
+              <w:t>• This + later vehicles — From this process on, or All processes — the same move for this vehicle and every later vehicle of the same battalion and type.</w:t>
             </w:r>
           </w:p>
         </w:tc>
@@ -12360,6 +12851,256 @@
                 <w:sz w:val="18"/>
               </w:rPr>
               <w:t>8</w:t>
+            </w:r>
+          </w:p>
+        </w:tc>
+        <w:tc>
+          <w:tcPr>
+            <w:tcW w:type="dxa" w:w="8844"/>
+            <w:tcMar>
+              <w:top w:w="40" w:type="dxa"/>
+              <w:bottom w:w="60" w:type="dxa"/>
+              <w:start w:w="120" w:type="dxa"/>
+              <w:end w:w="40" w:type="dxa"/>
+            </w:tcMar>
+          </w:tcPr>
+          <w:p>
+            <w:pPr>
+              <w:spacing w:after="0"/>
+            </w:pPr>
+            <w:r>
+              <w:rPr>
+                <w:sz w:val="20"/>
+              </w:rPr>
+              <w:t>• Station — This station's queue: this block and every block after it at the same station, across all vehicles.</w:t>
+            </w:r>
+          </w:p>
+        </w:tc>
+      </w:tr>
+      <w:tr>
+        <w:tc>
+          <w:tcPr>
+            <w:tcW w:type="dxa" w:w="454"/>
+            <w:vAlign w:val="top"/>
+            <w:tcMar>
+              <w:top w:w="30" w:type="dxa"/>
+              <w:bottom w:w="30" w:type="dxa"/>
+              <w:start w:w="40" w:type="dxa"/>
+              <w:end w:w="40" w:type="dxa"/>
+            </w:tcMar>
+            <w:shd w:val="clear" w:color="auto" w:fill="2563EB"/>
+          </w:tcPr>
+          <w:p>
+            <w:pPr>
+              <w:jc w:val="center"/>
+            </w:pPr>
+            <w:r>
+              <w:rPr>
+                <w:b/>
+                <w:color w:val="FFFFFF"/>
+                <w:sz w:val="18"/>
+              </w:rPr>
+              <w:t>9</w:t>
+            </w:r>
+          </w:p>
+        </w:tc>
+        <w:tc>
+          <w:tcPr>
+            <w:tcW w:type="dxa" w:w="8844"/>
+            <w:tcMar>
+              <w:top w:w="40" w:type="dxa"/>
+              <w:bottom w:w="60" w:type="dxa"/>
+              <w:start w:w="120" w:type="dxa"/>
+              <w:end w:w="40" w:type="dxa"/>
+            </w:tcMar>
+          </w:tcPr>
+          <w:p>
+            <w:pPr>
+              <w:spacing w:after="0"/>
+            </w:pPr>
+            <w:r>
+              <w:rPr>
+                <w:sz w:val="20"/>
+              </w:rPr>
+              <w:t>Hover a block to show its checkbox (select it for group actions) and its ⋯ menu (Move up / down, Edit, Delete). "Select lane" adds a button on each row to select all of its blocks.</w:t>
+            </w:r>
+          </w:p>
+        </w:tc>
+      </w:tr>
+      <w:tr>
+        <w:tc>
+          <w:tcPr>
+            <w:tcW w:type="dxa" w:w="454"/>
+            <w:vAlign w:val="top"/>
+            <w:tcMar>
+              <w:top w:w="30" w:type="dxa"/>
+              <w:bottom w:w="30" w:type="dxa"/>
+              <w:start w:w="40" w:type="dxa"/>
+              <w:end w:w="40" w:type="dxa"/>
+            </w:tcMar>
+            <w:shd w:val="clear" w:color="auto" w:fill="2563EB"/>
+          </w:tcPr>
+          <w:p>
+            <w:pPr>
+              <w:jc w:val="center"/>
+            </w:pPr>
+            <w:r>
+              <w:rPr>
+                <w:b/>
+                <w:color w:val="FFFFFF"/>
+                <w:sz w:val="18"/>
+              </w:rPr>
+              <w:t>10</w:t>
+            </w:r>
+          </w:p>
+        </w:tc>
+        <w:tc>
+          <w:tcPr>
+            <w:tcW w:type="dxa" w:w="8844"/>
+            <w:tcMar>
+              <w:top w:w="40" w:type="dxa"/>
+              <w:bottom w:w="60" w:type="dxa"/>
+              <w:start w:w="120" w:type="dxa"/>
+              <w:end w:w="40" w:type="dxa"/>
+            </w:tcMar>
+          </w:tcPr>
+          <w:p>
+            <w:pPr>
+              <w:spacing w:after="0"/>
+            </w:pPr>
+            <w:r>
+              <w:rPr>
+                <w:sz w:val="20"/>
+              </w:rPr>
+              <w:t>Add work — place new plan blocks (see "Adding work to the plan"). Reorder route — change the station order or hide / delete processes.</w:t>
+            </w:r>
+          </w:p>
+        </w:tc>
+      </w:tr>
+      <w:tr>
+        <w:tc>
+          <w:tcPr>
+            <w:tcW w:type="dxa" w:w="454"/>
+            <w:vAlign w:val="top"/>
+            <w:tcMar>
+              <w:top w:w="30" w:type="dxa"/>
+              <w:bottom w:w="30" w:type="dxa"/>
+              <w:start w:w="40" w:type="dxa"/>
+              <w:end w:w="40" w:type="dxa"/>
+            </w:tcMar>
+            <w:shd w:val="clear" w:color="auto" w:fill="2563EB"/>
+          </w:tcPr>
+          <w:p>
+            <w:pPr>
+              <w:jc w:val="center"/>
+            </w:pPr>
+            <w:r>
+              <w:rPr>
+                <w:b/>
+                <w:color w:val="FFFFFF"/>
+                <w:sz w:val="18"/>
+              </w:rPr>
+              <w:t>11</w:t>
+            </w:r>
+          </w:p>
+        </w:tc>
+        <w:tc>
+          <w:tcPr>
+            <w:tcW w:type="dxa" w:w="8844"/>
+            <w:tcMar>
+              <w:top w:w="40" w:type="dxa"/>
+              <w:bottom w:w="60" w:type="dxa"/>
+              <w:start w:w="120" w:type="dxa"/>
+              <w:end w:w="40" w:type="dxa"/>
+            </w:tcMar>
+          </w:tcPr>
+          <w:p>
+            <w:pPr>
+              <w:spacing w:after="0"/>
+            </w:pPr>
+            <w:r>
+              <w:rPr>
+                <w:sz w:val="20"/>
+              </w:rPr>
+              <w:t>Use Undo / Redo to reverse a change. The live edit feed shows what you and others changed.</w:t>
+            </w:r>
+          </w:p>
+        </w:tc>
+      </w:tr>
+      <w:tr>
+        <w:tc>
+          <w:tcPr>
+            <w:tcW w:type="dxa" w:w="454"/>
+            <w:vAlign w:val="top"/>
+            <w:tcMar>
+              <w:top w:w="30" w:type="dxa"/>
+              <w:bottom w:w="30" w:type="dxa"/>
+              <w:start w:w="40" w:type="dxa"/>
+              <w:end w:w="40" w:type="dxa"/>
+            </w:tcMar>
+            <w:shd w:val="clear" w:color="auto" w:fill="2563EB"/>
+          </w:tcPr>
+          <w:p>
+            <w:pPr>
+              <w:jc w:val="center"/>
+            </w:pPr>
+            <w:r>
+              <w:rPr>
+                <w:b/>
+                <w:color w:val="FFFFFF"/>
+                <w:sz w:val="18"/>
+              </w:rPr>
+              <w:t>12</w:t>
+            </w:r>
+          </w:p>
+        </w:tc>
+        <w:tc>
+          <w:tcPr>
+            <w:tcW w:type="dxa" w:w="8844"/>
+            <w:tcMar>
+              <w:top w:w="40" w:type="dxa"/>
+              <w:bottom w:w="60" w:type="dxa"/>
+              <w:start w:w="120" w:type="dxa"/>
+              <w:end w:w="40" w:type="dxa"/>
+            </w:tcMar>
+          </w:tcPr>
+          <w:p>
+            <w:pPr>
+              <w:spacing w:after="0"/>
+            </w:pPr>
+            <w:r>
+              <w:rPr>
+                <w:sz w:val="20"/>
+              </w:rPr>
+              <w:t>The gear icon opens Options — Include Saturdays and No-work Days.</w:t>
+            </w:r>
+          </w:p>
+        </w:tc>
+      </w:tr>
+      <w:tr>
+        <w:tc>
+          <w:tcPr>
+            <w:tcW w:type="dxa" w:w="454"/>
+            <w:vAlign w:val="top"/>
+            <w:tcMar>
+              <w:top w:w="30" w:type="dxa"/>
+              <w:bottom w:w="30" w:type="dxa"/>
+              <w:start w:w="40" w:type="dxa"/>
+              <w:end w:w="40" w:type="dxa"/>
+            </w:tcMar>
+            <w:shd w:val="clear" w:color="auto" w:fill="2563EB"/>
+          </w:tcPr>
+          <w:p>
+            <w:pPr>
+              <w:jc w:val="center"/>
+            </w:pPr>
+            <w:r>
+              <w:rPr>
+                <w:b/>
+                <w:color w:val="FFFFFF"/>
+                <w:sz w:val="18"/>
+              </w:rPr>
+              <w:t>13</w:t>
             </w:r>
           </w:p>
         </w:tc>
@@ -12539,7 +13280,19 @@
               <w:rPr>
                 <w:sz w:val="19"/>
               </w:rPr>
-              <w:t>•  Prefer "This + everything after" when a unit slips — it moves its remaining route together and keeps the sequence intact.</w:t>
+              <w:t>•  When a unit slips, use This vehicle → From this process on — it moves its remaining route together and keeps the sequence intact.</w:t>
+            </w:r>
+          </w:p>
+          <w:p>
+            <w:pPr>
+              <w:spacing w:after="20"/>
+              <w:ind w:left="198" w:hanging="198"/>
+            </w:pPr>
+            <w:r>
+              <w:rPr>
+                <w:sz w:val="19"/>
+              </w:rPr>
+              <w:t>•  Use This component only when just one line (for example Hull) is late and the other line is on time.</w:t>
             </w:r>
           </w:p>
         </w:tc>
@@ -19831,7 +20584,7 @@
           <w:i w:val="0"/>
           <w:sz w:val="22"/>
         </w:rPr>
-        <w:t>One print-friendly document combining a cover summary (progress and delivery forecast), the VPX Station Report and the all-time Production Issues Status Report, for management.</w:t>
+        <w:t>One print-friendly document for management: a cover summary (progress, status split and delivery forecast), the VPX Station Report, two pages of Production Insights and the all-time Production Issues Status Report.</w:t>
       </w:r>
     </w:p>
     <w:p>
@@ -19842,7 +20595,7 @@
       <w:r>
         <w:drawing>
           <wp:inline xmlns:a="http://schemas.openxmlformats.org/drawingml/2006/main" xmlns:pic="http://schemas.openxmlformats.org/drawingml/2006/picture">
-            <wp:extent cx="5940000" cy="2035133"/>
+            <wp:extent cx="4488872" cy="4530436"/>
             <wp:docPr id="25" name="Picture 25"/>
             <wp:cNvGraphicFramePr>
               <a:graphicFrameLocks noChangeAspect="1"/>
@@ -19863,7 +20616,7 @@
                   <pic:spPr>
                     <a:xfrm>
                       <a:off x="0" y="0"/>
-                      <a:ext cx="5940000" cy="2035133"/>
+                      <a:ext cx="4488872" cy="4530436"/>
                     </a:xfrm>
                     <a:prstGeom prst="rect"/>
                   </pic:spPr>
@@ -20017,7 +20770,107 @@
               <w:rPr>
                 <w:sz w:val="20"/>
               </w:rPr>
-              <w:t>Choose PDF, Excel or Word.</w:t>
+              <w:t>Under "What's inside", switch off any part you don't need: Cover summary, Station report, Production insights (two pages — where we stand, and where to act) and Production issues status report.</w:t>
+            </w:r>
+          </w:p>
+        </w:tc>
+      </w:tr>
+      <w:tr>
+        <w:tc>
+          <w:tcPr>
+            <w:tcW w:type="dxa" w:w="454"/>
+            <w:vAlign w:val="top"/>
+            <w:tcMar>
+              <w:top w:w="30" w:type="dxa"/>
+              <w:bottom w:w="30" w:type="dxa"/>
+              <w:start w:w="40" w:type="dxa"/>
+              <w:end w:w="40" w:type="dxa"/>
+            </w:tcMar>
+            <w:shd w:val="clear" w:color="auto" w:fill="2563EB"/>
+          </w:tcPr>
+          <w:p>
+            <w:pPr>
+              <w:jc w:val="center"/>
+            </w:pPr>
+            <w:r>
+              <w:rPr>
+                <w:b/>
+                <w:color w:val="FFFFFF"/>
+                <w:sz w:val="18"/>
+              </w:rPr>
+              <w:t>3</w:t>
+            </w:r>
+          </w:p>
+        </w:tc>
+        <w:tc>
+          <w:tcPr>
+            <w:tcW w:type="dxa" w:w="8844"/>
+            <w:tcMar>
+              <w:top w:w="40" w:type="dxa"/>
+              <w:bottom w:w="60" w:type="dxa"/>
+              <w:start w:w="120" w:type="dxa"/>
+              <w:end w:w="40" w:type="dxa"/>
+            </w:tcMar>
+          </w:tcPr>
+          <w:p>
+            <w:pPr>
+              <w:spacing w:after="0"/>
+            </w:pPr>
+            <w:r>
+              <w:rPr>
+                <w:sz w:val="20"/>
+              </w:rPr>
+              <w:t>Choose a format: PDF (best for printing and email), Word (editable) or Excel (one sheet per section).</w:t>
+            </w:r>
+          </w:p>
+        </w:tc>
+      </w:tr>
+      <w:tr>
+        <w:tc>
+          <w:tcPr>
+            <w:tcW w:type="dxa" w:w="454"/>
+            <w:vAlign w:val="top"/>
+            <w:tcMar>
+              <w:top w:w="30" w:type="dxa"/>
+              <w:bottom w:w="30" w:type="dxa"/>
+              <w:start w:w="40" w:type="dxa"/>
+              <w:end w:w="40" w:type="dxa"/>
+            </w:tcMar>
+            <w:shd w:val="clear" w:color="auto" w:fill="2563EB"/>
+          </w:tcPr>
+          <w:p>
+            <w:pPr>
+              <w:jc w:val="center"/>
+            </w:pPr>
+            <w:r>
+              <w:rPr>
+                <w:b/>
+                <w:color w:val="FFFFFF"/>
+                <w:sz w:val="18"/>
+              </w:rPr>
+              <w:t>4</w:t>
+            </w:r>
+          </w:p>
+        </w:tc>
+        <w:tc>
+          <w:tcPr>
+            <w:tcW w:type="dxa" w:w="8844"/>
+            <w:tcMar>
+              <w:top w:w="40" w:type="dxa"/>
+              <w:bottom w:w="60" w:type="dxa"/>
+              <w:start w:w="120" w:type="dxa"/>
+              <w:end w:w="40" w:type="dxa"/>
+            </w:tcMar>
+          </w:tcPr>
+          <w:p>
+            <w:pPr>
+              <w:spacing w:after="0"/>
+            </w:pPr>
+            <w:r>
+              <w:rPr>
+                <w:sz w:val="20"/>
+              </w:rPr>
+              <w:t>Check the preview, then download.</w:t>
             </w:r>
           </w:p>
         </w:tc>
@@ -20085,6 +20938,18 @@
                 <w:sz w:val="19"/>
               </w:rPr>
               <w:t>•  Each VPX table fits on one page; the colours are light so the report prints well.</w:t>
+            </w:r>
+          </w:p>
+          <w:p>
+            <w:pPr>
+              <w:spacing w:after="20"/>
+              <w:ind w:left="198" w:hanging="198"/>
+            </w:pPr>
+            <w:r>
+              <w:rPr>
+                <w:sz w:val="19"/>
+              </w:rPr>
+              <w:t>•  Production Insights use the same process-order forecast as the Delivery card and list the units furthest behind and the stations adding the most delay.</w:t>
             </w:r>
           </w:p>
         </w:tc>
@@ -20330,7 +21195,7 @@
           <w:i w:val="0"/>
           <w:sz w:val="22"/>
         </w:rPr>
-        <w:t>Add a station block for one unit to the live plan, either by clicking on the chart or with a form.</w:t>
+        <w:t>Add work to the live plan in three ways: click on the chart, fill in a form, or copy a planned unit's whole sequence to other units.</w:t>
       </w:r>
     </w:p>
     <w:p>
@@ -20341,7 +21206,7 @@
       <w:r>
         <w:drawing>
           <wp:inline xmlns:a="http://schemas.openxmlformats.org/drawingml/2006/main" xmlns:pic="http://schemas.openxmlformats.org/drawingml/2006/picture">
-            <wp:extent cx="4538749" cy="5170516"/>
+            <wp:extent cx="5940000" cy="4168821"/>
             <wp:docPr id="26" name="Picture 26"/>
             <wp:cNvGraphicFramePr>
               <a:graphicFrameLocks noChangeAspect="1"/>
@@ -20362,7 +21227,7 @@
                   <pic:spPr>
                     <a:xfrm>
                       <a:off x="0" y="0"/>
-                      <a:ext cx="4538749" cy="5170516"/>
+                      <a:ext cx="5940000" cy="4168821"/>
                     </a:xfrm>
                     <a:prstGeom prst="rect"/>
                   </pic:spPr>
@@ -20466,7 +21331,7 @@
               <w:rPr>
                 <w:sz w:val="20"/>
               </w:rPr>
-              <w:t>Press Edit Gantt, then choose Add work.</w:t>
+              <w:t>Press Edit Gantt, then choose Add work. Pick how: Click to place, Fill in a form, or Copy a planned unit.</w:t>
             </w:r>
           </w:p>
         </w:tc>
@@ -20516,7 +21381,7 @@
               <w:rPr>
                 <w:sz w:val="20"/>
               </w:rPr>
-              <w:t>Click to place — then click a lane and date on the chart to drop the block there.</w:t>
+              <w:t>Click to place — pick a unit or station, then click a lane and date on the chart to drop the block there.</w:t>
             </w:r>
           </w:p>
         </w:tc>
@@ -20616,7 +21481,7 @@
               <w:rPr>
                 <w:sz w:val="20"/>
               </w:rPr>
-              <w:t>The Template tab of the form edits the reusable route template instead of the live plan.</w:t>
+              <w:t>Copy a planned unit — choose a unit that is already planned as the template. Tick the units to plan (or "Tick all free units"), set the first unit's start and "Next unit every … working days" (or "Fill start dates"), check the preview, and press Add to the plan.</w:t>
             </w:r>
           </w:p>
         </w:tc>
@@ -20683,7 +21548,31 @@
               <w:rPr>
                 <w:sz w:val="19"/>
               </w:rPr>
-              <w:t>•  A placed block appears for other users within a second or two.</w:t>
+              <w:t>•  Copy a planned unit copies every process, its order, duration and start day exactly; only new blocks are added and the process order never changes.</w:t>
+            </w:r>
+          </w:p>
+          <w:p>
+            <w:pPr>
+              <w:spacing w:after="20"/>
+              <w:ind w:left="198" w:hanging="198"/>
+            </w:pPr>
+            <w:r>
+              <w:rPr>
+                <w:sz w:val="19"/>
+              </w:rPr>
+              <w:t>•  Units that someone else planned in the meantime are left out and listed.</w:t>
+            </w:r>
+          </w:p>
+          <w:p>
+            <w:pPr>
+              <w:spacing w:after="20"/>
+              <w:ind w:left="198" w:hanging="198"/>
+            </w:pPr>
+            <w:r>
+              <w:rPr>
+                <w:sz w:val="19"/>
+              </w:rPr>
+              <w:t>•  A placed block appears for other users within a second or two. Undo removes a whole copied set at once.</w:t>
             </w:r>
           </w:p>
         </w:tc>
@@ -23640,7 +24529,7 @@
           <w:i w:val="0"/>
           <w:sz w:val="22"/>
         </w:rPr>
-        <w:t>Create and manage accounts: role, allowed modules, export permission and active status.</w:t>
+        <w:t>Create and manage accounts: role, allowed modules, export permission and active status — with each person's last sign-in.</w:t>
       </w:r>
     </w:p>
     <w:p>
@@ -23651,7 +24540,7 @@
       <w:r>
         <w:drawing>
           <wp:inline xmlns:a="http://schemas.openxmlformats.org/drawingml/2006/main" xmlns:pic="http://schemas.openxmlformats.org/drawingml/2006/picture">
-            <wp:extent cx="5940000" cy="3635022"/>
+            <wp:extent cx="5940000" cy="4491220"/>
             <wp:docPr id="33" name="Picture 33"/>
             <wp:cNvGraphicFramePr>
               <a:graphicFrameLocks noChangeAspect="1"/>
@@ -23672,7 +24561,7 @@
                   <pic:spPr>
                     <a:xfrm>
                       <a:off x="0" y="0"/>
-                      <a:ext cx="5940000" cy="3635022"/>
+                      <a:ext cx="5940000" cy="4491220"/>
                     </a:xfrm>
                     <a:prstGeom prst="rect"/>
                   </pic:spPr>
@@ -23826,7 +24715,7 @@
               <w:rPr>
                 <w:sz w:val="20"/>
               </w:rPr>
-              <w:t>Add a user or edit an existing one: name, email, role, modules and "Can export".</w:t>
+              <w:t>Find people with the search box, or filter with the chips: a role (Master Admin, Planner, Operator, Viewer) or Active / Inactive. Each chip shows its count.</w:t>
             </w:r>
           </w:p>
         </w:tc>
@@ -23876,7 +24765,157 @@
               <w:rPr>
                 <w:sz w:val="20"/>
               </w:rPr>
-              <w:t>Deactivate an account to stop that person signing in.</w:t>
+              <w:t>Press Add User, or Edit on a row. The edit panel opens beside the list: name, email, role (with a short description of what it can do), module access, "Can export Excel &amp; PDF reports", account status and password.</w:t>
+            </w:r>
+          </w:p>
+        </w:tc>
+      </w:tr>
+      <w:tr>
+        <w:tc>
+          <w:tcPr>
+            <w:tcW w:type="dxa" w:w="454"/>
+            <w:vAlign w:val="top"/>
+            <w:tcMar>
+              <w:top w:w="30" w:type="dxa"/>
+              <w:bottom w:w="30" w:type="dxa"/>
+              <w:start w:w="40" w:type="dxa"/>
+              <w:end w:w="40" w:type="dxa"/>
+            </w:tcMar>
+            <w:shd w:val="clear" w:color="auto" w:fill="2563EB"/>
+          </w:tcPr>
+          <w:p>
+            <w:pPr>
+              <w:jc w:val="center"/>
+            </w:pPr>
+            <w:r>
+              <w:rPr>
+                <w:b/>
+                <w:color w:val="FFFFFF"/>
+                <w:sz w:val="18"/>
+              </w:rPr>
+              <w:t>4</w:t>
+            </w:r>
+          </w:p>
+        </w:tc>
+        <w:tc>
+          <w:tcPr>
+            <w:tcW w:type="dxa" w:w="8844"/>
+            <w:tcMar>
+              <w:top w:w="40" w:type="dxa"/>
+              <w:bottom w:w="60" w:type="dxa"/>
+              <w:start w:w="120" w:type="dxa"/>
+              <w:end w:w="40" w:type="dxa"/>
+            </w:tcMar>
+          </w:tcPr>
+          <w:p>
+            <w:pPr>
+              <w:spacing w:after="0"/>
+            </w:pPr>
+            <w:r>
+              <w:rPr>
+                <w:sz w:val="20"/>
+              </w:rPr>
+              <w:t>Press Save User. PPMS checks the email (valid and not already used), the password (at least 6 characters) and that at least one module is ticked.</w:t>
+            </w:r>
+          </w:p>
+        </w:tc>
+      </w:tr>
+      <w:tr>
+        <w:tc>
+          <w:tcPr>
+            <w:tcW w:type="dxa" w:w="454"/>
+            <w:vAlign w:val="top"/>
+            <w:tcMar>
+              <w:top w:w="30" w:type="dxa"/>
+              <w:bottom w:w="30" w:type="dxa"/>
+              <w:start w:w="40" w:type="dxa"/>
+              <w:end w:w="40" w:type="dxa"/>
+            </w:tcMar>
+            <w:shd w:val="clear" w:color="auto" w:fill="2563EB"/>
+          </w:tcPr>
+          <w:p>
+            <w:pPr>
+              <w:jc w:val="center"/>
+            </w:pPr>
+            <w:r>
+              <w:rPr>
+                <w:b/>
+                <w:color w:val="FFFFFF"/>
+                <w:sz w:val="18"/>
+              </w:rPr>
+              <w:t>5</w:t>
+            </w:r>
+          </w:p>
+        </w:tc>
+        <w:tc>
+          <w:tcPr>
+            <w:tcW w:type="dxa" w:w="8844"/>
+            <w:tcMar>
+              <w:top w:w="40" w:type="dxa"/>
+              <w:bottom w:w="60" w:type="dxa"/>
+              <w:start w:w="120" w:type="dxa"/>
+              <w:end w:w="40" w:type="dxa"/>
+            </w:tcMar>
+          </w:tcPr>
+          <w:p>
+            <w:pPr>
+              <w:spacing w:after="0"/>
+            </w:pPr>
+            <w:r>
+              <w:rPr>
+                <w:sz w:val="20"/>
+              </w:rPr>
+              <w:t>Click a user's status (Active / Inactive) to activate or deactivate the account.</w:t>
+            </w:r>
+          </w:p>
+        </w:tc>
+      </w:tr>
+      <w:tr>
+        <w:tc>
+          <w:tcPr>
+            <w:tcW w:type="dxa" w:w="454"/>
+            <w:vAlign w:val="top"/>
+            <w:tcMar>
+              <w:top w:w="30" w:type="dxa"/>
+              <w:bottom w:w="30" w:type="dxa"/>
+              <w:start w:w="40" w:type="dxa"/>
+              <w:end w:w="40" w:type="dxa"/>
+            </w:tcMar>
+            <w:shd w:val="clear" w:color="auto" w:fill="2563EB"/>
+          </w:tcPr>
+          <w:p>
+            <w:pPr>
+              <w:jc w:val="center"/>
+            </w:pPr>
+            <w:r>
+              <w:rPr>
+                <w:b/>
+                <w:color w:val="FFFFFF"/>
+                <w:sz w:val="18"/>
+              </w:rPr>
+              <w:t>6</w:t>
+            </w:r>
+          </w:p>
+        </w:tc>
+        <w:tc>
+          <w:tcPr>
+            <w:tcW w:type="dxa" w:w="8844"/>
+            <w:tcMar>
+              <w:top w:w="40" w:type="dxa"/>
+              <w:bottom w:w="60" w:type="dxa"/>
+              <w:start w:w="120" w:type="dxa"/>
+              <w:end w:w="40" w:type="dxa"/>
+            </w:tcMar>
+          </w:tcPr>
+          <w:p>
+            <w:pPr>
+              <w:spacing w:after="0"/>
+            </w:pPr>
+            <w:r>
+              <w:rPr>
+                <w:sz w:val="20"/>
+              </w:rPr>
+              <w:t>Press Activity to open the Audit Log filtered to that person.</w:t>
             </w:r>
           </w:p>
         </w:tc>
@@ -23946,6 +24985,18 @@
               <w:t>•  Changes take effect for that user immediately, even while they are signed in.</w:t>
             </w:r>
           </w:p>
+          <w:p>
+            <w:pPr>
+              <w:spacing w:after="20"/>
+              <w:ind w:left="198" w:hanging="198"/>
+            </w:pPr>
+            <w:r>
+              <w:rPr>
+                <w:sz w:val="19"/>
+              </w:rPr>
+              <w:t>•  You cannot change your own role or status, or delete yourself, and the last active Master Admin cannot be removed, demoted or deactivated — so nobody gets locked out.</w:t>
+            </w:r>
+          </w:p>
         </w:tc>
       </w:tr>
     </w:tbl>
@@ -24010,7 +25061,19 @@
               <w:rPr>
                 <w:sz w:val="19"/>
               </w:rPr>
-              <w:t>•  Give each person the lowest role that lets them do their job, and deactivate accounts of people who leave.</w:t>
+              <w:t>•  Give each person the lowest role that lets them do their job, and their own personal account — shared accounts hide who made a change.</w:t>
+            </w:r>
+          </w:p>
+          <w:p>
+            <w:pPr>
+              <w:spacing w:after="20"/>
+              <w:ind w:left="198" w:hanging="198"/>
+            </w:pPr>
+            <w:r>
+              <w:rPr>
+                <w:sz w:val="19"/>
+              </w:rPr>
+              <w:t>•  Deactivate rather than delete accounts of people who leave; their history stays readable.</w:t>
             </w:r>
           </w:p>
         </w:tc>
@@ -24039,7 +25102,7 @@
           <w:color w:val="64748B"/>
           <w:sz w:val="18"/>
         </w:rPr>
-        <w:t>User roles and what they can do · Audit Log</w:t>
+        <w:t>User roles and what they can do · Audit Log · Active Users</w:t>
       </w:r>
     </w:p>
     <w:p>
@@ -24147,7 +25210,7 @@
           <w:i w:val="0"/>
           <w:sz w:val="22"/>
         </w:rPr>
-        <w:t>A record of every change: who, when, what table, and the data before and after, including which plan version was edited.</w:t>
+        <w:t>A plain-language record of everything that happens in PPMS: who did what, to which unit, station, user or issue, and what changed — with a View button that opens the thing in the system.</w:t>
       </w:r>
     </w:p>
     <w:p>
@@ -24158,7 +25221,7 @@
       <w:r>
         <w:drawing>
           <wp:inline xmlns:a="http://schemas.openxmlformats.org/drawingml/2006/main" xmlns:pic="http://schemas.openxmlformats.org/drawingml/2006/picture">
-            <wp:extent cx="5940000" cy="4658824"/>
+            <wp:extent cx="5940000" cy="4060614"/>
             <wp:docPr id="34" name="Picture 34"/>
             <wp:cNvGraphicFramePr>
               <a:graphicFrameLocks noChangeAspect="1"/>
@@ -24179,7 +25242,7 @@
                   <pic:spPr>
                     <a:xfrm>
                       <a:off x="0" y="0"/>
-                      <a:ext cx="5940000" cy="4658824"/>
+                      <a:ext cx="5940000" cy="4060614"/>
                     </a:xfrm>
                     <a:prstGeom prst="rect"/>
                   </pic:spPr>
@@ -24283,7 +25346,7 @@
               <w:rPr>
                 <w:sz w:val="20"/>
               </w:rPr>
-              <w:t>Open the menu (☰) → Audit Log.</w:t>
+              <w:t>Open the menu (☰) → Audit Log. Entries are grouped by day, newest first.</w:t>
             </w:r>
           </w:p>
         </w:tc>
@@ -24333,7 +25396,286 @@
               <w:rPr>
                 <w:sz w:val="20"/>
               </w:rPr>
-              <w:t>Filter by user, action or date, and export to Excel or PDF if needed.</w:t>
+              <w:t>Each entry reads like a sentence — for example "Changed BTL-01 K9 M2 · Hull - Floor — Planned start 03 Oct → 05 Oct" — with the person, their role, the module and the plan version.</w:t>
+            </w:r>
+          </w:p>
+        </w:tc>
+      </w:tr>
+      <w:tr>
+        <w:tc>
+          <w:tcPr>
+            <w:tcW w:type="dxa" w:w="454"/>
+            <w:vAlign w:val="top"/>
+            <w:tcMar>
+              <w:top w:w="30" w:type="dxa"/>
+              <w:bottom w:w="30" w:type="dxa"/>
+              <w:start w:w="40" w:type="dxa"/>
+              <w:end w:w="40" w:type="dxa"/>
+            </w:tcMar>
+            <w:shd w:val="clear" w:color="auto" w:fill="2563EB"/>
+          </w:tcPr>
+          <w:p>
+            <w:pPr>
+              <w:jc w:val="center"/>
+            </w:pPr>
+            <w:r>
+              <w:rPr>
+                <w:b/>
+                <w:color w:val="FFFFFF"/>
+                <w:sz w:val="18"/>
+              </w:rPr>
+              <w:t>3</w:t>
+            </w:r>
+          </w:p>
+        </w:tc>
+        <w:tc>
+          <w:tcPr>
+            <w:tcW w:type="dxa" w:w="8844"/>
+            <w:tcMar>
+              <w:top w:w="40" w:type="dxa"/>
+              <w:bottom w:w="60" w:type="dxa"/>
+              <w:start w:w="120" w:type="dxa"/>
+              <w:end w:w="40" w:type="dxa"/>
+            </w:tcMar>
+          </w:tcPr>
+          <w:p>
+            <w:pPr>
+              <w:spacing w:after="0"/>
+            </w:pPr>
+            <w:r>
+              <w:rPr>
+                <w:sz w:val="20"/>
+              </w:rPr>
+              <w:t>Filter by What (plan blocks, actual dates, issues, users, sign-ins, reports &amp; exports …), Action, Module, User and When (today, last 7 / 30 days or custom dates). Use Search to find a unit, station, user or field on the loaded pages.</w:t>
+            </w:r>
+          </w:p>
+        </w:tc>
+      </w:tr>
+      <w:tr>
+        <w:tc>
+          <w:tcPr>
+            <w:tcW w:type="dxa" w:w="454"/>
+            <w:vAlign w:val="top"/>
+            <w:tcMar>
+              <w:top w:w="30" w:type="dxa"/>
+              <w:bottom w:w="30" w:type="dxa"/>
+              <w:start w:w="40" w:type="dxa"/>
+              <w:end w:w="40" w:type="dxa"/>
+            </w:tcMar>
+            <w:shd w:val="clear" w:color="auto" w:fill="2563EB"/>
+          </w:tcPr>
+          <w:p>
+            <w:pPr>
+              <w:jc w:val="center"/>
+            </w:pPr>
+            <w:r>
+              <w:rPr>
+                <w:b/>
+                <w:color w:val="FFFFFF"/>
+                <w:sz w:val="18"/>
+              </w:rPr>
+              <w:t>4</w:t>
+            </w:r>
+          </w:p>
+        </w:tc>
+        <w:tc>
+          <w:tcPr>
+            <w:tcW w:type="dxa" w:w="8844"/>
+            <w:tcMar>
+              <w:top w:w="40" w:type="dxa"/>
+              <w:bottom w:w="60" w:type="dxa"/>
+              <w:start w:w="120" w:type="dxa"/>
+              <w:end w:w="40" w:type="dxa"/>
+            </w:tcMar>
+          </w:tcPr>
+          <w:p>
+            <w:pPr>
+              <w:spacing w:after="0"/>
+            </w:pPr>
+            <w:r>
+              <w:rPr>
+                <w:sz w:val="20"/>
+              </w:rPr>
+              <w:t>Press View to go to the record: a plan block flashes on the Gantt, an issue opens, a user opens in User Management, a process opens in Manage Processes. PPMS switches module first if needed.</w:t>
+            </w:r>
+          </w:p>
+        </w:tc>
+      </w:tr>
+      <w:tr>
+        <w:tc>
+          <w:tcPr>
+            <w:tcW w:type="dxa" w:w="454"/>
+            <w:vAlign w:val="top"/>
+            <w:tcMar>
+              <w:top w:w="30" w:type="dxa"/>
+              <w:bottom w:w="30" w:type="dxa"/>
+              <w:start w:w="40" w:type="dxa"/>
+              <w:end w:w="40" w:type="dxa"/>
+            </w:tcMar>
+            <w:shd w:val="clear" w:color="auto" w:fill="2563EB"/>
+          </w:tcPr>
+          <w:p>
+            <w:pPr>
+              <w:jc w:val="center"/>
+            </w:pPr>
+            <w:r>
+              <w:rPr>
+                <w:b/>
+                <w:color w:val="FFFFFF"/>
+                <w:sz w:val="18"/>
+              </w:rPr>
+              <w:t>5</w:t>
+            </w:r>
+          </w:p>
+        </w:tc>
+        <w:tc>
+          <w:tcPr>
+            <w:tcW w:type="dxa" w:w="8844"/>
+            <w:tcMar>
+              <w:top w:w="40" w:type="dxa"/>
+              <w:bottom w:w="60" w:type="dxa"/>
+              <w:start w:w="120" w:type="dxa"/>
+              <w:end w:w="40" w:type="dxa"/>
+            </w:tcMar>
+          </w:tcPr>
+          <w:p>
+            <w:pPr>
+              <w:spacing w:after="0"/>
+            </w:pPr>
+            <w:r>
+              <w:rPr>
+                <w:sz w:val="20"/>
+              </w:rPr>
+              <w:t>Press Details for the full before / after table and the technical record (table, record id, IP address).</w:t>
+            </w:r>
+          </w:p>
+        </w:tc>
+      </w:tr>
+      <w:tr>
+        <w:tc>
+          <w:tcPr>
+            <w:tcW w:type="dxa" w:w="454"/>
+            <w:vAlign w:val="top"/>
+            <w:tcMar>
+              <w:top w:w="30" w:type="dxa"/>
+              <w:bottom w:w="30" w:type="dxa"/>
+              <w:start w:w="40" w:type="dxa"/>
+              <w:end w:w="40" w:type="dxa"/>
+            </w:tcMar>
+            <w:shd w:val="clear" w:color="auto" w:fill="2563EB"/>
+          </w:tcPr>
+          <w:p>
+            <w:pPr>
+              <w:jc w:val="center"/>
+            </w:pPr>
+            <w:r>
+              <w:rPr>
+                <w:b/>
+                <w:color w:val="FFFFFF"/>
+                <w:sz w:val="18"/>
+              </w:rPr>
+              <w:t>6</w:t>
+            </w:r>
+          </w:p>
+        </w:tc>
+        <w:tc>
+          <w:tcPr>
+            <w:tcW w:type="dxa" w:w="8844"/>
+            <w:tcMar>
+              <w:top w:w="40" w:type="dxa"/>
+              <w:bottom w:w="60" w:type="dxa"/>
+              <w:start w:w="120" w:type="dxa"/>
+              <w:end w:w="40" w:type="dxa"/>
+            </w:tcMar>
+          </w:tcPr>
+          <w:p>
+            <w:pPr>
+              <w:spacing w:after="0"/>
+            </w:pPr>
+            <w:r>
+              <w:rPr>
+                <w:sz w:val="20"/>
+              </w:rPr>
+              <w:t>Export to Excel or PDF — the export contains the same readable "What happened" and "Changes".</w:t>
+            </w:r>
+          </w:p>
+        </w:tc>
+      </w:tr>
+    </w:tbl>
+    <w:p>
+      <w:pPr>
+        <w:spacing w:after="40"/>
+      </w:pPr>
+    </w:p>
+    <w:tbl>
+      <w:tblPr>
+        <w:tblW w:type="auto" w:w="0"/>
+        <w:tblLook w:firstColumn="1" w:firstRow="1" w:lastColumn="0" w:lastRow="0" w:noHBand="0" w:noVBand="1" w:val="04A0"/>
+        <w:tblBorders>
+          <w:top w:val="nil"/>
+          <w:left w:val="nil"/>
+          <w:bottom w:val="nil"/>
+          <w:right w:val="nil"/>
+          <w:insideH w:val="nil"/>
+          <w:insideV w:val="nil"/>
+        </w:tblBorders>
+      </w:tblPr>
+      <w:tblGrid>
+        <w:gridCol w:w="9638"/>
+      </w:tblGrid>
+      <w:tr>
+        <w:tc>
+          <w:tcPr>
+            <w:tcW w:type="dxa" w:w="9638"/>
+            <w:shd w:val="clear" w:color="auto" w:fill="FEF3C7"/>
+            <w:tcBorders>
+              <w:top w:val="nil"/>
+              <w:left w:val="single" w:sz="36" w:color="D97706"/>
+              <w:bottom w:val="nil"/>
+              <w:right w:val="nil"/>
+            </w:tcBorders>
+            <w:tcMar>
+              <w:top w:w="90" w:type="dxa"/>
+              <w:bottom w:w="90" w:type="dxa"/>
+              <w:start w:w="200" w:type="dxa"/>
+              <w:end w:w="160" w:type="dxa"/>
+            </w:tcMar>
+          </w:tcPr>
+          <w:p>
+            <w:pPr>
+              <w:spacing w:after="40"/>
+            </w:pPr>
+            <w:r>
+              <w:rPr>
+                <w:b/>
+                <w:color w:val="D97706"/>
+                <w:sz w:val="19"/>
+              </w:rPr>
+              <w:t>Tips</w:t>
+            </w:r>
+          </w:p>
+          <w:p>
+            <w:pPr>
+              <w:spacing w:after="20"/>
+              <w:ind w:left="198" w:hanging="198"/>
+            </w:pPr>
+            <w:r>
+              <w:rPr>
+                <w:sz w:val="19"/>
+              </w:rPr>
+              <w:t>•  Sign-ins are recorded, and so is opening PPMS again while still signed in, or coming back after 20 minutes or more away.</w:t>
+            </w:r>
+          </w:p>
+          <w:p>
+            <w:pPr>
+              <w:spacing w:after="20"/>
+              <w:ind w:left="198" w:hanging="198"/>
+            </w:pPr>
+            <w:r>
+              <w:rPr>
+                <w:sz w:val="19"/>
+              </w:rPr>
+              <w:t>•  Every report or file downloaded from PPMS (PDF, Excel, Word) is recorded as an export.</w:t>
             </w:r>
           </w:p>
         </w:tc>
@@ -24362,7 +25704,7 @@
           <w:color w:val="64748B"/>
           <w:sz w:val="18"/>
         </w:rPr>
-        <w:t>User Management</w:t>
+        <w:t>User Management · Active Users</w:t>
       </w:r>
     </w:p>
     <w:p>
@@ -24470,7 +25812,7 @@
           <w:i w:val="0"/>
           <w:sz w:val="22"/>
         </w:rPr>
-        <w:t>The people icon in the top bar shows who is using PPMS right now, and who is editing the plan.</w:t>
+        <w:t>The people icon in the top bar shows, live, who is using PPMS right now, what they are doing and where.</w:t>
       </w:r>
     </w:p>
     <w:p>
@@ -24481,7 +25823,7 @@
       <w:r>
         <w:drawing>
           <wp:inline xmlns:a="http://schemas.openxmlformats.org/drawingml/2006/main" xmlns:pic="http://schemas.openxmlformats.org/drawingml/2006/picture">
-            <wp:extent cx="2992581" cy="1163782"/>
+            <wp:extent cx="2801389" cy="1870364"/>
             <wp:docPr id="35" name="Picture 35"/>
             <wp:cNvGraphicFramePr>
               <a:graphicFrameLocks noChangeAspect="1"/>
@@ -24502,7 +25844,7 @@
                   <pic:spPr>
                     <a:xfrm>
                       <a:off x="0" y="0"/>
-                      <a:ext cx="2992581" cy="1163782"/>
+                      <a:ext cx="2801389" cy="1870364"/>
                     </a:xfrm>
                     <a:prstGeom prst="rect"/>
                   </pic:spPr>
@@ -24606,7 +25948,236 @@
               <w:rPr>
                 <w:sz w:val="20"/>
               </w:rPr>
-              <w:t>Click the Active Users icon to see the list.</w:t>
+              <w:t>Click the people icon (the badge shows how many are online).</w:t>
+            </w:r>
+          </w:p>
+        </w:tc>
+      </w:tr>
+      <w:tr>
+        <w:tc>
+          <w:tcPr>
+            <w:tcW w:type="dxa" w:w="454"/>
+            <w:vAlign w:val="top"/>
+            <w:tcMar>
+              <w:top w:w="30" w:type="dxa"/>
+              <w:bottom w:w="30" w:type="dxa"/>
+              <w:start w:w="40" w:type="dxa"/>
+              <w:end w:w="40" w:type="dxa"/>
+            </w:tcMar>
+            <w:shd w:val="clear" w:color="auto" w:fill="2563EB"/>
+          </w:tcPr>
+          <w:p>
+            <w:pPr>
+              <w:jc w:val="center"/>
+            </w:pPr>
+            <w:r>
+              <w:rPr>
+                <w:b/>
+                <w:color w:val="FFFFFF"/>
+                <w:sz w:val="18"/>
+              </w:rPr>
+              <w:t>2</w:t>
+            </w:r>
+          </w:p>
+        </w:tc>
+        <w:tc>
+          <w:tcPr>
+            <w:tcW w:type="dxa" w:w="8844"/>
+            <w:tcMar>
+              <w:top w:w="40" w:type="dxa"/>
+              <w:bottom w:w="60" w:type="dxa"/>
+              <w:start w:w="120" w:type="dxa"/>
+              <w:end w:w="40" w:type="dxa"/>
+            </w:tcMar>
+          </w:tcPr>
+          <w:p>
+            <w:pPr>
+              <w:spacing w:after="0"/>
+            </w:pPr>
+            <w:r>
+              <w:rPr>
+                <w:sz w:val="20"/>
+              </w:rPr>
+              <w:t>Each person shows a status: Active, Editing the plan, Idle (no activity for 5 minutes) or Away (PPMS in a background tab).</w:t>
+            </w:r>
+          </w:p>
+        </w:tc>
+      </w:tr>
+      <w:tr>
+        <w:tc>
+          <w:tcPr>
+            <w:tcW w:type="dxa" w:w="454"/>
+            <w:vAlign w:val="top"/>
+            <w:tcMar>
+              <w:top w:w="30" w:type="dxa"/>
+              <w:bottom w:w="30" w:type="dxa"/>
+              <w:start w:w="40" w:type="dxa"/>
+              <w:end w:w="40" w:type="dxa"/>
+            </w:tcMar>
+            <w:shd w:val="clear" w:color="auto" w:fill="2563EB"/>
+          </w:tcPr>
+          <w:p>
+            <w:pPr>
+              <w:jc w:val="center"/>
+            </w:pPr>
+            <w:r>
+              <w:rPr>
+                <w:b/>
+                <w:color w:val="FFFFFF"/>
+                <w:sz w:val="18"/>
+              </w:rPr>
+              <w:t>3</w:t>
+            </w:r>
+          </w:p>
+        </w:tc>
+        <w:tc>
+          <w:tcPr>
+            <w:tcW w:type="dxa" w:w="8844"/>
+            <w:tcMar>
+              <w:top w:w="40" w:type="dxa"/>
+              <w:bottom w:w="60" w:type="dxa"/>
+              <w:start w:w="120" w:type="dxa"/>
+              <w:end w:w="40" w:type="dxa"/>
+            </w:tcMar>
+          </w:tcPr>
+          <w:p>
+            <w:pPr>
+              <w:spacing w:after="0"/>
+            </w:pPr>
+            <w:r>
+              <w:rPr>
+                <w:sz w:val="20"/>
+              </w:rPr>
+              <w:t>Below the name: where they are (module, section, and what they are editing), when they signed in and how long the session has lasted, and how long this visit has lasted.</w:t>
+            </w:r>
+          </w:p>
+        </w:tc>
+      </w:tr>
+      <w:tr>
+        <w:tc>
+          <w:tcPr>
+            <w:tcW w:type="dxa" w:w="454"/>
+            <w:vAlign w:val="top"/>
+            <w:tcMar>
+              <w:top w:w="30" w:type="dxa"/>
+              <w:bottom w:w="30" w:type="dxa"/>
+              <w:start w:w="40" w:type="dxa"/>
+              <w:end w:w="40" w:type="dxa"/>
+            </w:tcMar>
+            <w:shd w:val="clear" w:color="auto" w:fill="2563EB"/>
+          </w:tcPr>
+          <w:p>
+            <w:pPr>
+              <w:jc w:val="center"/>
+            </w:pPr>
+            <w:r>
+              <w:rPr>
+                <w:b/>
+                <w:color w:val="FFFFFF"/>
+                <w:sz w:val="18"/>
+              </w:rPr>
+              <w:t>4</w:t>
+            </w:r>
+          </w:p>
+        </w:tc>
+        <w:tc>
+          <w:tcPr>
+            <w:tcW w:type="dxa" w:w="8844"/>
+            <w:tcMar>
+              <w:top w:w="40" w:type="dxa"/>
+              <w:bottom w:w="60" w:type="dxa"/>
+              <w:start w:w="120" w:type="dxa"/>
+              <w:end w:w="40" w:type="dxa"/>
+            </w:tcMar>
+          </w:tcPr>
+          <w:p>
+            <w:pPr>
+              <w:spacing w:after="0"/>
+            </w:pPr>
+            <w:r>
+              <w:rPr>
+                <w:sz w:val="20"/>
+              </w:rPr>
+              <w:t>Press Activity for their Audit Log, or User to open them in User Management.</w:t>
+            </w:r>
+          </w:p>
+        </w:tc>
+      </w:tr>
+    </w:tbl>
+    <w:p>
+      <w:pPr>
+        <w:spacing w:after="40"/>
+      </w:pPr>
+    </w:p>
+    <w:tbl>
+      <w:tblPr>
+        <w:tblW w:type="auto" w:w="0"/>
+        <w:tblLook w:firstColumn="1" w:firstRow="1" w:lastColumn="0" w:lastRow="0" w:noHBand="0" w:noVBand="1" w:val="04A0"/>
+        <w:tblBorders>
+          <w:top w:val="nil"/>
+          <w:left w:val="nil"/>
+          <w:bottom w:val="nil"/>
+          <w:right w:val="nil"/>
+          <w:insideH w:val="nil"/>
+          <w:insideV w:val="nil"/>
+        </w:tblBorders>
+      </w:tblPr>
+      <w:tblGrid>
+        <w:gridCol w:w="9638"/>
+      </w:tblGrid>
+      <w:tr>
+        <w:tc>
+          <w:tcPr>
+            <w:tcW w:type="dxa" w:w="9638"/>
+            <w:shd w:val="clear" w:color="auto" w:fill="FEF3C7"/>
+            <w:tcBorders>
+              <w:top w:val="nil"/>
+              <w:left w:val="single" w:sz="36" w:color="D97706"/>
+              <w:bottom w:val="nil"/>
+              <w:right w:val="nil"/>
+            </w:tcBorders>
+            <w:tcMar>
+              <w:top w:w="90" w:type="dxa"/>
+              <w:bottom w:w="90" w:type="dxa"/>
+              <w:start w:w="200" w:type="dxa"/>
+              <w:end w:w="160" w:type="dxa"/>
+            </w:tcMar>
+          </w:tcPr>
+          <w:p>
+            <w:pPr>
+              <w:spacing w:after="40"/>
+            </w:pPr>
+            <w:r>
+              <w:rPr>
+                <w:b/>
+                <w:color w:val="D97706"/>
+                <w:sz w:val="19"/>
+              </w:rPr>
+              <w:t>Tips</w:t>
+            </w:r>
+          </w:p>
+          <w:p>
+            <w:pPr>
+              <w:spacing w:after="20"/>
+              <w:ind w:left="198" w:hanging="198"/>
+            </w:pPr>
+            <w:r>
+              <w:rPr>
+                <w:sz w:val="19"/>
+              </w:rPr>
+              <w:t>•  The list updates by itself while it is open; people who close PPMS leave the list at once.</w:t>
+            </w:r>
+          </w:p>
+          <w:p>
+            <w:pPr>
+              <w:spacing w:after="20"/>
+              <w:ind w:left="198" w:hanging="198"/>
+            </w:pPr>
+            <w:r>
+              <w:rPr>
+                <w:sz w:val="19"/>
+              </w:rPr>
+              <w:t>•  A person tagged "older version" should load the latest version (the blinking version number) to show where they are and to record their exports.</w:t>
             </w:r>
           </w:p>
         </w:tc>
@@ -24635,7 +26206,7 @@
           <w:color w:val="64748B"/>
           <w:sz w:val="18"/>
         </w:rPr>
-        <w:t>Working together on the same plan</w:t>
+        <w:t>Working together on the same plan · Audit Log · User Management</w:t>
       </w:r>
     </w:p>
     <w:p>
@@ -24677,7 +26248,7 @@
           <w:color w:val="64748B"/>
           <w:sz w:val="18"/>
         </w:rPr>
-        <w:t>In this chapter: Keeping PPMS up to date · Colour themes · Notifications · Changing your password · Help &amp; User Manual · The PPMS Assistant</w:t>
+        <w:t>In this chapter: Keeping PPMS up to date · Colour themes · Language — English, Korean, Arabic · Notifications · Changing your password · Help &amp; User Manual · The PPMS Assistant</w:t>
       </w:r>
     </w:p>
     <w:p>
@@ -25430,6 +27001,420 @@
         <w:pStyle w:val="Heading2"/>
       </w:pPr>
       <w:r>
+        <w:t>Language — English, Korean, Arabic</w:t>
+      </w:r>
+    </w:p>
+    <w:tbl>
+      <w:tblPr>
+        <w:tblW w:type="auto" w:w="0"/>
+        <w:tblLook w:firstColumn="1" w:firstRow="1" w:lastColumn="0" w:lastRow="0" w:noHBand="0" w:noVBand="1" w:val="04A0"/>
+        <w:tblBorders>
+          <w:top w:val="nil"/>
+          <w:left w:val="nil"/>
+          <w:bottom w:val="nil"/>
+          <w:right w:val="nil"/>
+          <w:insideH w:val="nil"/>
+          <w:insideV w:val="nil"/>
+        </w:tblBorders>
+      </w:tblPr>
+      <w:tblGrid>
+        <w:gridCol w:w="4819"/>
+        <w:gridCol w:w="4819"/>
+      </w:tblGrid>
+      <w:tr>
+        <w:tc>
+          <w:tcPr>
+            <w:tcW w:type="dxa" w:w="4819"/>
+            <w:shd w:val="clear" w:color="auto" w:fill="EFF6FF"/>
+            <w:tcMar>
+              <w:top w:w="50" w:type="dxa"/>
+              <w:bottom w:w="50" w:type="dxa"/>
+              <w:start w:w="120" w:type="dxa"/>
+              <w:end w:w="120" w:type="dxa"/>
+            </w:tcMar>
+          </w:tcPr>
+          <w:p>
+            <w:pPr>
+              <w:spacing w:after="0"/>
+            </w:pPr>
+            <w:r>
+              <w:rPr>
+                <w:b/>
+                <w:color w:val="1E3A8A"/>
+                <w:sz w:val="17"/>
+              </w:rPr>
+              <w:t xml:space="preserve">Who can use it: </w:t>
+            </w:r>
+            <w:r>
+              <w:rPr>
+                <w:sz w:val="17"/>
+              </w:rPr>
+              <w:t>Everyone</w:t>
+            </w:r>
+          </w:p>
+        </w:tc>
+        <w:tc>
+          <w:tcPr>
+            <w:tcW w:type="dxa" w:w="4819"/>
+            <w:shd w:val="clear" w:color="auto" w:fill="EFF6FF"/>
+            <w:tcMar>
+              <w:top w:w="50" w:type="dxa"/>
+              <w:bottom w:w="50" w:type="dxa"/>
+              <w:start w:w="120" w:type="dxa"/>
+              <w:end w:w="120" w:type="dxa"/>
+            </w:tcMar>
+          </w:tcPr>
+          <w:p>
+            <w:pPr>
+              <w:spacing w:after="0"/>
+            </w:pPr>
+            <w:r>
+              <w:rPr>
+                <w:b/>
+                <w:color w:val="1E3A8A"/>
+                <w:sz w:val="17"/>
+              </w:rPr>
+              <w:t xml:space="preserve">Applies to: </w:t>
+            </w:r>
+            <w:r>
+              <w:rPr>
+                <w:sz w:val="17"/>
+              </w:rPr>
+              <w:t>All modules</w:t>
+            </w:r>
+          </w:p>
+        </w:tc>
+      </w:tr>
+    </w:tbl>
+    <w:p>
+      <w:pPr>
+        <w:spacing w:after="20"/>
+      </w:pPr>
+    </w:p>
+    <w:p>
+      <w:pPr>
+        <w:spacing w:after="120"/>
+      </w:pPr>
+      <w:r>
+        <w:rPr>
+          <w:b w:val="0"/>
+          <w:i w:val="0"/>
+          <w:sz w:val="22"/>
+        </w:rPr>
+        <w:t>PPMS can be used in English, Korean (한국어) or Arabic (العربية). Your choice is remembered on this device and on your account.</w:t>
+      </w:r>
+    </w:p>
+    <w:p>
+      <w:pPr>
+        <w:keepNext/>
+        <w:jc w:val="center"/>
+      </w:pPr>
+      <w:r>
+        <w:drawing>
+          <wp:inline xmlns:a="http://schemas.openxmlformats.org/drawingml/2006/main" xmlns:pic="http://schemas.openxmlformats.org/drawingml/2006/picture">
+            <wp:extent cx="5311832" cy="1396538"/>
+            <wp:docPr id="37" name="Picture 37"/>
+            <wp:cNvGraphicFramePr>
+              <a:graphicFrameLocks noChangeAspect="1"/>
+            </wp:cNvGraphicFramePr>
+            <a:graphic>
+              <a:graphicData uri="http://schemas.openxmlformats.org/drawingml/2006/picture">
+                <pic:pic>
+                  <pic:nvPicPr>
+                    <pic:cNvPr id="0" name="language.jpg"/>
+                    <pic:cNvPicPr/>
+                  </pic:nvPicPr>
+                  <pic:blipFill>
+                    <a:blip r:embed="rId47"/>
+                    <a:stretch>
+                      <a:fillRect/>
+                    </a:stretch>
+                  </pic:blipFill>
+                  <pic:spPr>
+                    <a:xfrm>
+                      <a:off x="0" y="0"/>
+                      <a:ext cx="5311832" cy="1396538"/>
+                    </a:xfrm>
+                    <a:prstGeom prst="rect"/>
+                  </pic:spPr>
+                </pic:pic>
+              </a:graphicData>
+            </a:graphic>
+          </wp:inline>
+        </w:drawing>
+      </w:r>
+    </w:p>
+    <w:p>
+      <w:pPr>
+        <w:spacing w:after="160"/>
+        <w:jc w:val="center"/>
+      </w:pPr>
+      <w:r>
+        <w:rPr>
+          <w:b w:val="0"/>
+          <w:i/>
+          <w:color w:val="64748B"/>
+          <w:sz w:val="17"/>
+        </w:rPr>
+        <w:t>Figure 37 — Language — English, Korean, Arabic</w:t>
+      </w:r>
+    </w:p>
+    <w:p>
+      <w:pPr>
+        <w:keepNext/>
+        <w:spacing w:after="60" w:before="80"/>
+      </w:pPr>
+      <w:r>
+        <w:rPr>
+          <w:b/>
+          <w:i w:val="0"/>
+          <w:color w:val="64748B"/>
+          <w:sz w:val="17"/>
+        </w:rPr>
+        <w:t>STEP BY STEP</w:t>
+      </w:r>
+    </w:p>
+    <w:tbl>
+      <w:tblPr>
+        <w:tblW w:type="auto" w:w="0"/>
+        <w:tblLayout w:type="fixed"/>
+        <w:tblLook w:firstColumn="1" w:firstRow="1" w:lastColumn="0" w:lastRow="0" w:noHBand="0" w:noVBand="1" w:val="04A0"/>
+        <w:tblBorders>
+          <w:top w:val="nil"/>
+          <w:left w:val="nil"/>
+          <w:bottom w:val="nil"/>
+          <w:right w:val="nil"/>
+          <w:insideH w:val="nil"/>
+          <w:insideV w:val="nil"/>
+        </w:tblBorders>
+      </w:tblPr>
+      <w:tblGrid>
+        <w:gridCol w:w="4819"/>
+        <w:gridCol w:w="4819"/>
+      </w:tblGrid>
+      <w:tr>
+        <w:tc>
+          <w:tcPr>
+            <w:tcW w:type="dxa" w:w="454"/>
+            <w:vAlign w:val="top"/>
+            <w:tcMar>
+              <w:top w:w="30" w:type="dxa"/>
+              <w:bottom w:w="30" w:type="dxa"/>
+              <w:start w:w="40" w:type="dxa"/>
+              <w:end w:w="40" w:type="dxa"/>
+            </w:tcMar>
+            <w:shd w:val="clear" w:color="auto" w:fill="2563EB"/>
+          </w:tcPr>
+          <w:p>
+            <w:pPr>
+              <w:jc w:val="center"/>
+            </w:pPr>
+            <w:r>
+              <w:rPr>
+                <w:b/>
+                <w:color w:val="FFFFFF"/>
+                <w:sz w:val="18"/>
+              </w:rPr>
+              <w:t>1</w:t>
+            </w:r>
+          </w:p>
+        </w:tc>
+        <w:tc>
+          <w:tcPr>
+            <w:tcW w:type="dxa" w:w="8844"/>
+            <w:tcMar>
+              <w:top w:w="40" w:type="dxa"/>
+              <w:bottom w:w="60" w:type="dxa"/>
+              <w:start w:w="120" w:type="dxa"/>
+              <w:end w:w="40" w:type="dxa"/>
+            </w:tcMar>
+          </w:tcPr>
+          <w:p>
+            <w:pPr>
+              <w:spacing w:after="0"/>
+            </w:pPr>
+            <w:r>
+              <w:rPr>
+                <w:sz w:val="20"/>
+              </w:rPr>
+              <w:t>Click the globe button in the top bar (it shows EN, 한 or ع) — or the same button on the sign-in page.</w:t>
+            </w:r>
+          </w:p>
+        </w:tc>
+      </w:tr>
+      <w:tr>
+        <w:tc>
+          <w:tcPr>
+            <w:tcW w:type="dxa" w:w="454"/>
+            <w:vAlign w:val="top"/>
+            <w:tcMar>
+              <w:top w:w="30" w:type="dxa"/>
+              <w:bottom w:w="30" w:type="dxa"/>
+              <w:start w:w="40" w:type="dxa"/>
+              <w:end w:w="40" w:type="dxa"/>
+            </w:tcMar>
+            <w:shd w:val="clear" w:color="auto" w:fill="2563EB"/>
+          </w:tcPr>
+          <w:p>
+            <w:pPr>
+              <w:jc w:val="center"/>
+            </w:pPr>
+            <w:r>
+              <w:rPr>
+                <w:b/>
+                <w:color w:val="FFFFFF"/>
+                <w:sz w:val="18"/>
+              </w:rPr>
+              <w:t>2</w:t>
+            </w:r>
+          </w:p>
+        </w:tc>
+        <w:tc>
+          <w:tcPr>
+            <w:tcW w:type="dxa" w:w="8844"/>
+            <w:tcMar>
+              <w:top w:w="40" w:type="dxa"/>
+              <w:bottom w:w="60" w:type="dxa"/>
+              <w:start w:w="120" w:type="dxa"/>
+              <w:end w:w="40" w:type="dxa"/>
+            </w:tcMar>
+          </w:tcPr>
+          <w:p>
+            <w:pPr>
+              <w:spacing w:after="0"/>
+            </w:pPr>
+            <w:r>
+              <w:rPr>
+                <w:sz w:val="20"/>
+              </w:rPr>
+              <w:t>Choose English, 한국어 or العربية. The page reloads in that language.</w:t>
+            </w:r>
+          </w:p>
+        </w:tc>
+      </w:tr>
+    </w:tbl>
+    <w:p>
+      <w:pPr>
+        <w:spacing w:after="40"/>
+      </w:pPr>
+    </w:p>
+    <w:tbl>
+      <w:tblPr>
+        <w:tblW w:type="auto" w:w="0"/>
+        <w:tblLook w:firstColumn="1" w:firstRow="1" w:lastColumn="0" w:lastRow="0" w:noHBand="0" w:noVBand="1" w:val="04A0"/>
+        <w:tblBorders>
+          <w:top w:val="nil"/>
+          <w:left w:val="nil"/>
+          <w:bottom w:val="nil"/>
+          <w:right w:val="nil"/>
+          <w:insideH w:val="nil"/>
+          <w:insideV w:val="nil"/>
+        </w:tblBorders>
+      </w:tblPr>
+      <w:tblGrid>
+        <w:gridCol w:w="9638"/>
+      </w:tblGrid>
+      <w:tr>
+        <w:tc>
+          <w:tcPr>
+            <w:tcW w:type="dxa" w:w="9638"/>
+            <w:shd w:val="clear" w:color="auto" w:fill="FEF3C7"/>
+            <w:tcBorders>
+              <w:top w:val="nil"/>
+              <w:left w:val="single" w:sz="36" w:color="D97706"/>
+              <w:bottom w:val="nil"/>
+              <w:right w:val="nil"/>
+            </w:tcBorders>
+            <w:tcMar>
+              <w:top w:w="90" w:type="dxa"/>
+              <w:bottom w:w="90" w:type="dxa"/>
+              <w:start w:w="200" w:type="dxa"/>
+              <w:end w:w="160" w:type="dxa"/>
+            </w:tcMar>
+          </w:tcPr>
+          <w:p>
+            <w:pPr>
+              <w:spacing w:after="40"/>
+            </w:pPr>
+            <w:r>
+              <w:rPr>
+                <w:b/>
+                <w:color w:val="D97706"/>
+                <w:sz w:val="19"/>
+              </w:rPr>
+              <w:t>Tips</w:t>
+            </w:r>
+          </w:p>
+          <w:p>
+            <w:pPr>
+              <w:spacing w:after="20"/>
+              <w:ind w:left="198" w:hanging="198"/>
+            </w:pPr>
+            <w:r>
+              <w:rPr>
+                <w:sz w:val="19"/>
+              </w:rPr>
+              <w:t>•  Arabic switches the page to right-to-left. The Gantt timeline and the VPX matrix stay left-to-right, because time and process order run that way.</w:t>
+            </w:r>
+          </w:p>
+          <w:p>
+            <w:pPr>
+              <w:spacing w:after="20"/>
+              <w:ind w:left="198" w:hanging="198"/>
+            </w:pPr>
+            <w:r>
+              <w:rPr>
+                <w:sz w:val="19"/>
+              </w:rPr>
+              <w:t>•  Plan data — station, part and unit names, codes — is never translated. Exported reports (PDF, Excel, Word) stay in English.</w:t>
+            </w:r>
+          </w:p>
+          <w:p>
+            <w:pPr>
+              <w:spacing w:after="20"/>
+              <w:ind w:left="198" w:hanging="198"/>
+            </w:pPr>
+            <w:r>
+              <w:rPr>
+                <w:sz w:val="19"/>
+              </w:rPr>
+              <w:t>•  The Korean translation is a work in progress; suggestions are welcome.</w:t>
+            </w:r>
+          </w:p>
+        </w:tc>
+      </w:tr>
+    </w:tbl>
+    <w:p>
+      <w:pPr>
+        <w:spacing w:after="40"/>
+      </w:pPr>
+    </w:p>
+    <w:p>
+      <w:pPr>
+        <w:spacing w:after="200"/>
+      </w:pPr>
+      <w:r>
+        <w:rPr>
+          <w:b/>
+          <w:color w:val="1E3A8A"/>
+          <w:sz w:val="18"/>
+        </w:rPr>
+        <w:t xml:space="preserve">See also: </w:t>
+      </w:r>
+      <w:r>
+        <w:rPr>
+          <w:i/>
+          <w:color w:val="64748B"/>
+          <w:sz w:val="18"/>
+        </w:rPr>
+        <w:t>The top bar · Signing in</w:t>
+      </w:r>
+    </w:p>
+    <w:p>
+      <w:pPr>
+        <w:pStyle w:val="Heading2"/>
+      </w:pPr>
+      <w:r>
         <w:t>Notifications</w:t>
       </w:r>
     </w:p>
@@ -25530,7 +27515,7 @@
           <w:i w:val="0"/>
           <w:sz w:val="22"/>
         </w:rPr>
-        <w:t>The bell collects new comments, new and updated issues and plan changes, including from other modules.</w:t>
+        <w:t>The bell collects new comments, new and updated issues and plan changes, including from other modules. Master Admins also see sign-ins and report exports.</w:t>
       </w:r>
     </w:p>
     <w:p>
@@ -25542,7 +27527,7 @@
         <w:drawing>
           <wp:inline xmlns:a="http://schemas.openxmlformats.org/drawingml/2006/main" xmlns:pic="http://schemas.openxmlformats.org/drawingml/2006/picture">
             <wp:extent cx="3325090" cy="1080654"/>
-            <wp:docPr id="37" name="Picture 37"/>
+            <wp:docPr id="38" name="Picture 38"/>
             <wp:cNvGraphicFramePr>
               <a:graphicFrameLocks noChangeAspect="1"/>
             </wp:cNvGraphicFramePr>
@@ -25554,7 +27539,7 @@
                     <pic:cNvPicPr/>
                   </pic:nvPicPr>
                   <pic:blipFill>
-                    <a:blip r:embed="rId47"/>
+                    <a:blip r:embed="rId48"/>
                     <a:stretch>
                       <a:fillRect/>
                     </a:stretch>
@@ -25585,7 +27570,7 @@
           <w:color w:val="64748B"/>
           <w:sz w:val="17"/>
         </w:rPr>
-        <w:t>Figure 37 — Notifications</w:t>
+        <w:t>Figure 38 — Notifications</w:t>
       </w:r>
     </w:p>
     <w:p>
@@ -25745,7 +27730,7 @@
           <w:color w:val="64748B"/>
           <w:sz w:val="18"/>
         </w:rPr>
-        <w:t>Comments on a task · Working together on the same plan</w:t>
+        <w:t>Comments on a task · Working together on the same plan · Audit Log</w:t>
       </w:r>
     </w:p>
     <w:p>
@@ -25865,7 +27850,7 @@
         <w:drawing>
           <wp:inline xmlns:a="http://schemas.openxmlformats.org/drawingml/2006/main" xmlns:pic="http://schemas.openxmlformats.org/drawingml/2006/picture">
             <wp:extent cx="2992581" cy="2660072"/>
-            <wp:docPr id="38" name="Picture 38"/>
+            <wp:docPr id="39" name="Picture 39"/>
             <wp:cNvGraphicFramePr>
               <a:graphicFrameLocks noChangeAspect="1"/>
             </wp:cNvGraphicFramePr>
@@ -25877,7 +27862,7 @@
                     <pic:cNvPicPr/>
                   </pic:nvPicPr>
                   <pic:blipFill>
-                    <a:blip r:embed="rId48"/>
+                    <a:blip r:embed="rId49"/>
                     <a:stretch>
                       <a:fillRect/>
                     </a:stretch>
@@ -25908,7 +27893,7 @@
           <w:color w:val="64748B"/>
           <w:sz w:val="17"/>
         </w:rPr>
-        <w:t>Figure 38 — Changing your password</w:t>
+        <w:t>Figure 39 — Changing your password</w:t>
       </w:r>
     </w:p>
     <w:p>
@@ -26234,7 +28219,7 @@
         <w:drawing>
           <wp:inline xmlns:a="http://schemas.openxmlformats.org/drawingml/2006/main" xmlns:pic="http://schemas.openxmlformats.org/drawingml/2006/picture">
             <wp:extent cx="5940000" cy="2954847"/>
-            <wp:docPr id="39" name="Picture 39"/>
+            <wp:docPr id="40" name="Picture 40"/>
             <wp:cNvGraphicFramePr>
               <a:graphicFrameLocks noChangeAspect="1"/>
             </wp:cNvGraphicFramePr>
@@ -26246,7 +28231,7 @@
                     <pic:cNvPicPr/>
                   </pic:nvPicPr>
                   <pic:blipFill>
-                    <a:blip r:embed="rId49"/>
+                    <a:blip r:embed="rId50"/>
                     <a:stretch>
                       <a:fillRect/>
                     </a:stretch>
@@ -26277,7 +28262,7 @@
           <w:color w:val="64748B"/>
           <w:sz w:val="17"/>
         </w:rPr>
-        <w:t>Figure 39 — Help &amp; User Manual</w:t>
+        <w:t>Figure 40 — Help &amp; User Manual</w:t>
       </w:r>
     </w:p>
     <w:p>
@@ -26707,7 +28692,7 @@
         <w:drawing>
           <wp:inline xmlns:a="http://schemas.openxmlformats.org/drawingml/2006/main" xmlns:pic="http://schemas.openxmlformats.org/drawingml/2006/picture">
             <wp:extent cx="2992581" cy="4422370"/>
-            <wp:docPr id="40" name="Picture 40"/>
+            <wp:docPr id="41" name="Picture 41"/>
             <wp:cNvGraphicFramePr>
               <a:graphicFrameLocks noChangeAspect="1"/>
             </wp:cNvGraphicFramePr>
@@ -26719,7 +28704,7 @@
                     <pic:cNvPicPr/>
                   </pic:nvPicPr>
                   <pic:blipFill>
-                    <a:blip r:embed="rId50"/>
+                    <a:blip r:embed="rId51"/>
                     <a:stretch>
                       <a:fillRect/>
                     </a:stretch>
@@ -26750,7 +28735,7 @@
           <w:color w:val="64748B"/>
           <w:sz w:val="17"/>
         </w:rPr>
-        <w:t>Figure 40 — The PPMS Assistant</w:t>
+        <w:t>Figure 41 — The PPMS Assistant</w:t>
       </w:r>
     </w:p>
     <w:p>
@@ -29646,7 +31631,7 @@
         <w:color w:val="64748B"/>
         <w:sz w:val="16"/>
       </w:rPr>
-      <w:t xml:space="preserve">Production Planning &amp; Monitoring System  ·  03 October 2026  ·  Page </w:t>
+      <w:t xml:space="preserve">Production Planning &amp; Monitoring System  ·  07 October 2026  ·  Page </w:t>
     </w:r>
     <w:r>
       <w:rPr>

</xml_diff>

<commit_message>
Add role-based manual view and retake all manual screenshots
- "Topics for" selector in the user manual shows the topics for one role,
  and the Word button downloads that role's edition (5 editions built)
- Retake all manual screenshots in the light theme; add tour, reorder
  route and version update screenshots
- Fix lead-time category cards being squashed in Manage Lead Times
- Keep Gantt station names above bars while a row menu is open

Co-Authored-By: Claude Opus 5.5 <noreply@anthropic.com>
Claude-Session: https://claude.ai/code/session_01QuuLAAnsP6QPEwG87nWTho
</commit_message>
<xml_diff>
--- a/app-v2/assets/help/PPMS_User_Manual.docx
+++ b/app-v2/assets/help/PPMS_User_Manual.docx
@@ -3248,6 +3248,61 @@
     <w:p>
       <w:pPr>
         <w:keepNext/>
+        <w:jc w:val="center"/>
+      </w:pPr>
+      <w:r>
+        <w:drawing>
+          <wp:inline xmlns:a="http://schemas.openxmlformats.org/drawingml/2006/main" xmlns:pic="http://schemas.openxmlformats.org/drawingml/2006/picture">
+            <wp:extent cx="5940000" cy="1856250"/>
+            <wp:docPr id="1" name="Picture 1"/>
+            <wp:cNvGraphicFramePr>
+              <a:graphicFrameLocks noChangeAspect="1"/>
+            </wp:cNvGraphicFramePr>
+            <a:graphic>
+              <a:graphicData uri="http://schemas.openxmlformats.org/drawingml/2006/picture">
+                <pic:pic>
+                  <pic:nvPicPr>
+                    <pic:cNvPr id="0" name="tour.jpg"/>
+                    <pic:cNvPicPr/>
+                  </pic:nvPicPr>
+                  <pic:blipFill>
+                    <a:blip r:embed="rId11"/>
+                    <a:stretch>
+                      <a:fillRect/>
+                    </a:stretch>
+                  </pic:blipFill>
+                  <pic:spPr>
+                    <a:xfrm>
+                      <a:off x="0" y="0"/>
+                      <a:ext cx="5940000" cy="1856250"/>
+                    </a:xfrm>
+                    <a:prstGeom prst="rect"/>
+                  </pic:spPr>
+                </pic:pic>
+              </a:graphicData>
+            </a:graphic>
+          </wp:inline>
+        </w:drawing>
+      </w:r>
+    </w:p>
+    <w:p>
+      <w:pPr>
+        <w:spacing w:after="160"/>
+        <w:jc w:val="center"/>
+      </w:pPr>
+      <w:r>
+        <w:rPr>
+          <w:b w:val="0"/>
+          <w:i/>
+          <w:color w:val="64748B"/>
+          <w:sz w:val="17"/>
+        </w:rPr>
+        <w:t>Figure 1 — The guided tour</w:t>
+      </w:r>
+    </w:p>
+    <w:p>
+      <w:pPr>
+        <w:keepNext/>
         <w:spacing w:after="60" w:before="80"/>
       </w:pPr>
       <w:r>
@@ -3689,7 +3744,7 @@
         <w:drawing>
           <wp:inline xmlns:a="http://schemas.openxmlformats.org/drawingml/2006/main" xmlns:pic="http://schemas.openxmlformats.org/drawingml/2006/picture">
             <wp:extent cx="5940000" cy="2954847"/>
-            <wp:docPr id="1" name="Picture 1"/>
+            <wp:docPr id="2" name="Picture 2"/>
             <wp:cNvGraphicFramePr>
               <a:graphicFrameLocks noChangeAspect="1"/>
             </wp:cNvGraphicFramePr>
@@ -3701,7 +3756,7 @@
                     <pic:cNvPicPr/>
                   </pic:nvPicPr>
                   <pic:blipFill>
-                    <a:blip r:embed="rId11"/>
+                    <a:blip r:embed="rId12"/>
                     <a:stretch>
                       <a:fillRect/>
                     </a:stretch>
@@ -3732,7 +3787,7 @@
           <w:color w:val="64748B"/>
           <w:sz w:val="17"/>
         </w:rPr>
-        <w:t>Figure 1 — Signing in</w:t>
+        <w:t>Figure 2 — Signing in</w:t>
       </w:r>
     </w:p>
     <w:p>
@@ -4269,8 +4324,8 @@
       <w:r>
         <w:drawing>
           <wp:inline xmlns:a="http://schemas.openxmlformats.org/drawingml/2006/main" xmlns:pic="http://schemas.openxmlformats.org/drawingml/2006/picture">
-            <wp:extent cx="4621876" cy="1579418"/>
-            <wp:docPr id="2" name="Picture 2"/>
+            <wp:extent cx="3291840" cy="1679171"/>
+            <wp:docPr id="3" name="Picture 3"/>
             <wp:cNvGraphicFramePr>
               <a:graphicFrameLocks noChangeAspect="1"/>
             </wp:cNvGraphicFramePr>
@@ -4282,7 +4337,7 @@
                     <pic:cNvPicPr/>
                   </pic:nvPicPr>
                   <pic:blipFill>
-                    <a:blip r:embed="rId12"/>
+                    <a:blip r:embed="rId13"/>
                     <a:stretch>
                       <a:fillRect/>
                     </a:stretch>
@@ -4290,7 +4345,7 @@
                   <pic:spPr>
                     <a:xfrm>
                       <a:off x="0" y="0"/>
-                      <a:ext cx="4621876" cy="1579418"/>
+                      <a:ext cx="3291840" cy="1679171"/>
                     </a:xfrm>
                     <a:prstGeom prst="rect"/>
                   </pic:spPr>
@@ -4313,7 +4368,7 @@
           <w:color w:val="64748B"/>
           <w:sz w:val="17"/>
         </w:rPr>
-        <w:t>Figure 2 — User roles and what they can do</w:t>
+        <w:t>Figure 3 — User roles and what they can do</w:t>
       </w:r>
     </w:p>
     <w:p>
@@ -4772,7 +4827,7 @@
         <w:drawing>
           <wp:inline xmlns:a="http://schemas.openxmlformats.org/drawingml/2006/main" xmlns:pic="http://schemas.openxmlformats.org/drawingml/2006/picture">
             <wp:extent cx="5940000" cy="218599"/>
-            <wp:docPr id="3" name="Picture 3"/>
+            <wp:docPr id="4" name="Picture 4"/>
             <wp:cNvGraphicFramePr>
               <a:graphicFrameLocks noChangeAspect="1"/>
             </wp:cNvGraphicFramePr>
@@ -4784,7 +4839,7 @@
                     <pic:cNvPicPr/>
                   </pic:nvPicPr>
                   <pic:blipFill>
-                    <a:blip r:embed="rId13"/>
+                    <a:blip r:embed="rId14"/>
                     <a:stretch>
                       <a:fillRect/>
                     </a:stretch>
@@ -4815,7 +4870,7 @@
           <w:color w:val="64748B"/>
           <w:sz w:val="17"/>
         </w:rPr>
-        <w:t>Figure 3 — The top bar</w:t>
+        <w:t>Figure 4 — The top bar</w:t>
       </w:r>
     </w:p>
     <w:p>
@@ -5561,8 +5616,8 @@
       <w:r>
         <w:drawing>
           <wp:inline xmlns:a="http://schemas.openxmlformats.org/drawingml/2006/main" xmlns:pic="http://schemas.openxmlformats.org/drawingml/2006/picture">
-            <wp:extent cx="5935287" cy="1978429"/>
-            <wp:docPr id="4" name="Picture 4"/>
+            <wp:extent cx="5940000" cy="1914610"/>
+            <wp:docPr id="5" name="Picture 5"/>
             <wp:cNvGraphicFramePr>
               <a:graphicFrameLocks noChangeAspect="1"/>
             </wp:cNvGraphicFramePr>
@@ -5574,7 +5629,7 @@
                     <pic:cNvPicPr/>
                   </pic:nvPicPr>
                   <pic:blipFill>
-                    <a:blip r:embed="rId14"/>
+                    <a:blip r:embed="rId15"/>
                     <a:stretch>
                       <a:fillRect/>
                     </a:stretch>
@@ -5582,7 +5637,7 @@
                   <pic:spPr>
                     <a:xfrm>
                       <a:off x="0" y="0"/>
-                      <a:ext cx="5935287" cy="1978429"/>
+                      <a:ext cx="5940000" cy="1914610"/>
                     </a:xfrm>
                     <a:prstGeom prst="rect"/>
                   </pic:spPr>
@@ -5605,7 +5660,7 @@
           <w:color w:val="64748B"/>
           <w:sz w:val="17"/>
         </w:rPr>
-        <w:t>Figure 4 — Modules: KD1, F200-KD2 and F100-KD2</w:t>
+        <w:t>Figure 5 — Modules: KD1, F200-KD2 and F100-KD2</w:t>
       </w:r>
     </w:p>
     <w:p>
@@ -6030,8 +6085,8 @@
       <w:r>
         <w:drawing>
           <wp:inline xmlns:a="http://schemas.openxmlformats.org/drawingml/2006/main" xmlns:pic="http://schemas.openxmlformats.org/drawingml/2006/picture">
-            <wp:extent cx="5940000" cy="562065"/>
-            <wp:docPr id="5" name="Picture 5"/>
+            <wp:extent cx="5940000" cy="596964"/>
+            <wp:docPr id="6" name="Picture 6"/>
             <wp:cNvGraphicFramePr>
               <a:graphicFrameLocks noChangeAspect="1"/>
             </wp:cNvGraphicFramePr>
@@ -6043,7 +6098,7 @@
                     <pic:cNvPicPr/>
                   </pic:nvPicPr>
                   <pic:blipFill>
-                    <a:blip r:embed="rId15"/>
+                    <a:blip r:embed="rId16"/>
                     <a:stretch>
                       <a:fillRect/>
                     </a:stretch>
@@ -6051,7 +6106,7 @@
                   <pic:spPr>
                     <a:xfrm>
                       <a:off x="0" y="0"/>
-                      <a:ext cx="5940000" cy="562065"/>
+                      <a:ext cx="5940000" cy="596964"/>
                     </a:xfrm>
                     <a:prstGeom prst="rect"/>
                   </pic:spPr>
@@ -6074,7 +6129,7 @@
           <w:color w:val="64748B"/>
           <w:sz w:val="17"/>
         </w:rPr>
-        <w:t>Figure 5 — Filtering the page</w:t>
+        <w:t>Figure 6 — Filtering the page</w:t>
       </w:r>
     </w:p>
     <w:p>
@@ -8753,7 +8808,7 @@
         <w:drawing>
           <wp:inline xmlns:a="http://schemas.openxmlformats.org/drawingml/2006/main" xmlns:pic="http://schemas.openxmlformats.org/drawingml/2006/picture">
             <wp:extent cx="5940000" cy="1075381"/>
-            <wp:docPr id="6" name="Picture 6"/>
+            <wp:docPr id="7" name="Picture 7"/>
             <wp:cNvGraphicFramePr>
               <a:graphicFrameLocks noChangeAspect="1"/>
             </wp:cNvGraphicFramePr>
@@ -8765,7 +8820,7 @@
                     <pic:cNvPicPr/>
                   </pic:nvPicPr>
                   <pic:blipFill>
-                    <a:blip r:embed="rId16"/>
+                    <a:blip r:embed="rId17"/>
                     <a:stretch>
                       <a:fillRect/>
                     </a:stretch>
@@ -8796,7 +8851,7 @@
           <w:color w:val="64748B"/>
           <w:sz w:val="17"/>
         </w:rPr>
-        <w:t>Figure 6 — Executive Summary</w:t>
+        <w:t>Figure 7 — Executive Summary</w:t>
       </w:r>
     </w:p>
     <w:p>
@@ -9292,8 +9347,8 @@
       <w:r>
         <w:drawing>
           <wp:inline xmlns:a="http://schemas.openxmlformats.org/drawingml/2006/main" xmlns:pic="http://schemas.openxmlformats.org/drawingml/2006/picture">
-            <wp:extent cx="5378334" cy="5877098"/>
-            <wp:docPr id="7" name="Picture 7"/>
+            <wp:extent cx="5336770" cy="5860472"/>
+            <wp:docPr id="8" name="Picture 8"/>
             <wp:cNvGraphicFramePr>
               <a:graphicFrameLocks noChangeAspect="1"/>
             </wp:cNvGraphicFramePr>
@@ -9305,7 +9360,7 @@
                     <pic:cNvPicPr/>
                   </pic:nvPicPr>
                   <pic:blipFill>
-                    <a:blip r:embed="rId17"/>
+                    <a:blip r:embed="rId18"/>
                     <a:stretch>
                       <a:fillRect/>
                     </a:stretch>
@@ -9313,7 +9368,7 @@
                   <pic:spPr>
                     <a:xfrm>
                       <a:off x="0" y="0"/>
-                      <a:ext cx="5378334" cy="5877098"/>
+                      <a:ext cx="5336770" cy="5860472"/>
                     </a:xfrm>
                     <a:prstGeom prst="rect"/>
                   </pic:spPr>
@@ -9336,7 +9391,7 @@
           <w:color w:val="64748B"/>
           <w:sz w:val="17"/>
         </w:rPr>
-        <w:t>Figure 7 — Delivery Delay Analysis</w:t>
+        <w:t>Figure 8 — Delivery Delay Analysis</w:t>
       </w:r>
     </w:p>
     <w:p>
@@ -10500,7 +10555,7 @@
         <w:drawing>
           <wp:inline xmlns:a="http://schemas.openxmlformats.org/drawingml/2006/main" xmlns:pic="http://schemas.openxmlformats.org/drawingml/2006/picture">
             <wp:extent cx="5940000" cy="2805356"/>
-            <wp:docPr id="8" name="Picture 8"/>
+            <wp:docPr id="9" name="Picture 9"/>
             <wp:cNvGraphicFramePr>
               <a:graphicFrameLocks noChangeAspect="1"/>
             </wp:cNvGraphicFramePr>
@@ -10512,7 +10567,7 @@
                     <pic:cNvPicPr/>
                   </pic:nvPicPr>
                   <pic:blipFill>
-                    <a:blip r:embed="rId18"/>
+                    <a:blip r:embed="rId19"/>
                     <a:stretch>
                       <a:fillRect/>
                     </a:stretch>
@@ -10543,7 +10598,7 @@
           <w:color w:val="64748B"/>
           <w:sz w:val="17"/>
         </w:rPr>
-        <w:t>Figure 8 — Vehicle Production Progress (VPX)</w:t>
+        <w:t>Figure 9 — Vehicle Production Progress (VPX)</w:t>
       </w:r>
     </w:p>
     <w:p>
@@ -11089,8 +11144,8 @@
       <w:r>
         <w:drawing>
           <wp:inline xmlns:a="http://schemas.openxmlformats.org/drawingml/2006/main" xmlns:pic="http://schemas.openxmlformats.org/drawingml/2006/picture">
-            <wp:extent cx="5940000" cy="1405161"/>
-            <wp:docPr id="9" name="Picture 9"/>
+            <wp:extent cx="5940000" cy="2664233"/>
+            <wp:docPr id="10" name="Picture 10"/>
             <wp:cNvGraphicFramePr>
               <a:graphicFrameLocks noChangeAspect="1"/>
             </wp:cNvGraphicFramePr>
@@ -11102,7 +11157,7 @@
                     <pic:cNvPicPr/>
                   </pic:nvPicPr>
                   <pic:blipFill>
-                    <a:blip r:embed="rId19"/>
+                    <a:blip r:embed="rId20"/>
                     <a:stretch>
                       <a:fillRect/>
                     </a:stretch>
@@ -11110,7 +11165,7 @@
                   <pic:spPr>
                     <a:xfrm>
                       <a:off x="0" y="0"/>
-                      <a:ext cx="5940000" cy="1405161"/>
+                      <a:ext cx="5940000" cy="2664233"/>
                     </a:xfrm>
                     <a:prstGeom prst="rect"/>
                   </pic:spPr>
@@ -11133,7 +11188,7 @@
           <w:color w:val="64748B"/>
           <w:sz w:val="17"/>
         </w:rPr>
-        <w:t>Figure 9 — Manufacturing Analytics (charts)</w:t>
+        <w:t>Figure 10 — Manufacturing Analytics (charts)</w:t>
       </w:r>
     </w:p>
     <w:p>
@@ -11646,7 +11701,7 @@
         <w:drawing>
           <wp:inline xmlns:a="http://schemas.openxmlformats.org/drawingml/2006/main" xmlns:pic="http://schemas.openxmlformats.org/drawingml/2006/picture">
             <wp:extent cx="5940000" cy="2775421"/>
-            <wp:docPr id="10" name="Picture 10"/>
+            <wp:docPr id="11" name="Picture 11"/>
             <wp:cNvGraphicFramePr>
               <a:graphicFrameLocks noChangeAspect="1"/>
             </wp:cNvGraphicFramePr>
@@ -11658,7 +11713,7 @@
                     <pic:cNvPicPr/>
                   </pic:nvPicPr>
                   <pic:blipFill>
-                    <a:blip r:embed="rId20"/>
+                    <a:blip r:embed="rId21"/>
                     <a:stretch>
                       <a:fillRect/>
                     </a:stretch>
@@ -11689,7 +11744,7 @@
           <w:color w:val="64748B"/>
           <w:sz w:val="17"/>
         </w:rPr>
-        <w:t>Figure 10 — Reading the Production Schedule</w:t>
+        <w:t>Figure 11 — Reading the Production Schedule</w:t>
       </w:r>
     </w:p>
     <w:p>
@@ -12398,7 +12453,7 @@
         <w:drawing>
           <wp:inline xmlns:a="http://schemas.openxmlformats.org/drawingml/2006/main" xmlns:pic="http://schemas.openxmlformats.org/drawingml/2006/picture">
             <wp:extent cx="5940000" cy="2300734"/>
-            <wp:docPr id="11" name="Picture 11"/>
+            <wp:docPr id="12" name="Picture 12"/>
             <wp:cNvGraphicFramePr>
               <a:graphicFrameLocks noChangeAspect="1"/>
             </wp:cNvGraphicFramePr>
@@ -12410,7 +12465,7 @@
                     <pic:cNvPicPr/>
                   </pic:nvPicPr>
                   <pic:blipFill>
-                    <a:blip r:embed="rId21"/>
+                    <a:blip r:embed="rId22"/>
                     <a:stretch>
                       <a:fillRect/>
                     </a:stretch>
@@ -12441,7 +12496,7 @@
           <w:color w:val="64748B"/>
           <w:sz w:val="17"/>
         </w:rPr>
-        <w:t>Figure 11 — Editing the schedule</w:t>
+        <w:t>Figure 12 — Editing the schedule</w:t>
       </w:r>
     </w:p>
     <w:p>
@@ -13497,6 +13552,61 @@
           <w:sz w:val="22"/>
         </w:rPr>
         <w:t>In Process view, Reorder route changes the order of stations for this plan version and lets you hide or delete a process from it.</w:t>
+      </w:r>
+    </w:p>
+    <w:p>
+      <w:pPr>
+        <w:keepNext/>
+        <w:jc w:val="center"/>
+      </w:pPr>
+      <w:r>
+        <w:drawing>
+          <wp:inline xmlns:a="http://schemas.openxmlformats.org/drawingml/2006/main" xmlns:pic="http://schemas.openxmlformats.org/drawingml/2006/picture">
+            <wp:extent cx="5940000" cy="2692230"/>
+            <wp:docPr id="13" name="Picture 13"/>
+            <wp:cNvGraphicFramePr>
+              <a:graphicFrameLocks noChangeAspect="1"/>
+            </wp:cNvGraphicFramePr>
+            <a:graphic>
+              <a:graphicData uri="http://schemas.openxmlformats.org/drawingml/2006/picture">
+                <pic:pic>
+                  <pic:nvPicPr>
+                    <pic:cNvPr id="0" name="reorder-route.jpg"/>
+                    <pic:cNvPicPr/>
+                  </pic:nvPicPr>
+                  <pic:blipFill>
+                    <a:blip r:embed="rId23"/>
+                    <a:stretch>
+                      <a:fillRect/>
+                    </a:stretch>
+                  </pic:blipFill>
+                  <pic:spPr>
+                    <a:xfrm>
+                      <a:off x="0" y="0"/>
+                      <a:ext cx="5940000" cy="2692230"/>
+                    </a:xfrm>
+                    <a:prstGeom prst="rect"/>
+                  </pic:spPr>
+                </pic:pic>
+              </a:graphicData>
+            </a:graphic>
+          </wp:inline>
+        </w:drawing>
+      </w:r>
+    </w:p>
+    <w:p>
+      <w:pPr>
+        <w:spacing w:after="160"/>
+        <w:jc w:val="center"/>
+      </w:pPr>
+      <w:r>
+        <w:rPr>
+          <w:b w:val="0"/>
+          <w:i/>
+          <w:color w:val="64748B"/>
+          <w:sz w:val="17"/>
+        </w:rPr>
+        <w:t>Figure 13 — Reordering the route and hiding or deleting processes</w:t>
       </w:r>
     </w:p>
     <w:p>
@@ -14113,8 +14223,8 @@
       <w:r>
         <w:drawing>
           <wp:inline xmlns:a="http://schemas.openxmlformats.org/drawingml/2006/main" xmlns:pic="http://schemas.openxmlformats.org/drawingml/2006/picture">
-            <wp:extent cx="5940000" cy="2320645"/>
-            <wp:docPr id="12" name="Picture 12"/>
+            <wp:extent cx="5940000" cy="2360605"/>
+            <wp:docPr id="14" name="Picture 14"/>
             <wp:cNvGraphicFramePr>
               <a:graphicFrameLocks noChangeAspect="1"/>
             </wp:cNvGraphicFramePr>
@@ -14126,7 +14236,7 @@
                     <pic:cNvPicPr/>
                   </pic:nvPicPr>
                   <pic:blipFill>
-                    <a:blip r:embed="rId22"/>
+                    <a:blip r:embed="rId24"/>
                     <a:stretch>
                       <a:fillRect/>
                     </a:stretch>
@@ -14134,7 +14244,7 @@
                   <pic:spPr>
                     <a:xfrm>
                       <a:off x="0" y="0"/>
-                      <a:ext cx="5940000" cy="2320645"/>
+                      <a:ext cx="5940000" cy="2360605"/>
                     </a:xfrm>
                     <a:prstGeom prst="rect"/>
                   </pic:spPr>
@@ -14157,7 +14267,7 @@
           <w:color w:val="64748B"/>
           <w:sz w:val="17"/>
         </w:rPr>
-        <w:t>Figure 12 — The Plan Table</w:t>
+        <w:t>Figure 14 — The Plan Table</w:t>
       </w:r>
     </w:p>
     <w:p>
@@ -14615,8 +14725,8 @@
       <w:r>
         <w:drawing>
           <wp:inline xmlns:a="http://schemas.openxmlformats.org/drawingml/2006/main" xmlns:pic="http://schemas.openxmlformats.org/drawingml/2006/picture">
-            <wp:extent cx="5940000" cy="2744022"/>
-            <wp:docPr id="13" name="Picture 13"/>
+            <wp:extent cx="5940000" cy="1817495"/>
+            <wp:docPr id="15" name="Picture 15"/>
             <wp:cNvGraphicFramePr>
               <a:graphicFrameLocks noChangeAspect="1"/>
             </wp:cNvGraphicFramePr>
@@ -14628,7 +14738,7 @@
                     <pic:cNvPicPr/>
                   </pic:nvPicPr>
                   <pic:blipFill>
-                    <a:blip r:embed="rId23"/>
+                    <a:blip r:embed="rId25"/>
                     <a:stretch>
                       <a:fillRect/>
                     </a:stretch>
@@ -14636,7 +14746,7 @@
                   <pic:spPr>
                     <a:xfrm>
                       <a:off x="0" y="0"/>
-                      <a:ext cx="5940000" cy="2744022"/>
+                      <a:ext cx="5940000" cy="1817495"/>
                     </a:xfrm>
                     <a:prstGeom prst="rect"/>
                   </pic:spPr>
@@ -14659,7 +14769,7 @@
           <w:color w:val="64748B"/>
           <w:sz w:val="17"/>
         </w:rPr>
-        <w:t>Figure 13 — Recording actual start and completion</w:t>
+        <w:t>Figure 15 — Recording actual start and completion</w:t>
       </w:r>
     </w:p>
     <w:p>
@@ -15239,8 +15349,8 @@
       <w:r>
         <w:drawing>
           <wp:inline xmlns:a="http://schemas.openxmlformats.org/drawingml/2006/main" xmlns:pic="http://schemas.openxmlformats.org/drawingml/2006/picture">
-            <wp:extent cx="5320145" cy="1870363"/>
-            <wp:docPr id="14" name="Picture 14"/>
+            <wp:extent cx="4987636" cy="1828800"/>
+            <wp:docPr id="16" name="Picture 16"/>
             <wp:cNvGraphicFramePr>
               <a:graphicFrameLocks noChangeAspect="1"/>
             </wp:cNvGraphicFramePr>
@@ -15252,7 +15362,7 @@
                     <pic:cNvPicPr/>
                   </pic:nvPicPr>
                   <pic:blipFill>
-                    <a:blip r:embed="rId24"/>
+                    <a:blip r:embed="rId26"/>
                     <a:stretch>
                       <a:fillRect/>
                     </a:stretch>
@@ -15260,7 +15370,7 @@
                   <pic:spPr>
                     <a:xfrm>
                       <a:off x="0" y="0"/>
-                      <a:ext cx="5320145" cy="1870363"/>
+                      <a:ext cx="4987636" cy="1828800"/>
                     </a:xfrm>
                     <a:prstGeom prst="rect"/>
                   </pic:spPr>
@@ -15283,7 +15393,7 @@
           <w:color w:val="64748B"/>
           <w:sz w:val="17"/>
         </w:rPr>
-        <w:t>Figure 14 — Comments on a task</w:t>
+        <w:t>Figure 16 — Comments on a task</w:t>
       </w:r>
     </w:p>
     <w:p>
@@ -15679,8 +15789,8 @@
       <w:r>
         <w:drawing>
           <wp:inline xmlns:a="http://schemas.openxmlformats.org/drawingml/2006/main" xmlns:pic="http://schemas.openxmlformats.org/drawingml/2006/picture">
-            <wp:extent cx="5112327" cy="3408218"/>
-            <wp:docPr id="15" name="Picture 15"/>
+            <wp:extent cx="3300152" cy="2119745"/>
+            <wp:docPr id="17" name="Picture 17"/>
             <wp:cNvGraphicFramePr>
               <a:graphicFrameLocks noChangeAspect="1"/>
             </wp:cNvGraphicFramePr>
@@ -15692,7 +15802,7 @@
                     <pic:cNvPicPr/>
                   </pic:nvPicPr>
                   <pic:blipFill>
-                    <a:blip r:embed="rId25"/>
+                    <a:blip r:embed="rId27"/>
                     <a:stretch>
                       <a:fillRect/>
                     </a:stretch>
@@ -15700,7 +15810,7 @@
                   <pic:spPr>
                     <a:xfrm>
                       <a:off x="0" y="0"/>
-                      <a:ext cx="5112327" cy="3408218"/>
+                      <a:ext cx="3300152" cy="2119745"/>
                     </a:xfrm>
                     <a:prstGeom prst="rect"/>
                   </pic:spPr>
@@ -15723,7 +15833,7 @@
           <w:color w:val="64748B"/>
           <w:sz w:val="17"/>
         </w:rPr>
-        <w:t>Figure 15 — Delay reasons</w:t>
+        <w:t>Figure 17 — Delay reasons</w:t>
       </w:r>
     </w:p>
     <w:p>
@@ -16198,8 +16308,8 @@
       <w:r>
         <w:drawing>
           <wp:inline xmlns:a="http://schemas.openxmlformats.org/drawingml/2006/main" xmlns:pic="http://schemas.openxmlformats.org/drawingml/2006/picture">
-            <wp:extent cx="3433156" cy="2244436"/>
-            <wp:docPr id="16" name="Picture 16"/>
+            <wp:extent cx="3483032" cy="2377440"/>
+            <wp:docPr id="18" name="Picture 18"/>
             <wp:cNvGraphicFramePr>
               <a:graphicFrameLocks noChangeAspect="1"/>
             </wp:cNvGraphicFramePr>
@@ -16211,7 +16321,7 @@
                     <pic:cNvPicPr/>
                   </pic:nvPicPr>
                   <pic:blipFill>
-                    <a:blip r:embed="rId26"/>
+                    <a:blip r:embed="rId28"/>
                     <a:stretch>
                       <a:fillRect/>
                     </a:stretch>
@@ -16219,7 +16329,7 @@
                   <pic:spPr>
                     <a:xfrm>
                       <a:off x="0" y="0"/>
-                      <a:ext cx="3433156" cy="2244436"/>
+                      <a:ext cx="3483032" cy="2377440"/>
                     </a:xfrm>
                     <a:prstGeom prst="rect"/>
                   </pic:spPr>
@@ -16242,7 +16352,7 @@
           <w:color w:val="64748B"/>
           <w:sz w:val="17"/>
         </w:rPr>
-        <w:t>Figure 16 — X-ray and repair tracking</w:t>
+        <w:t>Figure 18 — X-ray and repair tracking</w:t>
       </w:r>
     </w:p>
     <w:p>
@@ -16738,8 +16848,8 @@
       <w:r>
         <w:drawing>
           <wp:inline xmlns:a="http://schemas.openxmlformats.org/drawingml/2006/main" xmlns:pic="http://schemas.openxmlformats.org/drawingml/2006/picture">
-            <wp:extent cx="5940000" cy="1447742"/>
-            <wp:docPr id="17" name="Picture 17"/>
+            <wp:extent cx="5940000" cy="1435714"/>
+            <wp:docPr id="19" name="Picture 19"/>
             <wp:cNvGraphicFramePr>
               <a:graphicFrameLocks noChangeAspect="1"/>
             </wp:cNvGraphicFramePr>
@@ -16751,7 +16861,7 @@
                     <pic:cNvPicPr/>
                   </pic:nvPicPr>
                   <pic:blipFill>
-                    <a:blip r:embed="rId27"/>
+                    <a:blip r:embed="rId29"/>
                     <a:stretch>
                       <a:fillRect/>
                     </a:stretch>
@@ -16759,7 +16869,7 @@
                   <pic:spPr>
                     <a:xfrm>
                       <a:off x="0" y="0"/>
-                      <a:ext cx="5940000" cy="1447742"/>
+                      <a:ext cx="5940000" cy="1435714"/>
                     </a:xfrm>
                     <a:prstGeom prst="rect"/>
                   </pic:spPr>
@@ -16782,7 +16892,7 @@
           <w:color w:val="64748B"/>
           <w:sz w:val="17"/>
         </w:rPr>
-        <w:t>Figure 17 — Uploading a plan file</w:t>
+        <w:t>Figure 19 — Uploading a plan file</w:t>
       </w:r>
     </w:p>
     <w:p>
@@ -17287,8 +17397,8 @@
       <w:r>
         <w:drawing>
           <wp:inline xmlns:a="http://schemas.openxmlformats.org/drawingml/2006/main" xmlns:pic="http://schemas.openxmlformats.org/drawingml/2006/picture">
-            <wp:extent cx="5940000" cy="2789032"/>
-            <wp:docPr id="18" name="Picture 18"/>
+            <wp:extent cx="5940000" cy="2727116"/>
+            <wp:docPr id="20" name="Picture 20"/>
             <wp:cNvGraphicFramePr>
               <a:graphicFrameLocks noChangeAspect="1"/>
             </wp:cNvGraphicFramePr>
@@ -17300,7 +17410,7 @@
                     <pic:cNvPicPr/>
                   </pic:nvPicPr>
                   <pic:blipFill>
-                    <a:blip r:embed="rId28"/>
+                    <a:blip r:embed="rId30"/>
                     <a:stretch>
                       <a:fillRect/>
                     </a:stretch>
@@ -17308,7 +17418,7 @@
                   <pic:spPr>
                     <a:xfrm>
                       <a:off x="0" y="0"/>
-                      <a:ext cx="5940000" cy="2789032"/>
+                      <a:ext cx="5940000" cy="2727116"/>
                     </a:xfrm>
                     <a:prstGeom prst="rect"/>
                   </pic:spPr>
@@ -17331,7 +17441,7 @@
           <w:color w:val="64748B"/>
           <w:sz w:val="17"/>
         </w:rPr>
-        <w:t>Figure 18 — The Production Issues list</w:t>
+        <w:t>Figure 20 — The Production Issues list</w:t>
       </w:r>
     </w:p>
     <w:p>
@@ -17710,8 +17820,8 @@
       <w:r>
         <w:drawing>
           <wp:inline xmlns:a="http://schemas.openxmlformats.org/drawingml/2006/main" xmlns:pic="http://schemas.openxmlformats.org/drawingml/2006/picture">
-            <wp:extent cx="4538749" cy="5503025"/>
-            <wp:docPr id="19" name="Picture 19"/>
+            <wp:extent cx="4505498" cy="5453149"/>
+            <wp:docPr id="21" name="Picture 21"/>
             <wp:cNvGraphicFramePr>
               <a:graphicFrameLocks noChangeAspect="1"/>
             </wp:cNvGraphicFramePr>
@@ -17723,7 +17833,7 @@
                     <pic:cNvPicPr/>
                   </pic:nvPicPr>
                   <pic:blipFill>
-                    <a:blip r:embed="rId29"/>
+                    <a:blip r:embed="rId31"/>
                     <a:stretch>
                       <a:fillRect/>
                     </a:stretch>
@@ -17731,7 +17841,7 @@
                   <pic:spPr>
                     <a:xfrm>
                       <a:off x="0" y="0"/>
-                      <a:ext cx="4538749" cy="5503025"/>
+                      <a:ext cx="4505498" cy="5453149"/>
                     </a:xfrm>
                     <a:prstGeom prst="rect"/>
                   </pic:spPr>
@@ -17754,7 +17864,7 @@
           <w:color w:val="64748B"/>
           <w:sz w:val="17"/>
         </w:rPr>
-        <w:t>Figure 19 — Reporting an issue</w:t>
+        <w:t>Figure 21 — Reporting an issue</w:t>
       </w:r>
     </w:p>
     <w:p>
@@ -18341,8 +18451,8 @@
       <w:r>
         <w:drawing>
           <wp:inline xmlns:a="http://schemas.openxmlformats.org/drawingml/2006/main" xmlns:pic="http://schemas.openxmlformats.org/drawingml/2006/picture">
-            <wp:extent cx="5940000" cy="4443606"/>
-            <wp:docPr id="20" name="Picture 20"/>
+            <wp:extent cx="5940000" cy="5191774"/>
+            <wp:docPr id="22" name="Picture 22"/>
             <wp:cNvGraphicFramePr>
               <a:graphicFrameLocks noChangeAspect="1"/>
             </wp:cNvGraphicFramePr>
@@ -18354,7 +18464,7 @@
                     <pic:cNvPicPr/>
                   </pic:nvPicPr>
                   <pic:blipFill>
-                    <a:blip r:embed="rId30"/>
+                    <a:blip r:embed="rId32"/>
                     <a:stretch>
                       <a:fillRect/>
                     </a:stretch>
@@ -18362,7 +18472,7 @@
                   <pic:spPr>
                     <a:xfrm>
                       <a:off x="0" y="0"/>
-                      <a:ext cx="5940000" cy="4443606"/>
+                      <a:ext cx="5940000" cy="5191774"/>
                     </a:xfrm>
                     <a:prstGeom prst="rect"/>
                   </pic:spPr>
@@ -18385,7 +18495,7 @@
           <w:color w:val="64748B"/>
           <w:sz w:val="17"/>
         </w:rPr>
-        <w:t>Figure 20 — Viewing and updating an issue</w:t>
+        <w:t>Figure 22 — Viewing and updating an issue</w:t>
       </w:r>
     </w:p>
     <w:p>
@@ -18848,8 +18958,8 @@
       <w:r>
         <w:drawing>
           <wp:inline xmlns:a="http://schemas.openxmlformats.org/drawingml/2006/main" xmlns:pic="http://schemas.openxmlformats.org/drawingml/2006/picture">
-            <wp:extent cx="3433156" cy="2128058"/>
-            <wp:docPr id="21" name="Picture 21"/>
+            <wp:extent cx="3399905" cy="2144683"/>
+            <wp:docPr id="23" name="Picture 23"/>
             <wp:cNvGraphicFramePr>
               <a:graphicFrameLocks noChangeAspect="1"/>
             </wp:cNvGraphicFramePr>
@@ -18861,7 +18971,7 @@
                     <pic:cNvPicPr/>
                   </pic:nvPicPr>
                   <pic:blipFill>
-                    <a:blip r:embed="rId31"/>
+                    <a:blip r:embed="rId33"/>
                     <a:stretch>
                       <a:fillRect/>
                     </a:stretch>
@@ -18869,7 +18979,7 @@
                   <pic:spPr>
                     <a:xfrm>
                       <a:off x="0" y="0"/>
-                      <a:ext cx="3433156" cy="2128058"/>
+                      <a:ext cx="3399905" cy="2144683"/>
                     </a:xfrm>
                     <a:prstGeom prst="rect"/>
                   </pic:spPr>
@@ -18892,7 +19002,7 @@
           <w:color w:val="64748B"/>
           <w:sz w:val="17"/>
         </w:rPr>
-        <w:t>Figure 21 — Issue drafts</w:t>
+        <w:t>Figure 23 — Issue drafts</w:t>
       </w:r>
     </w:p>
     <w:p>
@@ -19171,8 +19281,8 @@
       <w:r>
         <w:drawing>
           <wp:inline xmlns:a="http://schemas.openxmlformats.org/drawingml/2006/main" xmlns:pic="http://schemas.openxmlformats.org/drawingml/2006/picture">
-            <wp:extent cx="5940000" cy="4749507"/>
-            <wp:docPr id="22" name="Picture 22"/>
+            <wp:extent cx="5940000" cy="4746977"/>
+            <wp:docPr id="24" name="Picture 24"/>
             <wp:cNvGraphicFramePr>
               <a:graphicFrameLocks noChangeAspect="1"/>
             </wp:cNvGraphicFramePr>
@@ -19184,7 +19294,7 @@
                     <pic:cNvPicPr/>
                   </pic:nvPicPr>
                   <pic:blipFill>
-                    <a:blip r:embed="rId32"/>
+                    <a:blip r:embed="rId34"/>
                     <a:stretch>
                       <a:fillRect/>
                     </a:stretch>
@@ -19192,7 +19302,7 @@
                   <pic:spPr>
                     <a:xfrm>
                       <a:off x="0" y="0"/>
-                      <a:ext cx="5940000" cy="4749507"/>
+                      <a:ext cx="5940000" cy="4746977"/>
                     </a:xfrm>
                     <a:prstGeom prst="rect"/>
                   </pic:spPr>
@@ -19215,7 +19325,7 @@
           <w:color w:val="64748B"/>
           <w:sz w:val="17"/>
         </w:rPr>
-        <w:t>Figure 22 — Generating an issues report</w:t>
+        <w:t>Figure 24 — Generating an issues report</w:t>
       </w:r>
     </w:p>
     <w:p>
@@ -19753,8 +19863,8 @@
       <w:r>
         <w:drawing>
           <wp:inline xmlns:a="http://schemas.openxmlformats.org/drawingml/2006/main" xmlns:pic="http://schemas.openxmlformats.org/drawingml/2006/picture">
-            <wp:extent cx="5536276" cy="5503025"/>
-            <wp:docPr id="23" name="Picture 23"/>
+            <wp:extent cx="5486400" cy="5469775"/>
+            <wp:docPr id="25" name="Picture 25"/>
             <wp:cNvGraphicFramePr>
               <a:graphicFrameLocks noChangeAspect="1"/>
             </wp:cNvGraphicFramePr>
@@ -19766,7 +19876,7 @@
                     <pic:cNvPicPr/>
                   </pic:nvPicPr>
                   <pic:blipFill>
-                    <a:blip r:embed="rId33"/>
+                    <a:blip r:embed="rId35"/>
                     <a:stretch>
                       <a:fillRect/>
                     </a:stretch>
@@ -19774,7 +19884,7 @@
                   <pic:spPr>
                     <a:xfrm>
                       <a:off x="0" y="0"/>
-                      <a:ext cx="5536276" cy="5503025"/>
+                      <a:ext cx="5486400" cy="5469775"/>
                     </a:xfrm>
                     <a:prstGeom prst="rect"/>
                   </pic:spPr>
@@ -19797,7 +19907,7 @@
           <w:color w:val="64748B"/>
           <w:sz w:val="17"/>
         </w:rPr>
-        <w:t>Figure 23 — Export Report (plan data)</w:t>
+        <w:t>Figure 25 — Export Report (plan data)</w:t>
       </w:r>
     </w:p>
     <w:p>
@@ -20205,8 +20315,8 @@
       <w:r>
         <w:drawing>
           <wp:inline xmlns:a="http://schemas.openxmlformats.org/drawingml/2006/main" xmlns:pic="http://schemas.openxmlformats.org/drawingml/2006/picture">
-            <wp:extent cx="5536276" cy="2743199"/>
-            <wp:docPr id="24" name="Picture 24"/>
+            <wp:extent cx="5486400" cy="2709949"/>
+            <wp:docPr id="26" name="Picture 26"/>
             <wp:cNvGraphicFramePr>
               <a:graphicFrameLocks noChangeAspect="1"/>
             </wp:cNvGraphicFramePr>
@@ -20218,7 +20328,7 @@
                     <pic:cNvPicPr/>
                   </pic:nvPicPr>
                   <pic:blipFill>
-                    <a:blip r:embed="rId34"/>
+                    <a:blip r:embed="rId36"/>
                     <a:stretch>
                       <a:fillRect/>
                     </a:stretch>
@@ -20226,7 +20336,7 @@
                   <pic:spPr>
                     <a:xfrm>
                       <a:off x="0" y="0"/>
-                      <a:ext cx="5536276" cy="2743199"/>
+                      <a:ext cx="5486400" cy="2709949"/>
                     </a:xfrm>
                     <a:prstGeom prst="rect"/>
                   </pic:spPr>
@@ -20249,7 +20359,7 @@
           <w:color w:val="64748B"/>
           <w:sz w:val="17"/>
         </w:rPr>
-        <w:t>Figure 24 — VPX Station Report</w:t>
+        <w:t>Figure 26 — VPX Station Report</w:t>
       </w:r>
     </w:p>
     <w:p>
@@ -20596,7 +20706,7 @@
         <w:drawing>
           <wp:inline xmlns:a="http://schemas.openxmlformats.org/drawingml/2006/main" xmlns:pic="http://schemas.openxmlformats.org/drawingml/2006/picture">
             <wp:extent cx="4488872" cy="4530436"/>
-            <wp:docPr id="25" name="Picture 25"/>
+            <wp:docPr id="27" name="Picture 27"/>
             <wp:cNvGraphicFramePr>
               <a:graphicFrameLocks noChangeAspect="1"/>
             </wp:cNvGraphicFramePr>
@@ -20608,7 +20718,7 @@
                     <pic:cNvPicPr/>
                   </pic:nvPicPr>
                   <pic:blipFill>
-                    <a:blip r:embed="rId35"/>
+                    <a:blip r:embed="rId37"/>
                     <a:stretch>
                       <a:fillRect/>
                     </a:stretch>
@@ -20639,7 +20749,7 @@
           <w:color w:val="64748B"/>
           <w:sz w:val="17"/>
         </w:rPr>
-        <w:t>Figure 25 — Executive Report</w:t>
+        <w:t>Figure 27 — Executive Report</w:t>
       </w:r>
     </w:p>
     <w:p>
@@ -21207,7 +21317,7 @@
         <w:drawing>
           <wp:inline xmlns:a="http://schemas.openxmlformats.org/drawingml/2006/main" xmlns:pic="http://schemas.openxmlformats.org/drawingml/2006/picture">
             <wp:extent cx="5940000" cy="4168821"/>
-            <wp:docPr id="26" name="Picture 26"/>
+            <wp:docPr id="28" name="Picture 28"/>
             <wp:cNvGraphicFramePr>
               <a:graphicFrameLocks noChangeAspect="1"/>
             </wp:cNvGraphicFramePr>
@@ -21219,7 +21329,7 @@
                     <pic:cNvPicPr/>
                   </pic:nvPicPr>
                   <pic:blipFill>
-                    <a:blip r:embed="rId36"/>
+                    <a:blip r:embed="rId38"/>
                     <a:stretch>
                       <a:fillRect/>
                     </a:stretch>
@@ -21250,7 +21360,7 @@
           <w:color w:val="64748B"/>
           <w:sz w:val="17"/>
         </w:rPr>
-        <w:t>Figure 26 — Adding work to the plan</w:t>
+        <w:t>Figure 28 — Adding work to the plan</w:t>
       </w:r>
     </w:p>
     <w:p>
@@ -21720,8 +21830,8 @@
       <w:r>
         <w:drawing>
           <wp:inline xmlns:a="http://schemas.openxmlformats.org/drawingml/2006/main" xmlns:pic="http://schemas.openxmlformats.org/drawingml/2006/picture">
-            <wp:extent cx="5940000" cy="3792420"/>
-            <wp:docPr id="27" name="Picture 27"/>
+            <wp:extent cx="5940000" cy="3796984"/>
+            <wp:docPr id="29" name="Picture 29"/>
             <wp:cNvGraphicFramePr>
               <a:graphicFrameLocks noChangeAspect="1"/>
             </wp:cNvGraphicFramePr>
@@ -21733,7 +21843,7 @@
                     <pic:cNvPicPr/>
                   </pic:nvPicPr>
                   <pic:blipFill>
-                    <a:blip r:embed="rId37"/>
+                    <a:blip r:embed="rId39"/>
                     <a:stretch>
                       <a:fillRect/>
                     </a:stretch>
@@ -21741,7 +21851,7 @@
                   <pic:spPr>
                     <a:xfrm>
                       <a:off x="0" y="0"/>
-                      <a:ext cx="5940000" cy="3792420"/>
+                      <a:ext cx="5940000" cy="3796984"/>
                     </a:xfrm>
                     <a:prstGeom prst="rect"/>
                   </pic:spPr>
@@ -21764,7 +21874,7 @@
           <w:color w:val="64748B"/>
           <w:sz w:val="17"/>
         </w:rPr>
-        <w:t>Figure 27 — Manage Processes and routes</w:t>
+        <w:t>Figure 29 — Manage Processes and routes</w:t>
       </w:r>
     </w:p>
     <w:p>
@@ -22160,8 +22270,8 @@
       <w:r>
         <w:drawing>
           <wp:inline xmlns:a="http://schemas.openxmlformats.org/drawingml/2006/main" xmlns:pic="http://schemas.openxmlformats.org/drawingml/2006/picture">
-            <wp:extent cx="5940000" cy="2295124"/>
-            <wp:docPr id="28" name="Picture 28"/>
+            <wp:extent cx="5940000" cy="4978696"/>
+            <wp:docPr id="30" name="Picture 30"/>
             <wp:cNvGraphicFramePr>
               <a:graphicFrameLocks noChangeAspect="1"/>
             </wp:cNvGraphicFramePr>
@@ -22173,7 +22283,7 @@
                     <pic:cNvPicPr/>
                   </pic:nvPicPr>
                   <pic:blipFill>
-                    <a:blip r:embed="rId38"/>
+                    <a:blip r:embed="rId40"/>
                     <a:stretch>
                       <a:fillRect/>
                     </a:stretch>
@@ -22181,7 +22291,7 @@
                   <pic:spPr>
                     <a:xfrm>
                       <a:off x="0" y="0"/>
-                      <a:ext cx="5940000" cy="2295124"/>
+                      <a:ext cx="5940000" cy="4978696"/>
                     </a:xfrm>
                     <a:prstGeom prst="rect"/>
                   </pic:spPr>
@@ -22204,7 +22314,7 @@
           <w:color w:val="64748B"/>
           <w:sz w:val="17"/>
         </w:rPr>
-        <w:t>Figure 28 — Lead times</w:t>
+        <w:t>Figure 30 — Lead times</w:t>
       </w:r>
     </w:p>
     <w:p>
@@ -22600,8 +22710,8 @@
       <w:r>
         <w:drawing>
           <wp:inline xmlns:a="http://schemas.openxmlformats.org/drawingml/2006/main" xmlns:pic="http://schemas.openxmlformats.org/drawingml/2006/picture">
-            <wp:extent cx="4538749" cy="3674225"/>
-            <wp:docPr id="29" name="Picture 29"/>
+            <wp:extent cx="4505498" cy="3765665"/>
+            <wp:docPr id="31" name="Picture 31"/>
             <wp:cNvGraphicFramePr>
               <a:graphicFrameLocks noChangeAspect="1"/>
             </wp:cNvGraphicFramePr>
@@ -22613,7 +22723,7 @@
                     <pic:cNvPicPr/>
                   </pic:nvPicPr>
                   <pic:blipFill>
-                    <a:blip r:embed="rId39"/>
+                    <a:blip r:embed="rId41"/>
                     <a:stretch>
                       <a:fillRect/>
                     </a:stretch>
@@ -22621,7 +22731,7 @@
                   <pic:spPr>
                     <a:xfrm>
                       <a:off x="0" y="0"/>
-                      <a:ext cx="4538749" cy="3674225"/>
+                      <a:ext cx="4505498" cy="3765665"/>
                     </a:xfrm>
                     <a:prstGeom prst="rect"/>
                   </pic:spPr>
@@ -22644,7 +22754,7 @@
           <w:color w:val="64748B"/>
           <w:sz w:val="17"/>
         </w:rPr>
-        <w:t>Figure 29 — No-work days</w:t>
+        <w:t>Figure 31 — No-work days</w:t>
       </w:r>
     </w:p>
     <w:p>
@@ -23040,8 +23150,8 @@
       <w:r>
         <w:drawing>
           <wp:inline xmlns:a="http://schemas.openxmlformats.org/drawingml/2006/main" xmlns:pic="http://schemas.openxmlformats.org/drawingml/2006/picture">
-            <wp:extent cx="5940000" cy="2387647"/>
-            <wp:docPr id="30" name="Picture 30"/>
+            <wp:extent cx="5940000" cy="2631316"/>
+            <wp:docPr id="32" name="Picture 32"/>
             <wp:cNvGraphicFramePr>
               <a:graphicFrameLocks noChangeAspect="1"/>
             </wp:cNvGraphicFramePr>
@@ -23053,7 +23163,7 @@
                     <pic:cNvPicPr/>
                   </pic:nvPicPr>
                   <pic:blipFill>
-                    <a:blip r:embed="rId40"/>
+                    <a:blip r:embed="rId42"/>
                     <a:stretch>
                       <a:fillRect/>
                     </a:stretch>
@@ -23061,7 +23171,7 @@
                   <pic:spPr>
                     <a:xfrm>
                       <a:off x="0" y="0"/>
-                      <a:ext cx="5940000" cy="2387647"/>
+                      <a:ext cx="5940000" cy="2631316"/>
                     </a:xfrm>
                     <a:prstGeom prst="rect"/>
                   </pic:spPr>
@@ -23084,7 +23194,7 @@
           <w:color w:val="64748B"/>
           <w:sz w:val="17"/>
         </w:rPr>
-        <w:t>Figure 30 — Plan versions</w:t>
+        <w:t>Figure 32 — Plan versions</w:t>
       </w:r>
     </w:p>
     <w:p>
@@ -23664,8 +23774,8 @@
       <w:r>
         <w:drawing>
           <wp:inline xmlns:a="http://schemas.openxmlformats.org/drawingml/2006/main" xmlns:pic="http://schemas.openxmlformats.org/drawingml/2006/picture">
-            <wp:extent cx="5940000" cy="3584706"/>
-            <wp:docPr id="31" name="Picture 31"/>
+            <wp:extent cx="5940000" cy="3588750"/>
+            <wp:docPr id="33" name="Picture 33"/>
             <wp:cNvGraphicFramePr>
               <a:graphicFrameLocks noChangeAspect="1"/>
             </wp:cNvGraphicFramePr>
@@ -23677,7 +23787,7 @@
                     <pic:cNvPicPr/>
                   </pic:nvPicPr>
                   <pic:blipFill>
-                    <a:blip r:embed="rId41"/>
+                    <a:blip r:embed="rId43"/>
                     <a:stretch>
                       <a:fillRect/>
                     </a:stretch>
@@ -23685,7 +23795,7 @@
                   <pic:spPr>
                     <a:xfrm>
                       <a:off x="0" y="0"/>
-                      <a:ext cx="5940000" cy="3584706"/>
+                      <a:ext cx="5940000" cy="3588750"/>
                     </a:xfrm>
                     <a:prstGeom prst="rect"/>
                   </pic:spPr>
@@ -23708,7 +23818,7 @@
           <w:color w:val="64748B"/>
           <w:sz w:val="17"/>
         </w:rPr>
-        <w:t>Figure 31 — Unit Codes</w:t>
+        <w:t>Figure 33 — Unit Codes</w:t>
       </w:r>
     </w:p>
     <w:p>
@@ -24096,8 +24206,8 @@
       <w:r>
         <w:drawing>
           <wp:inline xmlns:a="http://schemas.openxmlformats.org/drawingml/2006/main" xmlns:pic="http://schemas.openxmlformats.org/drawingml/2006/picture">
-            <wp:extent cx="5940000" cy="1681935"/>
-            <wp:docPr id="32" name="Picture 32"/>
+            <wp:extent cx="5940000" cy="1678881"/>
+            <wp:docPr id="34" name="Picture 34"/>
             <wp:cNvGraphicFramePr>
               <a:graphicFrameLocks noChangeAspect="1"/>
             </wp:cNvGraphicFramePr>
@@ -24109,7 +24219,7 @@
                     <pic:cNvPicPr/>
                   </pic:nvPicPr>
                   <pic:blipFill>
-                    <a:blip r:embed="rId42"/>
+                    <a:blip r:embed="rId44"/>
                     <a:stretch>
                       <a:fillRect/>
                     </a:stretch>
@@ -24117,7 +24227,7 @@
                   <pic:spPr>
                     <a:xfrm>
                       <a:off x="0" y="0"/>
-                      <a:ext cx="5940000" cy="1681935"/>
+                      <a:ext cx="5940000" cy="1678881"/>
                     </a:xfrm>
                     <a:prstGeom prst="rect"/>
                   </pic:spPr>
@@ -24140,7 +24250,7 @@
           <w:color w:val="64748B"/>
           <w:sz w:val="17"/>
         </w:rPr>
-        <w:t>Figure 32 — Working in F100-KD2</w:t>
+        <w:t>Figure 34 — Working in F100-KD2</w:t>
       </w:r>
     </w:p>
     <w:p>
@@ -24541,7 +24651,7 @@
         <w:drawing>
           <wp:inline xmlns:a="http://schemas.openxmlformats.org/drawingml/2006/main" xmlns:pic="http://schemas.openxmlformats.org/drawingml/2006/picture">
             <wp:extent cx="5940000" cy="4491220"/>
-            <wp:docPr id="33" name="Picture 33"/>
+            <wp:docPr id="35" name="Picture 35"/>
             <wp:cNvGraphicFramePr>
               <a:graphicFrameLocks noChangeAspect="1"/>
             </wp:cNvGraphicFramePr>
@@ -24553,7 +24663,7 @@
                     <pic:cNvPicPr/>
                   </pic:nvPicPr>
                   <pic:blipFill>
-                    <a:blip r:embed="rId43"/>
+                    <a:blip r:embed="rId45"/>
                     <a:stretch>
                       <a:fillRect/>
                     </a:stretch>
@@ -24584,7 +24694,7 @@
           <w:color w:val="64748B"/>
           <w:sz w:val="17"/>
         </w:rPr>
-        <w:t>Figure 33 — User Management</w:t>
+        <w:t>Figure 35 — User Management</w:t>
       </w:r>
     </w:p>
     <w:p>
@@ -25222,7 +25332,7 @@
         <w:drawing>
           <wp:inline xmlns:a="http://schemas.openxmlformats.org/drawingml/2006/main" xmlns:pic="http://schemas.openxmlformats.org/drawingml/2006/picture">
             <wp:extent cx="5940000" cy="4060614"/>
-            <wp:docPr id="34" name="Picture 34"/>
+            <wp:docPr id="36" name="Picture 36"/>
             <wp:cNvGraphicFramePr>
               <a:graphicFrameLocks noChangeAspect="1"/>
             </wp:cNvGraphicFramePr>
@@ -25234,7 +25344,7 @@
                     <pic:cNvPicPr/>
                   </pic:nvPicPr>
                   <pic:blipFill>
-                    <a:blip r:embed="rId44"/>
+                    <a:blip r:embed="rId46"/>
                     <a:stretch>
                       <a:fillRect/>
                     </a:stretch>
@@ -25265,7 +25375,7 @@
           <w:color w:val="64748B"/>
           <w:sz w:val="17"/>
         </w:rPr>
-        <w:t>Figure 34 — Audit Log</w:t>
+        <w:t>Figure 36 — Audit Log</w:t>
       </w:r>
     </w:p>
     <w:p>
@@ -25824,7 +25934,7 @@
         <w:drawing>
           <wp:inline xmlns:a="http://schemas.openxmlformats.org/drawingml/2006/main" xmlns:pic="http://schemas.openxmlformats.org/drawingml/2006/picture">
             <wp:extent cx="2801389" cy="1870364"/>
-            <wp:docPr id="35" name="Picture 35"/>
+            <wp:docPr id="37" name="Picture 37"/>
             <wp:cNvGraphicFramePr>
               <a:graphicFrameLocks noChangeAspect="1"/>
             </wp:cNvGraphicFramePr>
@@ -25836,7 +25946,7 @@
                     <pic:cNvPicPr/>
                   </pic:nvPicPr>
                   <pic:blipFill>
-                    <a:blip r:embed="rId45"/>
+                    <a:blip r:embed="rId47"/>
                     <a:stretch>
                       <a:fillRect/>
                     </a:stretch>
@@ -25867,7 +25977,7 @@
           <w:color w:val="64748B"/>
           <w:sz w:val="17"/>
         </w:rPr>
-        <w:t>Figure 35 — Active Users</w:t>
+        <w:t>Figure 37 — Active Users</w:t>
       </w:r>
     </w:p>
     <w:p>
@@ -26362,6 +26472,61 @@
     <w:p>
       <w:pPr>
         <w:keepNext/>
+        <w:jc w:val="center"/>
+      </w:pPr>
+      <w:r>
+        <w:drawing>
+          <wp:inline xmlns:a="http://schemas.openxmlformats.org/drawingml/2006/main" xmlns:pic="http://schemas.openxmlformats.org/drawingml/2006/picture">
+            <wp:extent cx="2660072" cy="2128058"/>
+            <wp:docPr id="38" name="Picture 38"/>
+            <wp:cNvGraphicFramePr>
+              <a:graphicFrameLocks noChangeAspect="1"/>
+            </wp:cNvGraphicFramePr>
+            <a:graphic>
+              <a:graphicData uri="http://schemas.openxmlformats.org/drawingml/2006/picture">
+                <pic:pic>
+                  <pic:nvPicPr>
+                    <pic:cNvPr id="0" name="version-updates.jpg"/>
+                    <pic:cNvPicPr/>
+                  </pic:nvPicPr>
+                  <pic:blipFill>
+                    <a:blip r:embed="rId48"/>
+                    <a:stretch>
+                      <a:fillRect/>
+                    </a:stretch>
+                  </pic:blipFill>
+                  <pic:spPr>
+                    <a:xfrm>
+                      <a:off x="0" y="0"/>
+                      <a:ext cx="2660072" cy="2128058"/>
+                    </a:xfrm>
+                    <a:prstGeom prst="rect"/>
+                  </pic:spPr>
+                </pic:pic>
+              </a:graphicData>
+            </a:graphic>
+          </wp:inline>
+        </w:drawing>
+      </w:r>
+    </w:p>
+    <w:p>
+      <w:pPr>
+        <w:spacing w:after="160"/>
+        <w:jc w:val="center"/>
+      </w:pPr>
+      <w:r>
+        <w:rPr>
+          <w:b w:val="0"/>
+          <w:i/>
+          <w:color w:val="64748B"/>
+          <w:sz w:val="17"/>
+        </w:rPr>
+        <w:t>Figure 38 — Keeping PPMS up to date</w:t>
+      </w:r>
+    </w:p>
+    <w:p>
+      <w:pPr>
+        <w:keepNext/>
         <w:spacing w:after="60" w:before="80"/>
       </w:pPr>
       <w:r>
@@ -26810,8 +26975,8 @@
       <w:r>
         <w:drawing>
           <wp:inline xmlns:a="http://schemas.openxmlformats.org/drawingml/2006/main" xmlns:pic="http://schemas.openxmlformats.org/drawingml/2006/picture">
-            <wp:extent cx="5940000" cy="1995231"/>
-            <wp:docPr id="36" name="Picture 36"/>
+            <wp:extent cx="5594465" cy="2236123"/>
+            <wp:docPr id="39" name="Picture 39"/>
             <wp:cNvGraphicFramePr>
               <a:graphicFrameLocks noChangeAspect="1"/>
             </wp:cNvGraphicFramePr>
@@ -26823,7 +26988,7 @@
                     <pic:cNvPicPr/>
                   </pic:nvPicPr>
                   <pic:blipFill>
-                    <a:blip r:embed="rId46"/>
+                    <a:blip r:embed="rId49"/>
                     <a:stretch>
                       <a:fillRect/>
                     </a:stretch>
@@ -26831,7 +26996,7 @@
                   <pic:spPr>
                     <a:xfrm>
                       <a:off x="0" y="0"/>
-                      <a:ext cx="5940000" cy="1995231"/>
+                      <a:ext cx="5594465" cy="2236123"/>
                     </a:xfrm>
                     <a:prstGeom prst="rect"/>
                   </pic:spPr>
@@ -26854,7 +27019,7 @@
           <w:color w:val="64748B"/>
           <w:sz w:val="17"/>
         </w:rPr>
-        <w:t>Figure 36 — Colour themes</w:t>
+        <w:t>Figure 39 — Colour themes</w:t>
       </w:r>
     </w:p>
     <w:p>
@@ -27113,7 +27278,7 @@
         <w:drawing>
           <wp:inline xmlns:a="http://schemas.openxmlformats.org/drawingml/2006/main" xmlns:pic="http://schemas.openxmlformats.org/drawingml/2006/picture">
             <wp:extent cx="5311832" cy="1396538"/>
-            <wp:docPr id="37" name="Picture 37"/>
+            <wp:docPr id="40" name="Picture 40"/>
             <wp:cNvGraphicFramePr>
               <a:graphicFrameLocks noChangeAspect="1"/>
             </wp:cNvGraphicFramePr>
@@ -27125,7 +27290,7 @@
                     <pic:cNvPicPr/>
                   </pic:nvPicPr>
                   <pic:blipFill>
-                    <a:blip r:embed="rId47"/>
+                    <a:blip r:embed="rId50"/>
                     <a:stretch>
                       <a:fillRect/>
                     </a:stretch>
@@ -27156,7 +27321,7 @@
           <w:color w:val="64748B"/>
           <w:sz w:val="17"/>
         </w:rPr>
-        <w:t>Figure 37 — Language — English, Korean, Arabic</w:t>
+        <w:t>Figure 40 — Language — English, Korean, Arabic</w:t>
       </w:r>
     </w:p>
     <w:p>
@@ -27526,8 +27691,8 @@
       <w:r>
         <w:drawing>
           <wp:inline xmlns:a="http://schemas.openxmlformats.org/drawingml/2006/main" xmlns:pic="http://schemas.openxmlformats.org/drawingml/2006/picture">
-            <wp:extent cx="3325090" cy="1080654"/>
-            <wp:docPr id="38" name="Picture 38"/>
+            <wp:extent cx="4197927" cy="1122218"/>
+            <wp:docPr id="41" name="Picture 41"/>
             <wp:cNvGraphicFramePr>
               <a:graphicFrameLocks noChangeAspect="1"/>
             </wp:cNvGraphicFramePr>
@@ -27539,7 +27704,7 @@
                     <pic:cNvPicPr/>
                   </pic:nvPicPr>
                   <pic:blipFill>
-                    <a:blip r:embed="rId48"/>
+                    <a:blip r:embed="rId51"/>
                     <a:stretch>
                       <a:fillRect/>
                     </a:stretch>
@@ -27547,7 +27712,7 @@
                   <pic:spPr>
                     <a:xfrm>
                       <a:off x="0" y="0"/>
-                      <a:ext cx="3325090" cy="1080654"/>
+                      <a:ext cx="4197927" cy="1122218"/>
                     </a:xfrm>
                     <a:prstGeom prst="rect"/>
                   </pic:spPr>
@@ -27570,7 +27735,7 @@
           <w:color w:val="64748B"/>
           <w:sz w:val="17"/>
         </w:rPr>
-        <w:t>Figure 38 — Notifications</w:t>
+        <w:t>Figure 41 — Notifications</w:t>
       </w:r>
     </w:p>
     <w:p>
@@ -27849,8 +28014,8 @@
       <w:r>
         <w:drawing>
           <wp:inline xmlns:a="http://schemas.openxmlformats.org/drawingml/2006/main" xmlns:pic="http://schemas.openxmlformats.org/drawingml/2006/picture">
-            <wp:extent cx="2992581" cy="2660072"/>
-            <wp:docPr id="39" name="Picture 39"/>
+            <wp:extent cx="2834640" cy="2552007"/>
+            <wp:docPr id="42" name="Picture 42"/>
             <wp:cNvGraphicFramePr>
               <a:graphicFrameLocks noChangeAspect="1"/>
             </wp:cNvGraphicFramePr>
@@ -27862,7 +28027,7 @@
                     <pic:cNvPicPr/>
                   </pic:nvPicPr>
                   <pic:blipFill>
-                    <a:blip r:embed="rId49"/>
+                    <a:blip r:embed="rId52"/>
                     <a:stretch>
                       <a:fillRect/>
                     </a:stretch>
@@ -27870,7 +28035,7 @@
                   <pic:spPr>
                     <a:xfrm>
                       <a:off x="0" y="0"/>
-                      <a:ext cx="2992581" cy="2660072"/>
+                      <a:ext cx="2834640" cy="2552007"/>
                     </a:xfrm>
                     <a:prstGeom prst="rect"/>
                   </pic:spPr>
@@ -27893,7 +28058,7 @@
           <w:color w:val="64748B"/>
           <w:sz w:val="17"/>
         </w:rPr>
-        <w:t>Figure 39 — Changing your password</w:t>
+        <w:t>Figure 42 — Changing your password</w:t>
       </w:r>
     </w:p>
     <w:p>
@@ -28218,8 +28383,8 @@
       <w:r>
         <w:drawing>
           <wp:inline xmlns:a="http://schemas.openxmlformats.org/drawingml/2006/main" xmlns:pic="http://schemas.openxmlformats.org/drawingml/2006/picture">
-            <wp:extent cx="5940000" cy="2954847"/>
-            <wp:docPr id="40" name="Picture 40"/>
+            <wp:extent cx="5940000" cy="4105102"/>
+            <wp:docPr id="43" name="Picture 43"/>
             <wp:cNvGraphicFramePr>
               <a:graphicFrameLocks noChangeAspect="1"/>
             </wp:cNvGraphicFramePr>
@@ -28231,7 +28396,7 @@
                     <pic:cNvPicPr/>
                   </pic:nvPicPr>
                   <pic:blipFill>
-                    <a:blip r:embed="rId50"/>
+                    <a:blip r:embed="rId53"/>
                     <a:stretch>
                       <a:fillRect/>
                     </a:stretch>
@@ -28239,7 +28404,7 @@
                   <pic:spPr>
                     <a:xfrm>
                       <a:off x="0" y="0"/>
-                      <a:ext cx="5940000" cy="2954847"/>
+                      <a:ext cx="5940000" cy="4105102"/>
                     </a:xfrm>
                     <a:prstGeom prst="rect"/>
                   </pic:spPr>
@@ -28262,7 +28427,7 @@
           <w:color w:val="64748B"/>
           <w:sz w:val="17"/>
         </w:rPr>
-        <w:t>Figure 40 — Help &amp; User Manual</w:t>
+        <w:t>Figure 43 — Help &amp; User Manual</w:t>
       </w:r>
     </w:p>
     <w:p>
@@ -28443,7 +28608,7 @@
               <w:rPr>
                 <w:sz w:val="20"/>
               </w:rPr>
-              <w:t>Tick "My role only" to hide topics your role cannot use.</w:t>
+              <w:t>Choose a role in "Topics for" (All roles, Viewer, Operator, Planner or Master Admin) to see only the topics that role can use — your own role is marked "(you)". The choice is remembered.</w:t>
             </w:r>
           </w:p>
         </w:tc>
@@ -28543,7 +28708,7 @@
               <w:rPr>
                 <w:sz w:val="20"/>
               </w:rPr>
-              <w:t>Press Word to download the manual as a Word document for printing or email.</w:t>
+              <w:t>Press Word to download the manual as a Word document for printing or email. It downloads the edition for the role chosen in "Topics for" — for example "Word · Operator" for an Operator's manual.</w:t>
             </w:r>
           </w:p>
         </w:tc>
@@ -28691,8 +28856,8 @@
       <w:r>
         <w:drawing>
           <wp:inline xmlns:a="http://schemas.openxmlformats.org/drawingml/2006/main" xmlns:pic="http://schemas.openxmlformats.org/drawingml/2006/picture">
-            <wp:extent cx="2992581" cy="4422370"/>
-            <wp:docPr id="41" name="Picture 41"/>
+            <wp:extent cx="3009207" cy="4871258"/>
+            <wp:docPr id="44" name="Picture 44"/>
             <wp:cNvGraphicFramePr>
               <a:graphicFrameLocks noChangeAspect="1"/>
             </wp:cNvGraphicFramePr>
@@ -28704,7 +28869,7 @@
                     <pic:cNvPicPr/>
                   </pic:nvPicPr>
                   <pic:blipFill>
-                    <a:blip r:embed="rId51"/>
+                    <a:blip r:embed="rId54"/>
                     <a:stretch>
                       <a:fillRect/>
                     </a:stretch>
@@ -28712,7 +28877,7 @@
                   <pic:spPr>
                     <a:xfrm>
                       <a:off x="0" y="0"/>
-                      <a:ext cx="2992581" cy="4422370"/>
+                      <a:ext cx="3009207" cy="4871258"/>
                     </a:xfrm>
                     <a:prstGeom prst="rect"/>
                   </pic:spPr>
@@ -28735,7 +28900,7 @@
           <w:color w:val="64748B"/>
           <w:sz w:val="17"/>
         </w:rPr>
-        <w:t>Figure 41 — The PPMS Assistant</w:t>
+        <w:t>Figure 44 — The PPMS Assistant</w:t>
       </w:r>
     </w:p>
     <w:p>

</xml_diff>

<commit_message>
Fix Gantt today scroll; translate Delivery Outlook
- Gantt: open centred on today again. On a Friday the today line has no day
  column (Fridays are not drawn), so the first render skipped the scroll and
  later renders restored the plan start. The scroll now uses the today
  line's column and waits until the chart is laid out.
- Delivery Outlook: Korean and Arabic for every label, line and category
  chips; "Delay breakdown" now opens the analysis for the battalion shown.
- Delivery Delay Analysis: cause bars no longer run past their cards when a
  unit is later than the delivery date.
- Manual: screenshots for Delivery Outlook and the Delay Analysis; Word
  editions rebuilt.

Co-Authored-By: Claude Opus 5.5 <noreply@anthropic.com>
</commit_message>
<xml_diff>
--- a/app-v2/assets/help/PPMS_User_Manual.docx
+++ b/app-v2/assets/help/PPMS_User_Manual.docx
@@ -9342,6 +9342,61 @@
     <w:p>
       <w:pPr>
         <w:keepNext/>
+        <w:jc w:val="center"/>
+      </w:pPr>
+      <w:r>
+        <w:drawing>
+          <wp:inline xmlns:a="http://schemas.openxmlformats.org/drawingml/2006/main" xmlns:pic="http://schemas.openxmlformats.org/drawingml/2006/picture">
+            <wp:extent cx="5940000" cy="2954286"/>
+            <wp:docPr id="8" name="Picture 8"/>
+            <wp:cNvGraphicFramePr>
+              <a:graphicFrameLocks noChangeAspect="1"/>
+            </wp:cNvGraphicFramePr>
+            <a:graphic>
+              <a:graphicData uri="http://schemas.openxmlformats.org/drawingml/2006/picture">
+                <pic:pic>
+                  <pic:nvPicPr>
+                    <pic:cNvPr id="0" name="delivery-outlook.jpg"/>
+                    <pic:cNvPicPr/>
+                  </pic:nvPicPr>
+                  <pic:blipFill>
+                    <a:blip r:embed="rId18"/>
+                    <a:stretch>
+                      <a:fillRect/>
+                    </a:stretch>
+                  </pic:blipFill>
+                  <pic:spPr>
+                    <a:xfrm>
+                      <a:off x="0" y="0"/>
+                      <a:ext cx="5940000" cy="2954286"/>
+                    </a:xfrm>
+                    <a:prstGeom prst="rect"/>
+                  </pic:spPr>
+                </pic:pic>
+              </a:graphicData>
+            </a:graphic>
+          </wp:inline>
+        </w:drawing>
+      </w:r>
+    </w:p>
+    <w:p>
+      <w:pPr>
+        <w:spacing w:after="160"/>
+        <w:jc w:val="center"/>
+      </w:pPr>
+      <w:r>
+        <w:rPr>
+          <w:b w:val="0"/>
+          <w:i/>
+          <w:color w:val="64748B"/>
+          <w:sz w:val="17"/>
+        </w:rPr>
+        <w:t>Figure 8 — Delivery Outlook (management view)</w:t>
+      </w:r>
+    </w:p>
+    <w:p>
+      <w:pPr>
+        <w:keepNext/>
         <w:spacing w:after="60" w:before="80"/>
       </w:pPr>
       <w:r>
@@ -10061,8 +10116,8 @@
       <w:r>
         <w:drawing>
           <wp:inline xmlns:a="http://schemas.openxmlformats.org/drawingml/2006/main" xmlns:pic="http://schemas.openxmlformats.org/drawingml/2006/picture">
-            <wp:extent cx="5336770" cy="5860472"/>
-            <wp:docPr id="8" name="Picture 8"/>
+            <wp:extent cx="5120639" cy="5951912"/>
+            <wp:docPr id="9" name="Picture 9"/>
             <wp:cNvGraphicFramePr>
               <a:graphicFrameLocks noChangeAspect="1"/>
             </wp:cNvGraphicFramePr>
@@ -10074,7 +10129,7 @@
                     <pic:cNvPicPr/>
                   </pic:nvPicPr>
                   <pic:blipFill>
-                    <a:blip r:embed="rId18"/>
+                    <a:blip r:embed="rId19"/>
                     <a:stretch>
                       <a:fillRect/>
                     </a:stretch>
@@ -10082,7 +10137,7 @@
                   <pic:spPr>
                     <a:xfrm>
                       <a:off x="0" y="0"/>
-                      <a:ext cx="5336770" cy="5860472"/>
+                      <a:ext cx="5120639" cy="5951912"/>
                     </a:xfrm>
                     <a:prstGeom prst="rect"/>
                   </pic:spPr>
@@ -10105,7 +10160,7 @@
           <w:color w:val="64748B"/>
           <w:sz w:val="17"/>
         </w:rPr>
-        <w:t>Figure 8 — Delivery Delay Analysis</w:t>
+        <w:t>Figure 9 — Delivery Delay Analysis</w:t>
       </w:r>
     </w:p>
     <w:p>
@@ -11372,7 +11427,7 @@
         <w:drawing>
           <wp:inline xmlns:a="http://schemas.openxmlformats.org/drawingml/2006/main" xmlns:pic="http://schemas.openxmlformats.org/drawingml/2006/picture">
             <wp:extent cx="5940000" cy="2805356"/>
-            <wp:docPr id="9" name="Picture 9"/>
+            <wp:docPr id="10" name="Picture 10"/>
             <wp:cNvGraphicFramePr>
               <a:graphicFrameLocks noChangeAspect="1"/>
             </wp:cNvGraphicFramePr>
@@ -11384,7 +11439,7 @@
                     <pic:cNvPicPr/>
                   </pic:nvPicPr>
                   <pic:blipFill>
-                    <a:blip r:embed="rId19"/>
+                    <a:blip r:embed="rId20"/>
                     <a:stretch>
                       <a:fillRect/>
                     </a:stretch>
@@ -11415,7 +11470,7 @@
           <w:color w:val="64748B"/>
           <w:sz w:val="17"/>
         </w:rPr>
-        <w:t>Figure 9 — Vehicle Production Progress (VPX)</w:t>
+        <w:t>Figure 10 — Vehicle Production Progress (VPX)</w:t>
       </w:r>
     </w:p>
     <w:p>
@@ -11962,7 +12017,7 @@
         <w:drawing>
           <wp:inline xmlns:a="http://schemas.openxmlformats.org/drawingml/2006/main" xmlns:pic="http://schemas.openxmlformats.org/drawingml/2006/picture">
             <wp:extent cx="5940000" cy="2664233"/>
-            <wp:docPr id="10" name="Picture 10"/>
+            <wp:docPr id="11" name="Picture 11"/>
             <wp:cNvGraphicFramePr>
               <a:graphicFrameLocks noChangeAspect="1"/>
             </wp:cNvGraphicFramePr>
@@ -11974,7 +12029,7 @@
                     <pic:cNvPicPr/>
                   </pic:nvPicPr>
                   <pic:blipFill>
-                    <a:blip r:embed="rId20"/>
+                    <a:blip r:embed="rId21"/>
                     <a:stretch>
                       <a:fillRect/>
                     </a:stretch>
@@ -12005,7 +12060,7 @@
           <w:color w:val="64748B"/>
           <w:sz w:val="17"/>
         </w:rPr>
-        <w:t>Figure 10 — Manufacturing Analytics (charts)</w:t>
+        <w:t>Figure 11 — Manufacturing Analytics (charts)</w:t>
       </w:r>
     </w:p>
     <w:p>
@@ -12518,7 +12573,7 @@
         <w:drawing>
           <wp:inline xmlns:a="http://schemas.openxmlformats.org/drawingml/2006/main" xmlns:pic="http://schemas.openxmlformats.org/drawingml/2006/picture">
             <wp:extent cx="5940000" cy="2775421"/>
-            <wp:docPr id="11" name="Picture 11"/>
+            <wp:docPr id="12" name="Picture 12"/>
             <wp:cNvGraphicFramePr>
               <a:graphicFrameLocks noChangeAspect="1"/>
             </wp:cNvGraphicFramePr>
@@ -12530,7 +12585,7 @@
                     <pic:cNvPicPr/>
                   </pic:nvPicPr>
                   <pic:blipFill>
-                    <a:blip r:embed="rId21"/>
+                    <a:blip r:embed="rId22"/>
                     <a:stretch>
                       <a:fillRect/>
                     </a:stretch>
@@ -12561,7 +12616,7 @@
           <w:color w:val="64748B"/>
           <w:sz w:val="17"/>
         </w:rPr>
-        <w:t>Figure 11 — Reading the Production Schedule</w:t>
+        <w:t>Figure 12 — Reading the Production Schedule</w:t>
       </w:r>
     </w:p>
     <w:p>
@@ -13270,7 +13325,7 @@
         <w:drawing>
           <wp:inline xmlns:a="http://schemas.openxmlformats.org/drawingml/2006/main" xmlns:pic="http://schemas.openxmlformats.org/drawingml/2006/picture">
             <wp:extent cx="5940000" cy="2300734"/>
-            <wp:docPr id="12" name="Picture 12"/>
+            <wp:docPr id="13" name="Picture 13"/>
             <wp:cNvGraphicFramePr>
               <a:graphicFrameLocks noChangeAspect="1"/>
             </wp:cNvGraphicFramePr>
@@ -13282,7 +13337,7 @@
                     <pic:cNvPicPr/>
                   </pic:nvPicPr>
                   <pic:blipFill>
-                    <a:blip r:embed="rId22"/>
+                    <a:blip r:embed="rId23"/>
                     <a:stretch>
                       <a:fillRect/>
                     </a:stretch>
@@ -13313,7 +13368,7 @@
           <w:color w:val="64748B"/>
           <w:sz w:val="17"/>
         </w:rPr>
-        <w:t>Figure 12 — Editing the schedule</w:t>
+        <w:t>Figure 13 — Editing the schedule</w:t>
       </w:r>
     </w:p>
     <w:p>
@@ -14380,7 +14435,7 @@
         <w:drawing>
           <wp:inline xmlns:a="http://schemas.openxmlformats.org/drawingml/2006/main" xmlns:pic="http://schemas.openxmlformats.org/drawingml/2006/picture">
             <wp:extent cx="5940000" cy="2692230"/>
-            <wp:docPr id="13" name="Picture 13"/>
+            <wp:docPr id="14" name="Picture 14"/>
             <wp:cNvGraphicFramePr>
               <a:graphicFrameLocks noChangeAspect="1"/>
             </wp:cNvGraphicFramePr>
@@ -14392,7 +14447,7 @@
                     <pic:cNvPicPr/>
                   </pic:nvPicPr>
                   <pic:blipFill>
-                    <a:blip r:embed="rId23"/>
+                    <a:blip r:embed="rId24"/>
                     <a:stretch>
                       <a:fillRect/>
                     </a:stretch>
@@ -14423,7 +14478,7 @@
           <w:color w:val="64748B"/>
           <w:sz w:val="17"/>
         </w:rPr>
-        <w:t>Figure 13 — Reordering the route and hiding or deleting processes</w:t>
+        <w:t>Figure 14 — Reordering the route and hiding or deleting processes</w:t>
       </w:r>
     </w:p>
     <w:p>
@@ -15041,7 +15096,7 @@
         <w:drawing>
           <wp:inline xmlns:a="http://schemas.openxmlformats.org/drawingml/2006/main" xmlns:pic="http://schemas.openxmlformats.org/drawingml/2006/picture">
             <wp:extent cx="5940000" cy="2360605"/>
-            <wp:docPr id="14" name="Picture 14"/>
+            <wp:docPr id="15" name="Picture 15"/>
             <wp:cNvGraphicFramePr>
               <a:graphicFrameLocks noChangeAspect="1"/>
             </wp:cNvGraphicFramePr>
@@ -15053,7 +15108,7 @@
                     <pic:cNvPicPr/>
                   </pic:nvPicPr>
                   <pic:blipFill>
-                    <a:blip r:embed="rId24"/>
+                    <a:blip r:embed="rId25"/>
                     <a:stretch>
                       <a:fillRect/>
                     </a:stretch>
@@ -15084,7 +15139,7 @@
           <w:color w:val="64748B"/>
           <w:sz w:val="17"/>
         </w:rPr>
-        <w:t>Figure 14 — The Plan Table</w:t>
+        <w:t>Figure 15 — The Plan Table</w:t>
       </w:r>
     </w:p>
     <w:p>
@@ -15543,7 +15598,7 @@
         <w:drawing>
           <wp:inline xmlns:a="http://schemas.openxmlformats.org/drawingml/2006/main" xmlns:pic="http://schemas.openxmlformats.org/drawingml/2006/picture">
             <wp:extent cx="5940000" cy="1817495"/>
-            <wp:docPr id="15" name="Picture 15"/>
+            <wp:docPr id="16" name="Picture 16"/>
             <wp:cNvGraphicFramePr>
               <a:graphicFrameLocks noChangeAspect="1"/>
             </wp:cNvGraphicFramePr>
@@ -15555,7 +15610,7 @@
                     <pic:cNvPicPr/>
                   </pic:nvPicPr>
                   <pic:blipFill>
-                    <a:blip r:embed="rId25"/>
+                    <a:blip r:embed="rId26"/>
                     <a:stretch>
                       <a:fillRect/>
                     </a:stretch>
@@ -15586,7 +15641,7 @@
           <w:color w:val="64748B"/>
           <w:sz w:val="17"/>
         </w:rPr>
-        <w:t>Figure 15 — Recording actual start and completion</w:t>
+        <w:t>Figure 16 — Recording actual start and completion</w:t>
       </w:r>
     </w:p>
     <w:p>
@@ -16167,7 +16222,7 @@
         <w:drawing>
           <wp:inline xmlns:a="http://schemas.openxmlformats.org/drawingml/2006/main" xmlns:pic="http://schemas.openxmlformats.org/drawingml/2006/picture">
             <wp:extent cx="4987636" cy="1828800"/>
-            <wp:docPr id="16" name="Picture 16"/>
+            <wp:docPr id="17" name="Picture 17"/>
             <wp:cNvGraphicFramePr>
               <a:graphicFrameLocks noChangeAspect="1"/>
             </wp:cNvGraphicFramePr>
@@ -16179,7 +16234,7 @@
                     <pic:cNvPicPr/>
                   </pic:nvPicPr>
                   <pic:blipFill>
-                    <a:blip r:embed="rId26"/>
+                    <a:blip r:embed="rId27"/>
                     <a:stretch>
                       <a:fillRect/>
                     </a:stretch>
@@ -16210,7 +16265,7 @@
           <w:color w:val="64748B"/>
           <w:sz w:val="17"/>
         </w:rPr>
-        <w:t>Figure 16 — Comments on a task</w:t>
+        <w:t>Figure 17 — Comments on a task</w:t>
       </w:r>
     </w:p>
     <w:p>
@@ -16607,7 +16662,7 @@
         <w:drawing>
           <wp:inline xmlns:a="http://schemas.openxmlformats.org/drawingml/2006/main" xmlns:pic="http://schemas.openxmlformats.org/drawingml/2006/picture">
             <wp:extent cx="3300152" cy="2119745"/>
-            <wp:docPr id="17" name="Picture 17"/>
+            <wp:docPr id="18" name="Picture 18"/>
             <wp:cNvGraphicFramePr>
               <a:graphicFrameLocks noChangeAspect="1"/>
             </wp:cNvGraphicFramePr>
@@ -16619,7 +16674,7 @@
                     <pic:cNvPicPr/>
                   </pic:nvPicPr>
                   <pic:blipFill>
-                    <a:blip r:embed="rId27"/>
+                    <a:blip r:embed="rId28"/>
                     <a:stretch>
                       <a:fillRect/>
                     </a:stretch>
@@ -16650,7 +16705,7 @@
           <w:color w:val="64748B"/>
           <w:sz w:val="17"/>
         </w:rPr>
-        <w:t>Figure 17 — Delay reasons</w:t>
+        <w:t>Figure 18 — Delay reasons</w:t>
       </w:r>
     </w:p>
     <w:p>
@@ -17126,7 +17181,7 @@
         <w:drawing>
           <wp:inline xmlns:a="http://schemas.openxmlformats.org/drawingml/2006/main" xmlns:pic="http://schemas.openxmlformats.org/drawingml/2006/picture">
             <wp:extent cx="3483032" cy="2377440"/>
-            <wp:docPr id="18" name="Picture 18"/>
+            <wp:docPr id="19" name="Picture 19"/>
             <wp:cNvGraphicFramePr>
               <a:graphicFrameLocks noChangeAspect="1"/>
             </wp:cNvGraphicFramePr>
@@ -17138,7 +17193,7 @@
                     <pic:cNvPicPr/>
                   </pic:nvPicPr>
                   <pic:blipFill>
-                    <a:blip r:embed="rId28"/>
+                    <a:blip r:embed="rId29"/>
                     <a:stretch>
                       <a:fillRect/>
                     </a:stretch>
@@ -17169,7 +17224,7 @@
           <w:color w:val="64748B"/>
           <w:sz w:val="17"/>
         </w:rPr>
-        <w:t>Figure 18 — X-ray and repair tracking</w:t>
+        <w:t>Figure 19 — X-ray and repair tracking</w:t>
       </w:r>
     </w:p>
     <w:p>
@@ -17666,7 +17721,7 @@
         <w:drawing>
           <wp:inline xmlns:a="http://schemas.openxmlformats.org/drawingml/2006/main" xmlns:pic="http://schemas.openxmlformats.org/drawingml/2006/picture">
             <wp:extent cx="5940000" cy="1435714"/>
-            <wp:docPr id="19" name="Picture 19"/>
+            <wp:docPr id="20" name="Picture 20"/>
             <wp:cNvGraphicFramePr>
               <a:graphicFrameLocks noChangeAspect="1"/>
             </wp:cNvGraphicFramePr>
@@ -17678,7 +17733,7 @@
                     <pic:cNvPicPr/>
                   </pic:nvPicPr>
                   <pic:blipFill>
-                    <a:blip r:embed="rId29"/>
+                    <a:blip r:embed="rId30"/>
                     <a:stretch>
                       <a:fillRect/>
                     </a:stretch>
@@ -17709,7 +17764,7 @@
           <w:color w:val="64748B"/>
           <w:sz w:val="17"/>
         </w:rPr>
-        <w:t>Figure 19 — Uploading a plan file</w:t>
+        <w:t>Figure 20 — Uploading a plan file</w:t>
       </w:r>
     </w:p>
     <w:p>
@@ -18215,7 +18270,7 @@
         <w:drawing>
           <wp:inline xmlns:a="http://schemas.openxmlformats.org/drawingml/2006/main" xmlns:pic="http://schemas.openxmlformats.org/drawingml/2006/picture">
             <wp:extent cx="5940000" cy="2727116"/>
-            <wp:docPr id="20" name="Picture 20"/>
+            <wp:docPr id="21" name="Picture 21"/>
             <wp:cNvGraphicFramePr>
               <a:graphicFrameLocks noChangeAspect="1"/>
             </wp:cNvGraphicFramePr>
@@ -18227,7 +18282,7 @@
                     <pic:cNvPicPr/>
                   </pic:nvPicPr>
                   <pic:blipFill>
-                    <a:blip r:embed="rId30"/>
+                    <a:blip r:embed="rId31"/>
                     <a:stretch>
                       <a:fillRect/>
                     </a:stretch>
@@ -18258,7 +18313,7 @@
           <w:color w:val="64748B"/>
           <w:sz w:val="17"/>
         </w:rPr>
-        <w:t>Figure 20 — The Production Issues list</w:t>
+        <w:t>Figure 21 — The Production Issues list</w:t>
       </w:r>
     </w:p>
     <w:p>
@@ -18638,7 +18693,7 @@
         <w:drawing>
           <wp:inline xmlns:a="http://schemas.openxmlformats.org/drawingml/2006/main" xmlns:pic="http://schemas.openxmlformats.org/drawingml/2006/picture">
             <wp:extent cx="4505498" cy="5453149"/>
-            <wp:docPr id="21" name="Picture 21"/>
+            <wp:docPr id="22" name="Picture 22"/>
             <wp:cNvGraphicFramePr>
               <a:graphicFrameLocks noChangeAspect="1"/>
             </wp:cNvGraphicFramePr>
@@ -18650,7 +18705,7 @@
                     <pic:cNvPicPr/>
                   </pic:nvPicPr>
                   <pic:blipFill>
-                    <a:blip r:embed="rId31"/>
+                    <a:blip r:embed="rId32"/>
                     <a:stretch>
                       <a:fillRect/>
                     </a:stretch>
@@ -18681,7 +18736,7 @@
           <w:color w:val="64748B"/>
           <w:sz w:val="17"/>
         </w:rPr>
-        <w:t>Figure 21 — Reporting an issue</w:t>
+        <w:t>Figure 22 — Reporting an issue</w:t>
       </w:r>
     </w:p>
     <w:p>
@@ -19269,7 +19324,7 @@
         <w:drawing>
           <wp:inline xmlns:a="http://schemas.openxmlformats.org/drawingml/2006/main" xmlns:pic="http://schemas.openxmlformats.org/drawingml/2006/picture">
             <wp:extent cx="5940000" cy="5191774"/>
-            <wp:docPr id="22" name="Picture 22"/>
+            <wp:docPr id="23" name="Picture 23"/>
             <wp:cNvGraphicFramePr>
               <a:graphicFrameLocks noChangeAspect="1"/>
             </wp:cNvGraphicFramePr>
@@ -19281,7 +19336,7 @@
                     <pic:cNvPicPr/>
                   </pic:nvPicPr>
                   <pic:blipFill>
-                    <a:blip r:embed="rId32"/>
+                    <a:blip r:embed="rId33"/>
                     <a:stretch>
                       <a:fillRect/>
                     </a:stretch>
@@ -19312,7 +19367,7 @@
           <w:color w:val="64748B"/>
           <w:sz w:val="17"/>
         </w:rPr>
-        <w:t>Figure 22 — Viewing and updating an issue</w:t>
+        <w:t>Figure 23 — Viewing and updating an issue</w:t>
       </w:r>
     </w:p>
     <w:p>
@@ -19776,7 +19831,7 @@
         <w:drawing>
           <wp:inline xmlns:a="http://schemas.openxmlformats.org/drawingml/2006/main" xmlns:pic="http://schemas.openxmlformats.org/drawingml/2006/picture">
             <wp:extent cx="3399905" cy="2144683"/>
-            <wp:docPr id="23" name="Picture 23"/>
+            <wp:docPr id="24" name="Picture 24"/>
             <wp:cNvGraphicFramePr>
               <a:graphicFrameLocks noChangeAspect="1"/>
             </wp:cNvGraphicFramePr>
@@ -19788,7 +19843,7 @@
                     <pic:cNvPicPr/>
                   </pic:nvPicPr>
                   <pic:blipFill>
-                    <a:blip r:embed="rId33"/>
+                    <a:blip r:embed="rId34"/>
                     <a:stretch>
                       <a:fillRect/>
                     </a:stretch>
@@ -19819,7 +19874,7 @@
           <w:color w:val="64748B"/>
           <w:sz w:val="17"/>
         </w:rPr>
-        <w:t>Figure 23 — Issue drafts</w:t>
+        <w:t>Figure 24 — Issue drafts</w:t>
       </w:r>
     </w:p>
     <w:p>
@@ -20099,7 +20154,7 @@
         <w:drawing>
           <wp:inline xmlns:a="http://schemas.openxmlformats.org/drawingml/2006/main" xmlns:pic="http://schemas.openxmlformats.org/drawingml/2006/picture">
             <wp:extent cx="5940000" cy="4746977"/>
-            <wp:docPr id="24" name="Picture 24"/>
+            <wp:docPr id="25" name="Picture 25"/>
             <wp:cNvGraphicFramePr>
               <a:graphicFrameLocks noChangeAspect="1"/>
             </wp:cNvGraphicFramePr>
@@ -20111,7 +20166,7 @@
                     <pic:cNvPicPr/>
                   </pic:nvPicPr>
                   <pic:blipFill>
-                    <a:blip r:embed="rId34"/>
+                    <a:blip r:embed="rId35"/>
                     <a:stretch>
                       <a:fillRect/>
                     </a:stretch>
@@ -20142,7 +20197,7 @@
           <w:color w:val="64748B"/>
           <w:sz w:val="17"/>
         </w:rPr>
-        <w:t>Figure 24 — Generating an issues report</w:t>
+        <w:t>Figure 25 — Generating an issues report</w:t>
       </w:r>
     </w:p>
     <w:p>
@@ -20681,7 +20736,7 @@
         <w:drawing>
           <wp:inline xmlns:a="http://schemas.openxmlformats.org/drawingml/2006/main" xmlns:pic="http://schemas.openxmlformats.org/drawingml/2006/picture">
             <wp:extent cx="5486400" cy="5469775"/>
-            <wp:docPr id="25" name="Picture 25"/>
+            <wp:docPr id="26" name="Picture 26"/>
             <wp:cNvGraphicFramePr>
               <a:graphicFrameLocks noChangeAspect="1"/>
             </wp:cNvGraphicFramePr>
@@ -20693,7 +20748,7 @@
                     <pic:cNvPicPr/>
                   </pic:nvPicPr>
                   <pic:blipFill>
-                    <a:blip r:embed="rId35"/>
+                    <a:blip r:embed="rId36"/>
                     <a:stretch>
                       <a:fillRect/>
                     </a:stretch>
@@ -20724,7 +20779,7 @@
           <w:color w:val="64748B"/>
           <w:sz w:val="17"/>
         </w:rPr>
-        <w:t>Figure 25 — Export Report (plan data)</w:t>
+        <w:t>Figure 26 — Export Report (plan data)</w:t>
       </w:r>
     </w:p>
     <w:p>
@@ -21133,7 +21188,7 @@
         <w:drawing>
           <wp:inline xmlns:a="http://schemas.openxmlformats.org/drawingml/2006/main" xmlns:pic="http://schemas.openxmlformats.org/drawingml/2006/picture">
             <wp:extent cx="5486400" cy="2709949"/>
-            <wp:docPr id="26" name="Picture 26"/>
+            <wp:docPr id="27" name="Picture 27"/>
             <wp:cNvGraphicFramePr>
               <a:graphicFrameLocks noChangeAspect="1"/>
             </wp:cNvGraphicFramePr>
@@ -21145,7 +21200,7 @@
                     <pic:cNvPicPr/>
                   </pic:nvPicPr>
                   <pic:blipFill>
-                    <a:blip r:embed="rId36"/>
+                    <a:blip r:embed="rId37"/>
                     <a:stretch>
                       <a:fillRect/>
                     </a:stretch>
@@ -21176,7 +21231,7 @@
           <w:color w:val="64748B"/>
           <w:sz w:val="17"/>
         </w:rPr>
-        <w:t>Figure 26 — VPX Station Report</w:t>
+        <w:t>Figure 27 — VPX Station Report</w:t>
       </w:r>
     </w:p>
     <w:p>
@@ -21523,7 +21578,7 @@
         <w:drawing>
           <wp:inline xmlns:a="http://schemas.openxmlformats.org/drawingml/2006/main" xmlns:pic="http://schemas.openxmlformats.org/drawingml/2006/picture">
             <wp:extent cx="4488872" cy="4530436"/>
-            <wp:docPr id="27" name="Picture 27"/>
+            <wp:docPr id="28" name="Picture 28"/>
             <wp:cNvGraphicFramePr>
               <a:graphicFrameLocks noChangeAspect="1"/>
             </wp:cNvGraphicFramePr>
@@ -21535,7 +21590,7 @@
                     <pic:cNvPicPr/>
                   </pic:nvPicPr>
                   <pic:blipFill>
-                    <a:blip r:embed="rId37"/>
+                    <a:blip r:embed="rId38"/>
                     <a:stretch>
                       <a:fillRect/>
                     </a:stretch>
@@ -21566,7 +21621,7 @@
           <w:color w:val="64748B"/>
           <w:sz w:val="17"/>
         </w:rPr>
-        <w:t>Figure 27 — Executive Report</w:t>
+        <w:t>Figure 28 — Executive Report</w:t>
       </w:r>
     </w:p>
     <w:p>
@@ -22134,7 +22189,7 @@
         <w:drawing>
           <wp:inline xmlns:a="http://schemas.openxmlformats.org/drawingml/2006/main" xmlns:pic="http://schemas.openxmlformats.org/drawingml/2006/picture">
             <wp:extent cx="5940000" cy="4168821"/>
-            <wp:docPr id="28" name="Picture 28"/>
+            <wp:docPr id="29" name="Picture 29"/>
             <wp:cNvGraphicFramePr>
               <a:graphicFrameLocks noChangeAspect="1"/>
             </wp:cNvGraphicFramePr>
@@ -22146,7 +22201,7 @@
                     <pic:cNvPicPr/>
                   </pic:nvPicPr>
                   <pic:blipFill>
-                    <a:blip r:embed="rId38"/>
+                    <a:blip r:embed="rId39"/>
                     <a:stretch>
                       <a:fillRect/>
                     </a:stretch>
@@ -22177,7 +22232,7 @@
           <w:color w:val="64748B"/>
           <w:sz w:val="17"/>
         </w:rPr>
-        <w:t>Figure 28 — Adding work to the plan</w:t>
+        <w:t>Figure 29 — Adding work to the plan</w:t>
       </w:r>
     </w:p>
     <w:p>
@@ -22648,7 +22703,7 @@
         <w:drawing>
           <wp:inline xmlns:a="http://schemas.openxmlformats.org/drawingml/2006/main" xmlns:pic="http://schemas.openxmlformats.org/drawingml/2006/picture">
             <wp:extent cx="5940000" cy="3796984"/>
-            <wp:docPr id="29" name="Picture 29"/>
+            <wp:docPr id="30" name="Picture 30"/>
             <wp:cNvGraphicFramePr>
               <a:graphicFrameLocks noChangeAspect="1"/>
             </wp:cNvGraphicFramePr>
@@ -22660,7 +22715,7 @@
                     <pic:cNvPicPr/>
                   </pic:nvPicPr>
                   <pic:blipFill>
-                    <a:blip r:embed="rId39"/>
+                    <a:blip r:embed="rId40"/>
                     <a:stretch>
                       <a:fillRect/>
                     </a:stretch>
@@ -22691,7 +22746,7 @@
           <w:color w:val="64748B"/>
           <w:sz w:val="17"/>
         </w:rPr>
-        <w:t>Figure 29 — Manage Processes and routes</w:t>
+        <w:t>Figure 30 — Manage Processes and routes</w:t>
       </w:r>
     </w:p>
     <w:p>
@@ -23088,7 +23143,7 @@
         <w:drawing>
           <wp:inline xmlns:a="http://schemas.openxmlformats.org/drawingml/2006/main" xmlns:pic="http://schemas.openxmlformats.org/drawingml/2006/picture">
             <wp:extent cx="5940000" cy="4978696"/>
-            <wp:docPr id="30" name="Picture 30"/>
+            <wp:docPr id="31" name="Picture 31"/>
             <wp:cNvGraphicFramePr>
               <a:graphicFrameLocks noChangeAspect="1"/>
             </wp:cNvGraphicFramePr>
@@ -23100,7 +23155,7 @@
                     <pic:cNvPicPr/>
                   </pic:nvPicPr>
                   <pic:blipFill>
-                    <a:blip r:embed="rId40"/>
+                    <a:blip r:embed="rId41"/>
                     <a:stretch>
                       <a:fillRect/>
                     </a:stretch>
@@ -23131,7 +23186,7 @@
           <w:color w:val="64748B"/>
           <w:sz w:val="17"/>
         </w:rPr>
-        <w:t>Figure 30 — Lead times</w:t>
+        <w:t>Figure 31 — Lead times</w:t>
       </w:r>
     </w:p>
     <w:p>
@@ -23528,7 +23583,7 @@
         <w:drawing>
           <wp:inline xmlns:a="http://schemas.openxmlformats.org/drawingml/2006/main" xmlns:pic="http://schemas.openxmlformats.org/drawingml/2006/picture">
             <wp:extent cx="4505498" cy="3765665"/>
-            <wp:docPr id="31" name="Picture 31"/>
+            <wp:docPr id="32" name="Picture 32"/>
             <wp:cNvGraphicFramePr>
               <a:graphicFrameLocks noChangeAspect="1"/>
             </wp:cNvGraphicFramePr>
@@ -23540,7 +23595,7 @@
                     <pic:cNvPicPr/>
                   </pic:nvPicPr>
                   <pic:blipFill>
-                    <a:blip r:embed="rId41"/>
+                    <a:blip r:embed="rId42"/>
                     <a:stretch>
                       <a:fillRect/>
                     </a:stretch>
@@ -23571,7 +23626,7 @@
           <w:color w:val="64748B"/>
           <w:sz w:val="17"/>
         </w:rPr>
-        <w:t>Figure 31 — No-work days</w:t>
+        <w:t>Figure 32 — No-work days</w:t>
       </w:r>
     </w:p>
     <w:p>
@@ -23968,7 +24023,7 @@
         <w:drawing>
           <wp:inline xmlns:a="http://schemas.openxmlformats.org/drawingml/2006/main" xmlns:pic="http://schemas.openxmlformats.org/drawingml/2006/picture">
             <wp:extent cx="5940000" cy="2631316"/>
-            <wp:docPr id="32" name="Picture 32"/>
+            <wp:docPr id="33" name="Picture 33"/>
             <wp:cNvGraphicFramePr>
               <a:graphicFrameLocks noChangeAspect="1"/>
             </wp:cNvGraphicFramePr>
@@ -23980,7 +24035,7 @@
                     <pic:cNvPicPr/>
                   </pic:nvPicPr>
                   <pic:blipFill>
-                    <a:blip r:embed="rId42"/>
+                    <a:blip r:embed="rId43"/>
                     <a:stretch>
                       <a:fillRect/>
                     </a:stretch>
@@ -24011,7 +24066,7 @@
           <w:color w:val="64748B"/>
           <w:sz w:val="17"/>
         </w:rPr>
-        <w:t>Figure 32 — Plan versions</w:t>
+        <w:t>Figure 33 — Plan versions</w:t>
       </w:r>
     </w:p>
     <w:p>
@@ -24592,7 +24647,7 @@
         <w:drawing>
           <wp:inline xmlns:a="http://schemas.openxmlformats.org/drawingml/2006/main" xmlns:pic="http://schemas.openxmlformats.org/drawingml/2006/picture">
             <wp:extent cx="5940000" cy="3588750"/>
-            <wp:docPr id="33" name="Picture 33"/>
+            <wp:docPr id="34" name="Picture 34"/>
             <wp:cNvGraphicFramePr>
               <a:graphicFrameLocks noChangeAspect="1"/>
             </wp:cNvGraphicFramePr>
@@ -24604,7 +24659,7 @@
                     <pic:cNvPicPr/>
                   </pic:nvPicPr>
                   <pic:blipFill>
-                    <a:blip r:embed="rId43"/>
+                    <a:blip r:embed="rId44"/>
                     <a:stretch>
                       <a:fillRect/>
                     </a:stretch>
@@ -24635,7 +24690,7 @@
           <w:color w:val="64748B"/>
           <w:sz w:val="17"/>
         </w:rPr>
-        <w:t>Figure 33 — Unit Codes</w:t>
+        <w:t>Figure 34 — Unit Codes</w:t>
       </w:r>
     </w:p>
     <w:p>
@@ -25024,7 +25079,7 @@
         <w:drawing>
           <wp:inline xmlns:a="http://schemas.openxmlformats.org/drawingml/2006/main" xmlns:pic="http://schemas.openxmlformats.org/drawingml/2006/picture">
             <wp:extent cx="5940000" cy="1678881"/>
-            <wp:docPr id="34" name="Picture 34"/>
+            <wp:docPr id="35" name="Picture 35"/>
             <wp:cNvGraphicFramePr>
               <a:graphicFrameLocks noChangeAspect="1"/>
             </wp:cNvGraphicFramePr>
@@ -25036,7 +25091,7 @@
                     <pic:cNvPicPr/>
                   </pic:nvPicPr>
                   <pic:blipFill>
-                    <a:blip r:embed="rId44"/>
+                    <a:blip r:embed="rId45"/>
                     <a:stretch>
                       <a:fillRect/>
                     </a:stretch>
@@ -25067,7 +25122,7 @@
           <w:color w:val="64748B"/>
           <w:sz w:val="17"/>
         </w:rPr>
-        <w:t>Figure 34 — Working in F100-KD2</w:t>
+        <w:t>Figure 35 — Working in F100-KD2</w:t>
       </w:r>
     </w:p>
     <w:p>
@@ -25468,7 +25523,7 @@
         <w:drawing>
           <wp:inline xmlns:a="http://schemas.openxmlformats.org/drawingml/2006/main" xmlns:pic="http://schemas.openxmlformats.org/drawingml/2006/picture">
             <wp:extent cx="5940000" cy="4491220"/>
-            <wp:docPr id="35" name="Picture 35"/>
+            <wp:docPr id="36" name="Picture 36"/>
             <wp:cNvGraphicFramePr>
               <a:graphicFrameLocks noChangeAspect="1"/>
             </wp:cNvGraphicFramePr>
@@ -25480,7 +25535,7 @@
                     <pic:cNvPicPr/>
                   </pic:nvPicPr>
                   <pic:blipFill>
-                    <a:blip r:embed="rId45"/>
+                    <a:blip r:embed="rId46"/>
                     <a:stretch>
                       <a:fillRect/>
                     </a:stretch>
@@ -25511,7 +25566,7 @@
           <w:color w:val="64748B"/>
           <w:sz w:val="17"/>
         </w:rPr>
-        <w:t>Figure 35 — User Management</w:t>
+        <w:t>Figure 36 — User Management</w:t>
       </w:r>
     </w:p>
     <w:p>
@@ -26149,7 +26204,7 @@
         <w:drawing>
           <wp:inline xmlns:a="http://schemas.openxmlformats.org/drawingml/2006/main" xmlns:pic="http://schemas.openxmlformats.org/drawingml/2006/picture">
             <wp:extent cx="5940000" cy="4060614"/>
-            <wp:docPr id="36" name="Picture 36"/>
+            <wp:docPr id="37" name="Picture 37"/>
             <wp:cNvGraphicFramePr>
               <a:graphicFrameLocks noChangeAspect="1"/>
             </wp:cNvGraphicFramePr>
@@ -26161,7 +26216,7 @@
                     <pic:cNvPicPr/>
                   </pic:nvPicPr>
                   <pic:blipFill>
-                    <a:blip r:embed="rId46"/>
+                    <a:blip r:embed="rId47"/>
                     <a:stretch>
                       <a:fillRect/>
                     </a:stretch>
@@ -26192,7 +26247,7 @@
           <w:color w:val="64748B"/>
           <w:sz w:val="17"/>
         </w:rPr>
-        <w:t>Figure 36 — Audit Log</w:t>
+        <w:t>Figure 37 — Audit Log</w:t>
       </w:r>
     </w:p>
     <w:p>
@@ -26751,7 +26806,7 @@
         <w:drawing>
           <wp:inline xmlns:a="http://schemas.openxmlformats.org/drawingml/2006/main" xmlns:pic="http://schemas.openxmlformats.org/drawingml/2006/picture">
             <wp:extent cx="2801389" cy="1870364"/>
-            <wp:docPr id="37" name="Picture 37"/>
+            <wp:docPr id="38" name="Picture 38"/>
             <wp:cNvGraphicFramePr>
               <a:graphicFrameLocks noChangeAspect="1"/>
             </wp:cNvGraphicFramePr>
@@ -26763,7 +26818,7 @@
                     <pic:cNvPicPr/>
                   </pic:nvPicPr>
                   <pic:blipFill>
-                    <a:blip r:embed="rId47"/>
+                    <a:blip r:embed="rId48"/>
                     <a:stretch>
                       <a:fillRect/>
                     </a:stretch>
@@ -26794,7 +26849,7 @@
           <w:color w:val="64748B"/>
           <w:sz w:val="17"/>
         </w:rPr>
-        <w:t>Figure 37 — Active Users</w:t>
+        <w:t>Figure 38 — Active Users</w:t>
       </w:r>
     </w:p>
     <w:p>
@@ -27295,7 +27350,7 @@
         <w:drawing>
           <wp:inline xmlns:a="http://schemas.openxmlformats.org/drawingml/2006/main" xmlns:pic="http://schemas.openxmlformats.org/drawingml/2006/picture">
             <wp:extent cx="2660072" cy="2128058"/>
-            <wp:docPr id="38" name="Picture 38"/>
+            <wp:docPr id="39" name="Picture 39"/>
             <wp:cNvGraphicFramePr>
               <a:graphicFrameLocks noChangeAspect="1"/>
             </wp:cNvGraphicFramePr>
@@ -27307,7 +27362,7 @@
                     <pic:cNvPicPr/>
                   </pic:nvPicPr>
                   <pic:blipFill>
-                    <a:blip r:embed="rId48"/>
+                    <a:blip r:embed="rId49"/>
                     <a:stretch>
                       <a:fillRect/>
                     </a:stretch>
@@ -27338,7 +27393,7 @@
           <w:color w:val="64748B"/>
           <w:sz w:val="17"/>
         </w:rPr>
-        <w:t>Figure 38 — Keeping PPMS up to date</w:t>
+        <w:t>Figure 39 — Keeping PPMS up to date</w:t>
       </w:r>
     </w:p>
     <w:p>
@@ -27793,7 +27848,7 @@
         <w:drawing>
           <wp:inline xmlns:a="http://schemas.openxmlformats.org/drawingml/2006/main" xmlns:pic="http://schemas.openxmlformats.org/drawingml/2006/picture">
             <wp:extent cx="5594465" cy="2236123"/>
-            <wp:docPr id="39" name="Picture 39"/>
+            <wp:docPr id="40" name="Picture 40"/>
             <wp:cNvGraphicFramePr>
               <a:graphicFrameLocks noChangeAspect="1"/>
             </wp:cNvGraphicFramePr>
@@ -27805,7 +27860,7 @@
                     <pic:cNvPicPr/>
                   </pic:nvPicPr>
                   <pic:blipFill>
-                    <a:blip r:embed="rId49"/>
+                    <a:blip r:embed="rId50"/>
                     <a:stretch>
                       <a:fillRect/>
                     </a:stretch>
@@ -27836,7 +27891,7 @@
           <w:color w:val="64748B"/>
           <w:sz w:val="17"/>
         </w:rPr>
-        <w:t>Figure 39 — Colour themes</w:t>
+        <w:t>Figure 40 — Colour themes</w:t>
       </w:r>
     </w:p>
     <w:p>
@@ -28095,7 +28150,7 @@
         <w:drawing>
           <wp:inline xmlns:a="http://schemas.openxmlformats.org/drawingml/2006/main" xmlns:pic="http://schemas.openxmlformats.org/drawingml/2006/picture">
             <wp:extent cx="5311832" cy="1396538"/>
-            <wp:docPr id="40" name="Picture 40"/>
+            <wp:docPr id="41" name="Picture 41"/>
             <wp:cNvGraphicFramePr>
               <a:graphicFrameLocks noChangeAspect="1"/>
             </wp:cNvGraphicFramePr>
@@ -28107,7 +28162,7 @@
                     <pic:cNvPicPr/>
                   </pic:nvPicPr>
                   <pic:blipFill>
-                    <a:blip r:embed="rId50"/>
+                    <a:blip r:embed="rId51"/>
                     <a:stretch>
                       <a:fillRect/>
                     </a:stretch>
@@ -28138,7 +28193,7 @@
           <w:color w:val="64748B"/>
           <w:sz w:val="17"/>
         </w:rPr>
-        <w:t>Figure 40 — Language — English, Korean, Arabic</w:t>
+        <w:t>Figure 41 — Language — English, Korean, Arabic</w:t>
       </w:r>
     </w:p>
     <w:p>
@@ -28509,7 +28564,7 @@
         <w:drawing>
           <wp:inline xmlns:a="http://schemas.openxmlformats.org/drawingml/2006/main" xmlns:pic="http://schemas.openxmlformats.org/drawingml/2006/picture">
             <wp:extent cx="4197927" cy="1122218"/>
-            <wp:docPr id="41" name="Picture 41"/>
+            <wp:docPr id="42" name="Picture 42"/>
             <wp:cNvGraphicFramePr>
               <a:graphicFrameLocks noChangeAspect="1"/>
             </wp:cNvGraphicFramePr>
@@ -28521,7 +28576,7 @@
                     <pic:cNvPicPr/>
                   </pic:nvPicPr>
                   <pic:blipFill>
-                    <a:blip r:embed="rId51"/>
+                    <a:blip r:embed="rId52"/>
                     <a:stretch>
                       <a:fillRect/>
                     </a:stretch>
@@ -28552,7 +28607,7 @@
           <w:color w:val="64748B"/>
           <w:sz w:val="17"/>
         </w:rPr>
-        <w:t>Figure 41 — Notifications</w:t>
+        <w:t>Figure 42 — Notifications</w:t>
       </w:r>
     </w:p>
     <w:p>
@@ -28832,7 +28887,7 @@
         <w:drawing>
           <wp:inline xmlns:a="http://schemas.openxmlformats.org/drawingml/2006/main" xmlns:pic="http://schemas.openxmlformats.org/drawingml/2006/picture">
             <wp:extent cx="2834640" cy="2552007"/>
-            <wp:docPr id="42" name="Picture 42"/>
+            <wp:docPr id="43" name="Picture 43"/>
             <wp:cNvGraphicFramePr>
               <a:graphicFrameLocks noChangeAspect="1"/>
             </wp:cNvGraphicFramePr>
@@ -28844,7 +28899,7 @@
                     <pic:cNvPicPr/>
                   </pic:nvPicPr>
                   <pic:blipFill>
-                    <a:blip r:embed="rId52"/>
+                    <a:blip r:embed="rId53"/>
                     <a:stretch>
                       <a:fillRect/>
                     </a:stretch>
@@ -28875,7 +28930,7 @@
           <w:color w:val="64748B"/>
           <w:sz w:val="17"/>
         </w:rPr>
-        <w:t>Figure 42 — Changing your password</w:t>
+        <w:t>Figure 43 — Changing your password</w:t>
       </w:r>
     </w:p>
     <w:p>
@@ -29201,7 +29256,7 @@
         <w:drawing>
           <wp:inline xmlns:a="http://schemas.openxmlformats.org/drawingml/2006/main" xmlns:pic="http://schemas.openxmlformats.org/drawingml/2006/picture">
             <wp:extent cx="5940000" cy="4105102"/>
-            <wp:docPr id="43" name="Picture 43"/>
+            <wp:docPr id="44" name="Picture 44"/>
             <wp:cNvGraphicFramePr>
               <a:graphicFrameLocks noChangeAspect="1"/>
             </wp:cNvGraphicFramePr>
@@ -29213,7 +29268,7 @@
                     <pic:cNvPicPr/>
                   </pic:nvPicPr>
                   <pic:blipFill>
-                    <a:blip r:embed="rId53"/>
+                    <a:blip r:embed="rId54"/>
                     <a:stretch>
                       <a:fillRect/>
                     </a:stretch>
@@ -29244,7 +29299,7 @@
           <w:color w:val="64748B"/>
           <w:sz w:val="17"/>
         </w:rPr>
-        <w:t>Figure 43 — Help &amp; User Manual</w:t>
+        <w:t>Figure 44 — Help &amp; User Manual</w:t>
       </w:r>
     </w:p>
     <w:p>
@@ -29674,7 +29729,7 @@
         <w:drawing>
           <wp:inline xmlns:a="http://schemas.openxmlformats.org/drawingml/2006/main" xmlns:pic="http://schemas.openxmlformats.org/drawingml/2006/picture">
             <wp:extent cx="3009207" cy="4871258"/>
-            <wp:docPr id="44" name="Picture 44"/>
+            <wp:docPr id="45" name="Picture 45"/>
             <wp:cNvGraphicFramePr>
               <a:graphicFrameLocks noChangeAspect="1"/>
             </wp:cNvGraphicFramePr>
@@ -29686,7 +29741,7 @@
                     <pic:cNvPicPr/>
                   </pic:nvPicPr>
                   <pic:blipFill>
-                    <a:blip r:embed="rId54"/>
+                    <a:blip r:embed="rId55"/>
                     <a:stretch>
                       <a:fillRect/>
                     </a:stretch>
@@ -29717,7 +29772,7 @@
           <w:color w:val="64748B"/>
           <w:sz w:val="17"/>
         </w:rPr>
-        <w:t>Figure 44 — The PPMS Assistant</w:t>
+        <w:t>Figure 45 — The PPMS Assistant</w:t>
       </w:r>
     </w:p>
     <w:p>

</xml_diff>